<commit_message>
K20: packed evidence store (shared chunks for inlined assets), 18x less disk
Text evidence keeps its SHA-256 and exact bytes on read, but is stored
packed: data: URIs and <style> bodies of 4 KB or more become write-once
chunks shared across states and pages, the rest is zlib-compressed.
Media and incompressible payloads stay raw; older raw objects still read.
The run budget now meters bytes on disk. scripts/repack_evidence.py
converts existing evidence in place.

Live John Hancock evidence: 1,182 MB -> 65 MB, all 799 objects read back
byte-identical; fixture verdicts unchanged.

Co-Authored-By: Claude Opus 5.5 <noreply@anthropic.com>
</commit_message>
<xml_diff>
--- a/Content_Processor_Guide.docx
+++ b/Content_Processor_Guide.docx
@@ -17,7 +17,7 @@
           <w:color w:val="595959"/>
           <w:sz w:val="19"/>
         </w:rPr>
-        <w:t>Last updated: 21 October 2026 · Code version: main after the struck-text change · Maintained by every session that adds a significant feature (see "Keeping this guide current" at the end)</w:t>
+        <w:t>Last updated: 21 October 2026 · Code version: main after the struck-text change and the evidence-storage fix (K20) · Maintained by every session that adds a significant feature (see "Keeping this guide current" at the end)</w:t>
       </w:r>
     </w:p>
     <w:p>
@@ -1029,6 +1029,11 @@
       </w:r>
     </w:p>
     <w:p>
+      <w:r>
+        <w:t>Evidence is stored compactly. Web pages carry the same fonts and style sheets on every page of a site, and a page photographed in several states repeats them each time, so the engine keeps each of those large repeated pieces once and compresses the rest. Nothing is lost: every original reads back exactly as it was captured, and the evidence-integrity check still proves it. On the live John Hancock run this cut evidence from about 1.2 GB to 65 MB (about 18 times smaller), so a 5,000-page run fits comfortably within the 20 GB storage budget.</w:t>
+      </w:r>
+    </w:p>
+    <w:p>
       <w:pPr>
         <w:pStyle w:val="Heading2"/>
       </w:pPr>
@@ -1800,7 +1805,7 @@
     </w:p>
     <w:p>
       <w:r>
-        <w:t>At the end of a run the engine writes a bundle of files:</w:t>
+        <w:t>At the end of a run the engine writes a bundle of files. Every file name starts with the run's name (for example `jh2_r1_url_content.xlsx`), so files from different runs never get mixed up once downloaded:</w:t>
       </w:r>
     </w:p>
     <w:tbl>
@@ -2498,14 +2503,6 @@
       </w:pPr>
       <w:r>
         <w:t>Semantic similarity: finding pages that say the same thing in different words (planned with a vector database).</w:t>
-      </w:r>
-    </w:p>
-    <w:p>
-      <w:pPr>
-        <w:pStyle w:val="ListBullet"/>
-      </w:pPr>
-      <w:r>
-        <w:t>Storage size: each explored page currently stores about 27 MB of evidence, which needs compressing before 5,000-page runs.</w:t>
       </w:r>
     </w:p>
     <w:p>
@@ -3249,7 +3246,97 @@
               <w:rPr>
                 <w:sz w:val="19"/>
               </w:rPr>
+              <w:t>Evidence stored compactly: repeated fonts and style sheets kept once, the rest compressed, originals unchanged. About 18 times less disk on the live John Hancock run; a 5,000-page run now fits the 20 GB budget. Older evidence can be converted with one command.</w:t>
+            </w:r>
+          </w:p>
+        </w:tc>
+      </w:tr>
+      <w:tr>
+        <w:tc>
+          <w:tcPr>
+            <w:tcW w:type="dxa" w:w="4873"/>
+            <w:shd w:val="clear" w:color="auto" w:fill="EEF2F7"/>
+          </w:tcPr>
+          <w:p>
+            <w:pPr>
+              <w:spacing w:after="40"/>
+            </w:pPr>
+            <w:r>
+              <w:rPr>
+                <w:sz w:val="19"/>
+              </w:rPr>
+            </w:r>
+            <w:r>
+              <w:rPr>
+                <w:sz w:val="19"/>
+              </w:rPr>
+              <w:t>2026-10-21</w:t>
+            </w:r>
+          </w:p>
+        </w:tc>
+        <w:tc>
+          <w:tcPr>
+            <w:tcW w:type="dxa" w:w="4873"/>
+            <w:shd w:val="clear" w:color="auto" w:fill="EEF2F7"/>
+          </w:tcPr>
+          <w:p>
+            <w:pPr>
+              <w:spacing w:after="40"/>
+            </w:pPr>
+            <w:r>
+              <w:rPr>
+                <w:sz w:val="19"/>
+              </w:rPr>
+            </w:r>
+            <w:r>
+              <w:rPr>
+                <w:sz w:val="19"/>
+              </w:rPr>
               <w:t>Crossed-out text (for example an old sale price) is kept and marked with ~~ instead of reading as a current price.</w:t>
+            </w:r>
+          </w:p>
+        </w:tc>
+      </w:tr>
+      <w:tr>
+        <w:tc>
+          <w:tcPr>
+            <w:tcW w:type="dxa" w:w="4873"/>
+          </w:tcPr>
+          <w:p>
+            <w:pPr>
+              <w:spacing w:after="40"/>
+            </w:pPr>
+            <w:r>
+              <w:rPr>
+                <w:sz w:val="19"/>
+              </w:rPr>
+            </w:r>
+            <w:r>
+              <w:rPr>
+                <w:sz w:val="19"/>
+              </w:rPr>
+              <w:t>2026-10-20</w:t>
+            </w:r>
+          </w:p>
+        </w:tc>
+        <w:tc>
+          <w:tcPr>
+            <w:tcW w:type="dxa" w:w="4873"/>
+          </w:tcPr>
+          <w:p>
+            <w:pPr>
+              <w:spacing w:after="40"/>
+            </w:pPr>
+            <w:r>
+              <w:rPr>
+                <w:sz w:val="19"/>
+              </w:rPr>
+            </w:r>
+            <w:r>
+              <w:rPr>
+                <w:sz w:val="19"/>
+              </w:rPr>
+              <w:t>Report file names start with the run's name, so downloads from different runs stay separate.</w:t>
             </w:r>
           </w:p>
         </w:tc>

</xml_diff>

<commit_message>
Struck-out text kept and marked inline: "Price ~~$200~~ $150"
<del>, <s> and <strike> text is recorded between ~~ markers (inner
markup such as superscripts keeps its handling). match_key() and the
R6/R7/R13 comparisons drop the markers, so marked blocks still verify
against the browser's text, and claims read amounts and negations
without struck passages, so an old price is never a contradiction.

Co-Authored-By: Claude Opus 5.5 <noreply@anthropic.com>
</commit_message>
<xml_diff>
--- a/Content_Processor_Guide.docx
+++ b/Content_Processor_Guide.docx
@@ -17,7 +17,7 @@
           <w:color w:val="595959"/>
           <w:sz w:val="19"/>
         </w:rPr>
-        <w:t>Last updated: 20 October 2026 · Code version: main after the OCR and CI merge · Maintained by every session that adds a significant feature (see "Keeping this guide current" at the end)</w:t>
+        <w:t>Last updated: 21 October 2026 · Code version: main after the struck-text change · Maintained by every session that adds a significant feature (see "Keeping this guide current" at the end)</w:t>
       </w:r>
     </w:p>
     <w:p>
@@ -1039,6 +1039,11 @@
     <w:p>
       <w:r>
         <w:t>The engine reads the page's HTML and splits it into blocks (headings, paragraphs, tables), and labels each block by layer: visible content, hidden text, navigation and footer, third-party widgets such as chat boxes, icon codes, and so on. Hidden and decorative text is kept but never mixed into the main content.</w:t>
+      </w:r>
+    </w:p>
+    <w:p>
+      <w:r>
+        <w:t>Crossed-out text is kept and marked. A sale price shown as a struck-out "$200" next to "$150" is recorded as "Price ~~$200~~ $150", so a reader can see which price is current; the contradiction report never treats the crossed-out price as something the page still claims.</w:t>
       </w:r>
     </w:p>
     <w:p>
@@ -3223,7 +3228,7 @@
               <w:rPr>
                 <w:sz w:val="19"/>
               </w:rPr>
-              <w:t>2026-10-20</w:t>
+              <w:t>2026-10-21</w:t>
             </w:r>
           </w:p>
         </w:tc>
@@ -3244,7 +3249,7 @@
               <w:rPr>
                 <w:sz w:val="19"/>
               </w:rPr>
-              <w:t>Analyst web app for reviewing runs in a browser. Optional grouping of pages by design template, so shared files are fetched once per group.</w:t>
+              <w:t>Crossed-out text (for example an old sale price) is kept and marked with ~~ instead of reading as a current price.</w:t>
             </w:r>
           </w:p>
         </w:tc>
@@ -3290,7 +3295,7 @@
               <w:rPr>
                 <w:sz w:val="19"/>
               </w:rPr>
-              <w:t>Image and scanned-text reading switched on (Tesseract with 25 languages, found automatically). The visual-text check was tuned on the live John Hancock site so ordinary reading errors and cookie banners no longer cause false alarms. Images and PDFs no longer wait for a browser exploration they cannot have. Automated quality pipeline (CI) added. Live re-run: 3 of 34 verified, with the stricter checks finding real missing text.</w:t>
+              <w:t>Analyst web app for reviewing runs in a browser. Optional grouping of pages by design template, so shared files are fetched once per group.</w:t>
             </w:r>
           </w:p>
         </w:tc>
@@ -3334,7 +3339,7 @@
               <w:rPr>
                 <w:sz w:val="19"/>
               </w:rPr>
-              <w:t>Six safety and accuracy fixes (failed image reading no longer reported as verified; compressed pages decoded correctly; paused websites resume; paid access always needs approval; connections locked to the checked address; contradiction report no longer confuses dated snapshots or different products). Critical-fact check (R9) added. Tesseract OCR installed with 25 languages.</w:t>
+              <w:t>Image and scanned-text reading switched on (Tesseract with 25 languages, found automatically). The visual-text check was tuned on the live John Hancock site so ordinary reading errors and cookie banners no longer cause false alarms. Images and PDFs no longer wait for a browser exploration they cannot have. Automated quality pipeline (CI) added. Live re-run: 3 of 34 verified, with the stricter checks finding real missing text.</w:t>
             </w:r>
           </w:p>
         </w:tc>
@@ -3358,6 +3363,51 @@
               <w:rPr>
                 <w:sz w:val="19"/>
               </w:rPr>
+              <w:t>2026-10-20</w:t>
+            </w:r>
+          </w:p>
+        </w:tc>
+        <w:tc>
+          <w:tcPr>
+            <w:tcW w:type="dxa" w:w="4873"/>
+            <w:shd w:val="clear" w:color="auto" w:fill="EEF2F7"/>
+          </w:tcPr>
+          <w:p>
+            <w:pPr>
+              <w:spacing w:after="40"/>
+            </w:pPr>
+            <w:r>
+              <w:rPr>
+                <w:sz w:val="19"/>
+              </w:rPr>
+            </w:r>
+            <w:r>
+              <w:rPr>
+                <w:sz w:val="19"/>
+              </w:rPr>
+              <w:t>Six safety and accuracy fixes (failed image reading no longer reported as verified; compressed pages decoded correctly; paused websites resume; paid access always needs approval; connections locked to the checked address; contradiction report no longer confuses dated snapshots or different products). Critical-fact check (R9) added. Tesseract OCR installed with 25 languages.</w:t>
+            </w:r>
+          </w:p>
+        </w:tc>
+      </w:tr>
+      <w:tr>
+        <w:tc>
+          <w:tcPr>
+            <w:tcW w:type="dxa" w:w="4873"/>
+          </w:tcPr>
+          <w:p>
+            <w:pPr>
+              <w:spacing w:after="40"/>
+            </w:pPr>
+            <w:r>
+              <w:rPr>
+                <w:sz w:val="19"/>
+              </w:rPr>
+            </w:r>
+            <w:r>
+              <w:rPr>
+                <w:sz w:val="19"/>
+              </w:rPr>
               <w:t>2026-10-19</w:t>
             </w:r>
           </w:p>
@@ -3365,7 +3415,6 @@
         <w:tc>
           <w:tcPr>
             <w:tcW w:type="dxa" w:w="4873"/>
-            <w:shd w:val="clear" w:color="auto" w:fill="EEF2F7"/>
           </w:tcPr>
           <w:p>
             <w:pPr>
@@ -3389,6 +3438,7 @@
         <w:tc>
           <w:tcPr>
             <w:tcW w:type="dxa" w:w="4873"/>
+            <w:shd w:val="clear" w:color="auto" w:fill="EEF2F7"/>
           </w:tcPr>
           <w:p>
             <w:pPr>
@@ -3410,6 +3460,7 @@
         <w:tc>
           <w:tcPr>
             <w:tcW w:type="dxa" w:w="4873"/>
+            <w:shd w:val="clear" w:color="auto" w:fill="EEF2F7"/>
           </w:tcPr>
           <w:p>
             <w:pPr>
@@ -3433,7 +3484,6 @@
         <w:tc>
           <w:tcPr>
             <w:tcW w:type="dxa" w:w="4873"/>
-            <w:shd w:val="clear" w:color="auto" w:fill="EEF2F7"/>
           </w:tcPr>
           <w:p>
             <w:pPr>
@@ -3455,7 +3505,6 @@
         <w:tc>
           <w:tcPr>
             <w:tcW w:type="dxa" w:w="4873"/>
-            <w:shd w:val="clear" w:color="auto" w:fill="EEF2F7"/>
           </w:tcPr>
           <w:p>
             <w:pPr>

</xml_diff>

<commit_message>
Guide: page grouping and shared downloads (plain-language update and rebuilt Word file); lane log
Co-Authored-By: Claude Haiku 5.5 <noreply@anthropic.com>
</commit_message>
<xml_diff>
--- a/Content_Processor_Guide.docx
+++ b/Content_Processor_Guide.docx
@@ -17,7 +17,7 @@
           <w:color w:val="595959"/>
           <w:sz w:val="19"/>
         </w:rPr>
-        <w:t>Last updated: 21 October 2026 · Code version: main after the struck-text change and the evidence-storage fix (K20) · Maintained by every session that adds a significant feature (see "Keeping this guide current" at the end)</w:t>
+        <w:t>Last updated: 21 October 2026 · Code version: feature branch for page grouping and shared downloads, on top of main after the evidence-storage fix (K20) · Maintained by every session that adds a significant feature (see "Keeping this guide current" at the end)</w:t>
       </w:r>
     </w:p>
     <w:p>
@@ -1099,6 +1099,17 @@
     <w:p>
       <w:r>
         <w:t>The engine then compares what the browser shows with what the raw HTML contained, so content that appears only after loading, or disappears, is noticed.</w:t>
+      </w:r>
+    </w:p>
+    <w:p>
+      <w:r>
+        <w:rPr>
+          <w:b/>
+        </w:rPr>
+        <w:t>Pages that look alike are grouped (optional, switched on with `--group-assets`).</w:t>
+      </w:r>
+      <w:r>
+        <w:t xml:space="preserve"> Pages in one section of a website often share the same design: the same layout, style sheets, scripts, fonts and logo. The engine recognises pages built from the same design template and groups them. A group's shared files are downloaded once and reused for the other pages in the group, which means fewer requests reach the website. Error pages, blocked pages and pages that only load their content with scripts are never placed in these groups. On the test website we built for this, pages in a group needed 62 percent fewer requests to the website than pages handled one at a time. The work for each page is still done for that page, and each page keeps its own evidence.</w:t>
       </w:r>
     </w:p>
     <w:p>
@@ -2455,6 +2466,52 @@
           </w:p>
         </w:tc>
       </w:tr>
+      <w:tr>
+        <w:tc>
+          <w:tcPr>
+            <w:tcW w:type="dxa" w:w="4873"/>
+            <w:shd w:val="clear" w:color="auto" w:fill="EEF2F7"/>
+          </w:tcPr>
+          <w:p>
+            <w:pPr>
+              <w:spacing w:after="40"/>
+            </w:pPr>
+            <w:r>
+              <w:rPr>
+                <w:sz w:val="19"/>
+              </w:rPr>
+            </w:r>
+            <w:r>
+              <w:rPr>
+                <w:sz w:val="19"/>
+              </w:rPr>
+              <w:t>Shared downloads within a page group (our own test website, 4 pages, 21 October 2026)</w:t>
+            </w:r>
+          </w:p>
+        </w:tc>
+        <w:tc>
+          <w:tcPr>
+            <w:tcW w:type="dxa" w:w="4873"/>
+            <w:shd w:val="clear" w:color="auto" w:fill="EEF2F7"/>
+          </w:tcPr>
+          <w:p>
+            <w:pPr>
+              <w:spacing w:after="40"/>
+            </w:pPr>
+            <w:r>
+              <w:rPr>
+                <w:sz w:val="19"/>
+              </w:rPr>
+            </w:r>
+            <w:r>
+              <w:rPr>
+                <w:sz w:val="19"/>
+              </w:rPr>
+              <w:t>Requests to the website fell from 24 to 9 (the four pages plus five shared files, instead of every file four times). Time saved on the test site is small because the test site responds almost instantly; the saving on real, slower websites has not been measured yet.</w:t>
+            </w:r>
+          </w:p>
+        </w:tc>
+      </w:tr>
     </w:tbl>
     <w:p/>
     <w:p>
@@ -2519,6 +2576,30 @@
       </w:pPr>
       <w:r>
         <w:t>A text-joining fault (20 October) glues neighbouring words on some live pages; until it is fixed those pages are flagged for review.</w:t>
+      </w:r>
+    </w:p>
+    <w:p>
+      <w:pPr>
+        <w:pStyle w:val="ListBullet"/>
+      </w:pPr>
+      <w:r>
+        <w:t>Group-by-group browsing: pages in a group are not yet opened one after another, so how much the shared-file reuse saves depends on the order the pages happen to be opened in. Fixing this needs a change to the work queue.</w:t>
+      </w:r>
+    </w:p>
+    <w:p>
+      <w:pPr>
+        <w:pStyle w:val="ListBullet"/>
+      </w:pPr>
+      <w:r>
+        <w:t>Shared text across pages: the engine can recognise text that repeats across a group (for example the same help text on every page), but it does not yet skip re-checking it on each page. Rechecking is still done per page.</w:t>
+      </w:r>
+    </w:p>
+    <w:p>
+      <w:pPr>
+        <w:pStyle w:val="ListBullet"/>
+      </w:pPr>
+      <w:r>
+        <w:t>Meaning-based similarity: the engine compares pages by their layout, and by exact or near-exact wording. It does not yet find pages that say the same thing in different words. That needs the planned vector search with a language-understanding model, which is not installed.</w:t>
       </w:r>
     </w:p>
     <w:p>
@@ -3246,7 +3327,7 @@
               <w:rPr>
                 <w:sz w:val="19"/>
               </w:rPr>
-              <w:t>Evidence stored compactly: repeated fonts and style sheets kept once, the rest compressed, originals unchanged. About 18 times less disk on the live John Hancock run; a 5,000-page run now fits the 20 GB budget. Older evidence can be converted with one command.</w:t>
+              <w:t>Pages built from the same design template are grouped (optional, `--group-assets`). Shared style sheets, scripts, fonts and images are downloaded once per group and reused, so fewer requests reach the website. Error, blocked and script-only pages are kept out of groups. The engine also recognises text that repeats across a group, as groundwork for skipping repeated checks later.</w:t>
             </w:r>
           </w:p>
         </w:tc>
@@ -3292,7 +3373,7 @@
               <w:rPr>
                 <w:sz w:val="19"/>
               </w:rPr>
-              <w:t>Crossed-out text (for example an old sale price) is kept and marked with ~~ instead of reading as a current price.</w:t>
+              <w:t>Evidence stored compactly: repeated fonts and style sheets kept once, the rest compressed, originals unchanged. About 18 times less disk on the live John Hancock run; a 5,000-page run now fits the 20 GB budget. Older evidence can be converted with one command.</w:t>
             </w:r>
           </w:p>
         </w:tc>
@@ -3315,7 +3396,7 @@
               <w:rPr>
                 <w:sz w:val="19"/>
               </w:rPr>
-              <w:t>2026-10-20</w:t>
+              <w:t>2026-10-21</w:t>
             </w:r>
           </w:p>
         </w:tc>
@@ -3336,7 +3417,7 @@
               <w:rPr>
                 <w:sz w:val="19"/>
               </w:rPr>
-              <w:t>Report file names start with the run's name, so downloads from different runs stay separate.</w:t>
+              <w:t>Crossed-out text (for example an old sale price) is kept and marked with ~~ instead of reading as a current price.</w:t>
             </w:r>
           </w:p>
         </w:tc>
@@ -3382,7 +3463,7 @@
               <w:rPr>
                 <w:sz w:val="19"/>
               </w:rPr>
-              <w:t>Analyst web app for reviewing runs in a browser. Optional grouping of pages by design template, so shared files are fetched once per group.</w:t>
+              <w:t>Report file names start with the run's name, so downloads from different runs stay separate.</w:t>
             </w:r>
           </w:p>
         </w:tc>
@@ -3426,7 +3507,7 @@
               <w:rPr>
                 <w:sz w:val="19"/>
               </w:rPr>
-              <w:t>Image and scanned-text reading switched on (Tesseract with 25 languages, found automatically). The visual-text check was tuned on the live John Hancock site so ordinary reading errors and cookie banners no longer cause false alarms. Images and PDFs no longer wait for a browser exploration they cannot have. Automated quality pipeline (CI) added. Live re-run: 3 of 34 verified, with the stricter checks finding real missing text.</w:t>
+              <w:t>Analyst web app for reviewing runs in a browser. Optional grouping of pages by design template, so shared files are fetched once per group.</w:t>
             </w:r>
           </w:p>
         </w:tc>
@@ -3472,7 +3553,7 @@
               <w:rPr>
                 <w:sz w:val="19"/>
               </w:rPr>
-              <w:t>Six safety and accuracy fixes (failed image reading no longer reported as verified; compressed pages decoded correctly; paused websites resume; paid access always needs approval; connections locked to the checked address; contradiction report no longer confuses dated snapshots or different products). Critical-fact check (R9) added. Tesseract OCR installed with 25 languages.</w:t>
+              <w:t>Image and scanned-text reading switched on (Tesseract with 25 languages, found automatically). The visual-text check was tuned on the live John Hancock site so ordinary reading errors and cookie banners no longer cause false alarms. Images and PDFs no longer wait for a browser exploration they cannot have. Automated quality pipeline (CI) added. Live re-run: 3 of 34 verified, with the stricter checks finding real missing text.</w:t>
             </w:r>
           </w:p>
         </w:tc>
@@ -3495,6 +3576,51 @@
               <w:rPr>
                 <w:sz w:val="19"/>
               </w:rPr>
+              <w:t>2026-10-20</w:t>
+            </w:r>
+          </w:p>
+        </w:tc>
+        <w:tc>
+          <w:tcPr>
+            <w:tcW w:type="dxa" w:w="4873"/>
+          </w:tcPr>
+          <w:p>
+            <w:pPr>
+              <w:spacing w:after="40"/>
+            </w:pPr>
+            <w:r>
+              <w:rPr>
+                <w:sz w:val="19"/>
+              </w:rPr>
+            </w:r>
+            <w:r>
+              <w:rPr>
+                <w:sz w:val="19"/>
+              </w:rPr>
+              <w:t>Six safety and accuracy fixes (failed image reading no longer reported as verified; compressed pages decoded correctly; paused websites resume; paid access always needs approval; connections locked to the checked address; contradiction report no longer confuses dated snapshots or different products). Critical-fact check (R9) added. Tesseract OCR installed with 25 languages.</w:t>
+            </w:r>
+          </w:p>
+        </w:tc>
+      </w:tr>
+      <w:tr>
+        <w:tc>
+          <w:tcPr>
+            <w:tcW w:type="dxa" w:w="4873"/>
+            <w:shd w:val="clear" w:color="auto" w:fill="EEF2F7"/>
+          </w:tcPr>
+          <w:p>
+            <w:pPr>
+              <w:spacing w:after="40"/>
+            </w:pPr>
+            <w:r>
+              <w:rPr>
+                <w:sz w:val="19"/>
+              </w:rPr>
+            </w:r>
+            <w:r>
+              <w:rPr>
+                <w:sz w:val="19"/>
+              </w:rPr>
               <w:t>2026-10-19</w:t>
             </w:r>
           </w:p>
@@ -3502,6 +3628,7 @@
         <w:tc>
           <w:tcPr>
             <w:tcW w:type="dxa" w:w="4873"/>
+            <w:shd w:val="clear" w:color="auto" w:fill="EEF2F7"/>
           </w:tcPr>
           <w:p>
             <w:pPr>
@@ -3525,7 +3652,6 @@
         <w:tc>
           <w:tcPr>
             <w:tcW w:type="dxa" w:w="4873"/>
-            <w:shd w:val="clear" w:color="auto" w:fill="EEF2F7"/>
           </w:tcPr>
           <w:p>
             <w:pPr>
@@ -3547,7 +3673,6 @@
         <w:tc>
           <w:tcPr>
             <w:tcW w:type="dxa" w:w="4873"/>
-            <w:shd w:val="clear" w:color="auto" w:fill="EEF2F7"/>
           </w:tcPr>
           <w:p>
             <w:pPr>
@@ -3571,6 +3696,7 @@
         <w:tc>
           <w:tcPr>
             <w:tcW w:type="dxa" w:w="4873"/>
+            <w:shd w:val="clear" w:color="auto" w:fill="EEF2F7"/>
           </w:tcPr>
           <w:p>
             <w:pPr>
@@ -3592,6 +3718,7 @@
         <w:tc>
           <w:tcPr>
             <w:tcW w:type="dxa" w:w="4873"/>
+            <w:shd w:val="clear" w:color="auto" w:fill="EEF2F7"/>
           </w:tcPr>
           <w:p>
             <w:pPr>

</xml_diff>

<commit_message>
Reviewer decisions saved in the analyst web app, carried into the next report
One append-only log per run (<run>.decisions.jsonl) records who decided
what and when; the latest line wins. The API stays read-only except a
guarded POST (JSON, X-Requested-With header, local Origin, item must
exist). The review and contradiction pages gain decision pickers, a note
editor and a remembered reviewer name; the report command and dry runs
pre-fill R4 and the review queue from the log.

Co-Authored-By: Claude Opus 5.5 <noreply@anthropic.com>
</commit_message>
<xml_diff>
--- a/Content_Processor_Guide.docx
+++ b/Content_Processor_Guide.docx
@@ -17,7 +17,7 @@
           <w:color w:val="595959"/>
           <w:sz w:val="19"/>
         </w:rPr>
-        <w:t>Last updated: 21 October 2026 · Code version: main after the project report · Maintained by every session that adds a significant feature (see "Keeping this guide current" at the end)</w:t>
+        <w:t>Last updated: 21 October 2026 · Code version: main after the project report and reviewer decisions in the web app · Maintained by every session that adds a significant feature (see "Keeping this guide current" at the end)</w:t>
       </w:r>
     </w:p>
     <w:p>
@@ -2154,7 +2154,12 @@
     </w:p>
     <w:p>
       <w:r>
-        <w:t>Besides the files, there is a web app for reviewing runs in a browser on your own computer (it only reads results and cannot change anything). It shows all runs; an overview of each run with charts of verdicts, the most common reasons pages were not verified and what to do about them; a searchable, filterable table of pages; a detail view per page (its content, issues, facts and technical details); duplicate content; possible contradictions; the pages that need your review; downloads of every report; and a dark mode.</w:t>
+        <w:t>Besides the files, there is a web app for reviewing runs in a browser on your own computer. It never changes a run's results; the one thing you can save in it is your own decisions. It shows all runs; an overview of each run with charts of verdicts, the most common reasons pages were not verified and what to do about them; a searchable, filterable table of pages; a detail view per page (its content, issues, facts and technical details); duplicate content; possible contradictions; the pages that need your review; downloads of every report; and a dark mode.</w:t>
+      </w:r>
+    </w:p>
+    <w:p>
+      <w:r>
+        <w:t>Reviewers can record decisions directly in the app: for each possible contradiction (confirmed, not a contradiction, different context) and for each page that needs review (for example "get the content by hand" or "leave out of the results", with a note). You enter your name once; every decision is saved with your name and the time, and every earlier answer is kept, so there is a full history. The next report for that run starts with these decisions already filled in, in the Excel files too.</w:t>
       </w:r>
     </w:p>
     <w:p>
@@ -3338,7 +3343,7 @@
               <w:rPr>
                 <w:sz w:val="19"/>
               </w:rPr>
-              <w:t>Live John Hancock: 32 of 34 verified again with all checks on (the 2 others are placeholder pages). FAQ sections built as web components are now opened, text is matched the way the browser shows it, and a brief network hiccup no longer pauses a whole website.</w:t>
+              <w:t>Reviewers save decisions in the web app (with name, time and full history); the next report carries them forward.</w:t>
             </w:r>
           </w:p>
         </w:tc>
@@ -3384,7 +3389,7 @@
               <w:rPr>
                 <w:sz w:val="19"/>
               </w:rPr>
-              <w:t>Project report: one Excel workbook per run with every page's text, whether it was fully extracted, the confirmed share and the confidence, plus, for every page, which other pages carry the same text and how much (exact matching).</w:t>
+              <w:t>Live John Hancock: 32 of 34 verified again with all checks on (the 2 others are placeholder pages). FAQ sections built as web components are now opened, text is matched the way the browser shows it, and a brief network hiccup no longer pauses a whole website.</w:t>
             </w:r>
           </w:p>
         </w:tc>
@@ -3428,7 +3433,7 @@
               <w:rPr>
                 <w:sz w:val="19"/>
               </w:rPr>
-              <w:t>Evidence stored compactly: repeated fonts and style sheets kept once, the rest compressed, originals unchanged. About 18 times less disk on the live John Hancock run; a 5,000-page run now fits the 20 GB budget. Older evidence can be converted with one command.</w:t>
+              <w:t>Project report: one Excel workbook per run with every page's text, whether it was fully extracted, the confirmed share and the confidence, plus, for every page, which other pages carry the same text and how much (exact matching).</w:t>
             </w:r>
           </w:p>
         </w:tc>
@@ -3474,7 +3479,7 @@
               <w:rPr>
                 <w:sz w:val="19"/>
               </w:rPr>
-              <w:t>Crossed-out text (for example an old sale price) is kept and marked with ~~ instead of reading as a current price.</w:t>
+              <w:t>Evidence stored compactly: repeated fonts and style sheets kept once, the rest compressed, originals unchanged. About 18 times less disk on the live John Hancock run; a 5,000-page run now fits the 20 GB budget. Older evidence can be converted with one command.</w:t>
             </w:r>
           </w:p>
         </w:tc>
@@ -3497,7 +3502,7 @@
               <w:rPr>
                 <w:sz w:val="19"/>
               </w:rPr>
-              <w:t>2026-10-20</w:t>
+              <w:t>2026-10-21</w:t>
             </w:r>
           </w:p>
         </w:tc>
@@ -3518,7 +3523,7 @@
               <w:rPr>
                 <w:sz w:val="19"/>
               </w:rPr>
-              <w:t>Report file names start with the run's name, so downloads from different runs stay separate.</w:t>
+              <w:t>Crossed-out text (for example an old sale price) is kept and marked with ~~ instead of reading as a current price.</w:t>
             </w:r>
           </w:p>
         </w:tc>
@@ -3564,7 +3569,7 @@
               <w:rPr>
                 <w:sz w:val="19"/>
               </w:rPr>
-              <w:t>Analyst web app for reviewing runs in a browser. Optional grouping of pages by design template, so shared files are fetched once per group.</w:t>
+              <w:t>Report file names start with the run's name, so downloads from different runs stay separate.</w:t>
             </w:r>
           </w:p>
         </w:tc>
@@ -3608,7 +3613,7 @@
               <w:rPr>
                 <w:sz w:val="19"/>
               </w:rPr>
-              <w:t>Image and scanned-text reading switched on (Tesseract with 25 languages, found automatically). The visual-text check was tuned on the live John Hancock site so ordinary reading errors and cookie banners no longer cause false alarms. Images and PDFs no longer wait for a browser exploration they cannot have. Automated quality pipeline (CI) added. Live re-run: 3 of 34 verified, with the stricter checks finding real missing text.</w:t>
+              <w:t>Analyst web app for reviewing runs in a browser. Optional grouping of pages by design template, so shared files are fetched once per group.</w:t>
             </w:r>
           </w:p>
         </w:tc>
@@ -3654,7 +3659,7 @@
               <w:rPr>
                 <w:sz w:val="19"/>
               </w:rPr>
-              <w:t>Six safety and accuracy fixes (failed image reading no longer reported as verified; compressed pages decoded correctly; paused websites resume; paid access always needs approval; connections locked to the checked address; contradiction report no longer confuses dated snapshots or different products). Critical-fact check (R9) added. Tesseract OCR installed with 25 languages.</w:t>
+              <w:t>Image and scanned-text reading switched on (Tesseract with 25 languages, found automatically). The visual-text check was tuned on the live John Hancock site so ordinary reading errors and cookie banners no longer cause false alarms. Images and PDFs no longer wait for a browser exploration they cannot have. Automated quality pipeline (CI) added. Live re-run: 3 of 34 verified, with the stricter checks finding real missing text.</w:t>
             </w:r>
           </w:p>
         </w:tc>
@@ -3677,7 +3682,7 @@
               <w:rPr>
                 <w:sz w:val="19"/>
               </w:rPr>
-              <w:t>2026-10-19</w:t>
+              <w:t>2026-10-20</w:t>
             </w:r>
           </w:p>
         </w:tc>
@@ -3698,7 +3703,7 @@
               <w:rPr>
                 <w:sz w:val="19"/>
               </w:rPr>
-              <w:t>Browser exploration reaches 32 of 34 verified on John Hancock. Checks R6–R8 and R11–R13, page settling and evidence integrity added. Contradiction report (R4), paywall detection, run budgets, robots crawl-delay saved, stuck tasks reported. Office documents (Word, Excel, PowerPoint) supported. 222-case test inventory.</w:t>
+              <w:t>Six safety and accuracy fixes (failed image reading no longer reported as verified; compressed pages decoded correctly; paused websites resume; paid access always needs approval; connections locked to the checked address; contradiction report no longer confuses dated snapshots or different products). Critical-fact check (R9) added. Tesseract OCR installed with 25 languages.</w:t>
             </w:r>
           </w:p>
         </w:tc>
@@ -3722,7 +3727,7 @@
               <w:rPr>
                 <w:sz w:val="19"/>
               </w:rPr>
-              <w:t>2026-10-16</w:t>
+              <w:t>2026-10-19</w:t>
             </w:r>
           </w:p>
         </w:tc>
@@ -3744,7 +3749,7 @@
               <w:rPr>
                 <w:sz w:val="19"/>
               </w:rPr>
-              <w:t>Per-page verdicts with evidence, first checks (R1–R3, R10), reports (R1 content, review queue, overlap), offline explorer, run engine and command line.</w:t>
+              <w:t>Browser exploration reaches 32 of 34 verified on John Hancock. Checks R6–R8 and R11–R13, page settling and evidence integrity added. Contradiction report (R4), paywall detection, run budgets, robots crawl-delay saved, stuck tasks reported. Office documents (Word, Excel, PowerPoint) supported. 222-case test inventory.</w:t>
             </w:r>
           </w:p>
         </w:tc>
@@ -3767,13 +3772,59 @@
               <w:rPr>
                 <w:sz w:val="19"/>
               </w:rPr>
-              <w:t>2026-10-15</w:t>
+              <w:t>2026-10-16</w:t>
             </w:r>
           </w:p>
         </w:tc>
         <w:tc>
           <w:tcPr>
             <w:tcW w:type="dxa" w:w="4873"/>
+          </w:tcPr>
+          <w:p>
+            <w:pPr>
+              <w:spacing w:after="40"/>
+            </w:pPr>
+            <w:r>
+              <w:rPr>
+                <w:sz w:val="19"/>
+              </w:rPr>
+            </w:r>
+            <w:r>
+              <w:rPr>
+                <w:sz w:val="19"/>
+              </w:rPr>
+              <w:t>Per-page verdicts with evidence, first checks (R1–R3, R10), reports (R1 content, review queue, overlap), offline explorer, run engine and command line.</w:t>
+            </w:r>
+          </w:p>
+        </w:tc>
+      </w:tr>
+      <w:tr>
+        <w:tc>
+          <w:tcPr>
+            <w:tcW w:type="dxa" w:w="4873"/>
+            <w:shd w:val="clear" w:color="auto" w:fill="EEF2F7"/>
+          </w:tcPr>
+          <w:p>
+            <w:pPr>
+              <w:spacing w:after="40"/>
+            </w:pPr>
+            <w:r>
+              <w:rPr>
+                <w:sz w:val="19"/>
+              </w:rPr>
+            </w:r>
+            <w:r>
+              <w:rPr>
+                <w:sz w:val="19"/>
+              </w:rPr>
+              <w:t>2026-10-15</w:t>
+            </w:r>
+          </w:p>
+        </w:tc>
+        <w:tc>
+          <w:tcPr>
+            <w:tcW w:type="dxa" w:w="4873"/>
+            <w:shd w:val="clear" w:color="auto" w:fill="EEF2F7"/>
           </w:tcPr>
           <w:p>
             <w:pPr>

</xml_diff>

<commit_message>
docs: John Hancock confirmed at 32/34 with every check on; guide and lane log
Co-Authored-By: Claude Opus 5.5 <noreply@anthropic.com>
</commit_message>
<xml_diff>
--- a/Content_Processor_Guide.docx
+++ b/Content_Processor_Guide.docx
@@ -2295,6 +2295,51 @@
               <w:rPr>
                 <w:sz w:val="19"/>
               </w:rPr>
+              <w:t>Live John Hancock website, 34 pages (21 October 2026)</w:t>
+            </w:r>
+          </w:p>
+        </w:tc>
+        <w:tc>
+          <w:tcPr>
+            <w:tcW w:type="dxa" w:w="4873"/>
+          </w:tcPr>
+          <w:p>
+            <w:pPr>
+              <w:spacing w:after="40"/>
+            </w:pPr>
+            <w:r>
+              <w:rPr>
+                <w:sz w:val="19"/>
+              </w:rPr>
+            </w:r>
+            <w:r>
+              <w:rPr>
+                <w:sz w:val="19"/>
+              </w:rPr>
+              <w:t>32 of 34 pages VERIFIED_WITHIN_SCOPE at $0 with every check switched on (stricter than on 19 October: text reading, missing-text and leak checks). The other 2 are correctly flagged NEEDS_REVIEW: their live content is "Lorem ipsum" placeholder text. Reached by opening FAQ sections built as web components, matching text the way the browser shows it, and not letting a brief network hiccup pause the whole site.</w:t>
+            </w:r>
+          </w:p>
+        </w:tc>
+      </w:tr>
+      <w:tr>
+        <w:tc>
+          <w:tcPr>
+            <w:tcW w:type="dxa" w:w="4873"/>
+            <w:shd w:val="clear" w:color="auto" w:fill="EEF2F7"/>
+          </w:tcPr>
+          <w:p>
+            <w:pPr>
+              <w:spacing w:after="40"/>
+            </w:pPr>
+            <w:r>
+              <w:rPr>
+                <w:sz w:val="19"/>
+              </w:rPr>
+            </w:r>
+            <w:r>
+              <w:rPr>
+                <w:sz w:val="19"/>
+              </w:rPr>
               <w:t>Live John Hancock website, 34 pages (19 October 2026)</w:t>
             </w:r>
           </w:p>
@@ -2302,6 +2347,7 @@
         <w:tc>
           <w:tcPr>
             <w:tcW w:type="dxa" w:w="4873"/>
+            <w:shd w:val="clear" w:color="auto" w:fill="EEF2F7"/>
           </w:tcPr>
           <w:p>
             <w:pPr>
@@ -2325,7 +2371,6 @@
         <w:tc>
           <w:tcPr>
             <w:tcW w:type="dxa" w:w="4873"/>
-            <w:shd w:val="clear" w:color="auto" w:fill="EEF2F7"/>
           </w:tcPr>
           <w:p>
             <w:pPr>
@@ -2347,7 +2392,6 @@
         <w:tc>
           <w:tcPr>
             <w:tcW w:type="dxa" w:w="4873"/>
-            <w:shd w:val="clear" w:color="auto" w:fill="EEF2F7"/>
           </w:tcPr>
           <w:p>
             <w:pPr>
@@ -2371,6 +2415,7 @@
         <w:tc>
           <w:tcPr>
             <w:tcW w:type="dxa" w:w="4873"/>
+            <w:shd w:val="clear" w:color="auto" w:fill="EEF2F7"/>
           </w:tcPr>
           <w:p>
             <w:pPr>
@@ -2392,6 +2437,7 @@
         <w:tc>
           <w:tcPr>
             <w:tcW w:type="dxa" w:w="4873"/>
+            <w:shd w:val="clear" w:color="auto" w:fill="EEF2F7"/>
           </w:tcPr>
           <w:p>
             <w:pPr>
@@ -2415,7 +2461,6 @@
         <w:tc>
           <w:tcPr>
             <w:tcW w:type="dxa" w:w="4873"/>
-            <w:shd w:val="clear" w:color="auto" w:fill="EEF2F7"/>
           </w:tcPr>
           <w:p>
             <w:pPr>
@@ -2437,7 +2482,6 @@
         <w:tc>
           <w:tcPr>
             <w:tcW w:type="dxa" w:w="4873"/>
-            <w:shd w:val="clear" w:color="auto" w:fill="EEF2F7"/>
           </w:tcPr>
           <w:p>
             <w:pPr>
@@ -2461,6 +2505,7 @@
         <w:tc>
           <w:tcPr>
             <w:tcW w:type="dxa" w:w="4873"/>
+            <w:shd w:val="clear" w:color="auto" w:fill="EEF2F7"/>
           </w:tcPr>
           <w:p>
             <w:pPr>
@@ -2482,6 +2527,7 @@
         <w:tc>
           <w:tcPr>
             <w:tcW w:type="dxa" w:w="4873"/>
+            <w:shd w:val="clear" w:color="auto" w:fill="EEF2F7"/>
           </w:tcPr>
           <w:p>
             <w:pPr>
@@ -3292,7 +3338,7 @@
               <w:rPr>
                 <w:sz w:val="19"/>
               </w:rPr>
-              <w:t>Project report: one Excel workbook per run with every page's text, whether it was fully extracted, the confirmed share and the confidence, plus, for every page, which other pages carry the same text and how much (exact matching).</w:t>
+              <w:t>Live John Hancock: 32 of 34 verified again with all checks on (the 2 others are placeholder pages). FAQ sections built as web components are now opened, text is matched the way the browser shows it, and a brief network hiccup no longer pauses a whole website.</w:t>
             </w:r>
           </w:p>
         </w:tc>
@@ -3338,7 +3384,7 @@
               <w:rPr>
                 <w:sz w:val="19"/>
               </w:rPr>
-              <w:t>Evidence stored compactly: repeated fonts and style sheets kept once, the rest compressed, originals unchanged. About 18 times less disk on the live John Hancock run; a 5,000-page run now fits the 20 GB budget. Older evidence can be converted with one command.</w:t>
+              <w:t>Project report: one Excel workbook per run with every page's text, whether it was fully extracted, the confirmed share and the confidence, plus, for every page, which other pages carry the same text and how much (exact matching).</w:t>
             </w:r>
           </w:p>
         </w:tc>
@@ -3382,7 +3428,97 @@
               <w:rPr>
                 <w:sz w:val="19"/>
               </w:rPr>
+              <w:t>Evidence stored compactly: repeated fonts and style sheets kept once, the rest compressed, originals unchanged. About 18 times less disk on the live John Hancock run; a 5,000-page run now fits the 20 GB budget. Older evidence can be converted with one command.</w:t>
+            </w:r>
+          </w:p>
+        </w:tc>
+      </w:tr>
+      <w:tr>
+        <w:tc>
+          <w:tcPr>
+            <w:tcW w:type="dxa" w:w="4873"/>
+            <w:shd w:val="clear" w:color="auto" w:fill="EEF2F7"/>
+          </w:tcPr>
+          <w:p>
+            <w:pPr>
+              <w:spacing w:after="40"/>
+            </w:pPr>
+            <w:r>
+              <w:rPr>
+                <w:sz w:val="19"/>
+              </w:rPr>
+            </w:r>
+            <w:r>
+              <w:rPr>
+                <w:sz w:val="19"/>
+              </w:rPr>
+              <w:t>2026-10-21</w:t>
+            </w:r>
+          </w:p>
+        </w:tc>
+        <w:tc>
+          <w:tcPr>
+            <w:tcW w:type="dxa" w:w="4873"/>
+            <w:shd w:val="clear" w:color="auto" w:fill="EEF2F7"/>
+          </w:tcPr>
+          <w:p>
+            <w:pPr>
+              <w:spacing w:after="40"/>
+            </w:pPr>
+            <w:r>
+              <w:rPr>
+                <w:sz w:val="19"/>
+              </w:rPr>
+            </w:r>
+            <w:r>
+              <w:rPr>
+                <w:sz w:val="19"/>
+              </w:rPr>
               <w:t>Crossed-out text (for example an old sale price) is kept and marked with ~~ instead of reading as a current price.</w:t>
+            </w:r>
+          </w:p>
+        </w:tc>
+      </w:tr>
+      <w:tr>
+        <w:tc>
+          <w:tcPr>
+            <w:tcW w:type="dxa" w:w="4873"/>
+          </w:tcPr>
+          <w:p>
+            <w:pPr>
+              <w:spacing w:after="40"/>
+            </w:pPr>
+            <w:r>
+              <w:rPr>
+                <w:sz w:val="19"/>
+              </w:rPr>
+            </w:r>
+            <w:r>
+              <w:rPr>
+                <w:sz w:val="19"/>
+              </w:rPr>
+              <w:t>2026-10-20</w:t>
+            </w:r>
+          </w:p>
+        </w:tc>
+        <w:tc>
+          <w:tcPr>
+            <w:tcW w:type="dxa" w:w="4873"/>
+          </w:tcPr>
+          <w:p>
+            <w:pPr>
+              <w:spacing w:after="40"/>
+            </w:pPr>
+            <w:r>
+              <w:rPr>
+                <w:sz w:val="19"/>
+              </w:rPr>
+            </w:r>
+            <w:r>
+              <w:rPr>
+                <w:sz w:val="19"/>
+              </w:rPr>
+              <w:t>Report file names start with the run's name, so downloads from different runs stay separate.</w:t>
             </w:r>
           </w:p>
         </w:tc>
@@ -3428,7 +3564,7 @@
               <w:rPr>
                 <w:sz w:val="19"/>
               </w:rPr>
-              <w:t>Report file names start with the run's name, so downloads from different runs stay separate.</w:t>
+              <w:t>Analyst web app for reviewing runs in a browser. Optional grouping of pages by design template, so shared files are fetched once per group.</w:t>
             </w:r>
           </w:p>
         </w:tc>
@@ -3472,7 +3608,7 @@
               <w:rPr>
                 <w:sz w:val="19"/>
               </w:rPr>
-              <w:t>Analyst web app for reviewing runs in a browser. Optional grouping of pages by design template, so shared files are fetched once per group.</w:t>
+              <w:t>Image and scanned-text reading switched on (Tesseract with 25 languages, found automatically). The visual-text check was tuned on the live John Hancock site so ordinary reading errors and cookie banners no longer cause false alarms. Images and PDFs no longer wait for a browser exploration they cannot have. Automated quality pipeline (CI) added. Live re-run: 3 of 34 verified, with the stricter checks finding real missing text.</w:t>
             </w:r>
           </w:p>
         </w:tc>
@@ -3518,7 +3654,7 @@
               <w:rPr>
                 <w:sz w:val="19"/>
               </w:rPr>
-              <w:t>Image and scanned-text reading switched on (Tesseract with 25 languages, found automatically). The visual-text check was tuned on the live John Hancock site so ordinary reading errors and cookie banners no longer cause false alarms. Images and PDFs no longer wait for a browser exploration they cannot have. Automated quality pipeline (CI) added. Live re-run: 3 of 34 verified, with the stricter checks finding real missing text.</w:t>
+              <w:t>Six safety and accuracy fixes (failed image reading no longer reported as verified; compressed pages decoded correctly; paused websites resume; paid access always needs approval; connections locked to the checked address; contradiction report no longer confuses dated snapshots or different products). Critical-fact check (R9) added. Tesseract OCR installed with 25 languages.</w:t>
             </w:r>
           </w:p>
         </w:tc>
@@ -3541,7 +3677,7 @@
               <w:rPr>
                 <w:sz w:val="19"/>
               </w:rPr>
-              <w:t>2026-10-20</w:t>
+              <w:t>2026-10-19</w:t>
             </w:r>
           </w:p>
         </w:tc>
@@ -3562,7 +3698,7 @@
               <w:rPr>
                 <w:sz w:val="19"/>
               </w:rPr>
-              <w:t>Six safety and accuracy fixes (failed image reading no longer reported as verified; compressed pages decoded correctly; paused websites resume; paid access always needs approval; connections locked to the checked address; contradiction report no longer confuses dated snapshots or different products). Critical-fact check (R9) added. Tesseract OCR installed with 25 languages.</w:t>
+              <w:t>Browser exploration reaches 32 of 34 verified on John Hancock. Checks R6–R8 and R11–R13, page settling and evidence integrity added. Contradiction report (R4), paywall detection, run budgets, robots crawl-delay saved, stuck tasks reported. Office documents (Word, Excel, PowerPoint) supported. 222-case test inventory.</w:t>
             </w:r>
           </w:p>
         </w:tc>
@@ -3586,7 +3722,7 @@
               <w:rPr>
                 <w:sz w:val="19"/>
               </w:rPr>
-              <w:t>2026-10-19</w:t>
+              <w:t>2026-10-16</w:t>
             </w:r>
           </w:p>
         </w:tc>
@@ -3594,50 +3730,6 @@
           <w:tcPr>
             <w:tcW w:type="dxa" w:w="4873"/>
             <w:shd w:val="clear" w:color="auto" w:fill="EEF2F7"/>
-          </w:tcPr>
-          <w:p>
-            <w:pPr>
-              <w:spacing w:after="40"/>
-            </w:pPr>
-            <w:r>
-              <w:rPr>
-                <w:sz w:val="19"/>
-              </w:rPr>
-            </w:r>
-            <w:r>
-              <w:rPr>
-                <w:sz w:val="19"/>
-              </w:rPr>
-              <w:t>Browser exploration reaches 32 of 34 verified on John Hancock. Checks R6–R8 and R11–R13, page settling and evidence integrity added. Contradiction report (R4), paywall detection, run budgets, robots crawl-delay saved, stuck tasks reported. Office documents (Word, Excel, PowerPoint) supported. 222-case test inventory.</w:t>
-            </w:r>
-          </w:p>
-        </w:tc>
-      </w:tr>
-      <w:tr>
-        <w:tc>
-          <w:tcPr>
-            <w:tcW w:type="dxa" w:w="4873"/>
-          </w:tcPr>
-          <w:p>
-            <w:pPr>
-              <w:spacing w:after="40"/>
-            </w:pPr>
-            <w:r>
-              <w:rPr>
-                <w:sz w:val="19"/>
-              </w:rPr>
-            </w:r>
-            <w:r>
-              <w:rPr>
-                <w:sz w:val="19"/>
-              </w:rPr>
-              <w:t>2026-10-16</w:t>
-            </w:r>
-          </w:p>
-        </w:tc>
-        <w:tc>
-          <w:tcPr>
-            <w:tcW w:type="dxa" w:w="4873"/>
           </w:tcPr>
           <w:p>
             <w:pPr>
@@ -3661,7 +3753,6 @@
         <w:tc>
           <w:tcPr>
             <w:tcW w:type="dxa" w:w="4873"/>
-            <w:shd w:val="clear" w:color="auto" w:fill="EEF2F7"/>
           </w:tcPr>
           <w:p>
             <w:pPr>
@@ -3683,7 +3774,6 @@
         <w:tc>
           <w:tcPr>
             <w:tcW w:type="dxa" w:w="4873"/>
-            <w:shd w:val="clear" w:color="auto" w:fill="EEF2F7"/>
           </w:tcPr>
           <w:p>
             <w:pPr>

</xml_diff>

<commit_message>
Paid tiers: Bright Data T4/T5 behind per-host approvals and a spend guard
Off by default: paid fetchers exist only with the kill switch on, a
monthly cap, a T4/T5 scope ceiling and credentials, and a host uses them
only after `cli approve` (tier, cap per run, operator, optional expiry).
Before every paid request the guard reserves the worst case against the
run, daily, monthly, host and per-URL caps and refuses rather than
overspend; actual cost is charged to an append-only spend log
(`cli spend`). T4 keeps one sticky session per host; T5 requires the
vendor CA, TLS checks stay on. Playbook section 10 written.

Co-Authored-By: Claude Opus 5.5 <noreply@anthropic.com>
</commit_message>
<xml_diff>
--- a/Content_Processor_Guide.docx
+++ b/Content_Processor_Guide.docx
@@ -17,7 +17,7 @@
           <w:color w:val="595959"/>
           <w:sz w:val="19"/>
         </w:rPr>
-        <w:t>Last updated: 21 October 2026 · Code version: main after the project report and reviewer decisions in the web app · Maintained by every session that adds a significant feature (see "Keeping this guide current" at the end)</w:t>
+        <w:t>Last updated: 22 October 2026 · Code version: main after paid access with approvals and spending limits · Maintained by every session that adds a significant feature (see "Keeping this guide current" at the end)</w:t>
       </w:r>
     </w:p>
     <w:p>
@@ -2199,6 +2199,14 @@
         <w:pStyle w:val="ListBullet"/>
       </w:pPr>
       <w:r>
+        <w:t>How paid access works: when a website blocks every free method, the engine stops and asks. An operator can approve that one website, for a set amount (for example $5 per run), with one command; nothing else changes. Before every paid request the engine checks the kill switch, the approval and every limit (per run, per day, per month, per website and per page), and refuses rather than overspend. Every paid request is written to a spending log, and one command shows what has been spent and which websites are approved. Prices are counted on the high side, so the log never understates the bill.</w:t>
+      </w:r>
+    </w:p>
+    <w:p>
+      <w:pPr>
+        <w:pStyle w:val="ListBullet"/>
+      </w:pPr>
+      <w:r>
         <w:t>Private networks are off-limits: the engine checks every address before contacting it, at every redirect. The basic downloader also connects only to the exact public address it checked, so a trick that swaps the address mid-way cannot redirect it into a private network (the browser and the Chrome-like downloader re-check each request instead).</w:t>
       </w:r>
     </w:p>
@@ -2567,7 +2575,7 @@
         <w:pStyle w:val="ListBullet"/>
       </w:pPr>
       <w:r>
-        <w:t>Paid access ladder: the Bright Data connection, spending ledger and approval command are not built yet, so a site that blocks all free access ends BLOCKED and the engine asks for approval.</w:t>
+        <w:t>Paid access through Bright Data's remote browser is not built; pages fetched through paid access are read from their page code, not opened in a browser through the paid connection.</w:t>
       </w:r>
     </w:p>
     <w:p>
@@ -3322,7 +3330,7 @@
               <w:rPr>
                 <w:sz w:val="19"/>
               </w:rPr>
-              <w:t>2026-10-21</w:t>
+              <w:t>2026-10-22</w:t>
             </w:r>
           </w:p>
         </w:tc>
@@ -3343,7 +3351,7 @@
               <w:rPr>
                 <w:sz w:val="19"/>
               </w:rPr>
-              <w:t>Reviewers save decisions in the web app (with name, time and full history); the next report carries them forward.</w:t>
+              <w:t>Paid access (Bright Data) built but off by default: one approval per website with a spending cap, checked before every paid request, with a spending log.</w:t>
             </w:r>
           </w:p>
         </w:tc>
@@ -3389,7 +3397,7 @@
               <w:rPr>
                 <w:sz w:val="19"/>
               </w:rPr>
-              <w:t>Live John Hancock: 32 of 34 verified again with all checks on (the 2 others are placeholder pages). FAQ sections built as web components are now opened, text is matched the way the browser shows it, and a brief network hiccup no longer pauses a whole website.</w:t>
+              <w:t>Reviewers save decisions in the web app (with name, time and full history); the next report carries them forward.</w:t>
             </w:r>
           </w:p>
         </w:tc>
@@ -3433,7 +3441,7 @@
               <w:rPr>
                 <w:sz w:val="19"/>
               </w:rPr>
-              <w:t>Project report: one Excel workbook per run with every page's text, whether it was fully extracted, the confirmed share and the confidence, plus, for every page, which other pages carry the same text and how much (exact matching).</w:t>
+              <w:t>Live John Hancock: 32 of 34 verified again with all checks on (the 2 others are placeholder pages). FAQ sections built as web components are now opened, text is matched the way the browser shows it, and a brief network hiccup no longer pauses a whole website.</w:t>
             </w:r>
           </w:p>
         </w:tc>
@@ -3479,7 +3487,7 @@
               <w:rPr>
                 <w:sz w:val="19"/>
               </w:rPr>
-              <w:t>Evidence stored compactly: repeated fonts and style sheets kept once, the rest compressed, originals unchanged. About 18 times less disk on the live John Hancock run; a 5,000-page run now fits the 20 GB budget. Older evidence can be converted with one command.</w:t>
+              <w:t>Project report: one Excel workbook per run with every page's text, whether it was fully extracted, the confirmed share and the confidence, plus, for every page, which other pages carry the same text and how much (exact matching).</w:t>
             </w:r>
           </w:p>
         </w:tc>
@@ -3523,7 +3531,7 @@
               <w:rPr>
                 <w:sz w:val="19"/>
               </w:rPr>
-              <w:t>Crossed-out text (for example an old sale price) is kept and marked with ~~ instead of reading as a current price.</w:t>
+              <w:t>Evidence stored compactly: repeated fonts and style sheets kept once, the rest compressed, originals unchanged. About 18 times less disk on the live John Hancock run; a 5,000-page run now fits the 20 GB budget. Older evidence can be converted with one command.</w:t>
             </w:r>
           </w:p>
         </w:tc>
@@ -3547,7 +3555,7 @@
               <w:rPr>
                 <w:sz w:val="19"/>
               </w:rPr>
-              <w:t>2026-10-20</w:t>
+              <w:t>2026-10-21</w:t>
             </w:r>
           </w:p>
         </w:tc>
@@ -3569,7 +3577,7 @@
               <w:rPr>
                 <w:sz w:val="19"/>
               </w:rPr>
-              <w:t>Report file names start with the run's name, so downloads from different runs stay separate.</w:t>
+              <w:t>Crossed-out text (for example an old sale price) is kept and marked with ~~ instead of reading as a current price.</w:t>
             </w:r>
           </w:p>
         </w:tc>
@@ -3613,7 +3621,7 @@
               <w:rPr>
                 <w:sz w:val="19"/>
               </w:rPr>
-              <w:t>Analyst web app for reviewing runs in a browser. Optional grouping of pages by design template, so shared files are fetched once per group.</w:t>
+              <w:t>Report file names start with the run's name, so downloads from different runs stay separate.</w:t>
             </w:r>
           </w:p>
         </w:tc>
@@ -3659,7 +3667,7 @@
               <w:rPr>
                 <w:sz w:val="19"/>
               </w:rPr>
-              <w:t>Image and scanned-text reading switched on (Tesseract with 25 languages, found automatically). The visual-text check was tuned on the live John Hancock site so ordinary reading errors and cookie banners no longer cause false alarms. Images and PDFs no longer wait for a browser exploration they cannot have. Automated quality pipeline (CI) added. Live re-run: 3 of 34 verified, with the stricter checks finding real missing text.</w:t>
+              <w:t>Analyst web app for reviewing runs in a browser. Optional grouping of pages by design template, so shared files are fetched once per group.</w:t>
             </w:r>
           </w:p>
         </w:tc>
@@ -3703,7 +3711,7 @@
               <w:rPr>
                 <w:sz w:val="19"/>
               </w:rPr>
-              <w:t>Six safety and accuracy fixes (failed image reading no longer reported as verified; compressed pages decoded correctly; paused websites resume; paid access always needs approval; connections locked to the checked address; contradiction report no longer confuses dated snapshots or different products). Critical-fact check (R9) added. Tesseract OCR installed with 25 languages.</w:t>
+              <w:t>Image and scanned-text reading switched on (Tesseract with 25 languages, found automatically). The visual-text check was tuned on the live John Hancock site so ordinary reading errors and cookie banners no longer cause false alarms. Images and PDFs no longer wait for a browser exploration they cannot have. Automated quality pipeline (CI) added. Live re-run: 3 of 34 verified, with the stricter checks finding real missing text.</w:t>
             </w:r>
           </w:p>
         </w:tc>
@@ -3727,7 +3735,7 @@
               <w:rPr>
                 <w:sz w:val="19"/>
               </w:rPr>
-              <w:t>2026-10-19</w:t>
+              <w:t>2026-10-20</w:t>
             </w:r>
           </w:p>
         </w:tc>
@@ -3749,7 +3757,7 @@
               <w:rPr>
                 <w:sz w:val="19"/>
               </w:rPr>
-              <w:t>Browser exploration reaches 32 of 34 verified on John Hancock. Checks R6–R8 and R11–R13, page settling and evidence integrity added. Contradiction report (R4), paywall detection, run budgets, robots crawl-delay saved, stuck tasks reported. Office documents (Word, Excel, PowerPoint) supported. 222-case test inventory.</w:t>
+              <w:t>Six safety and accuracy fixes (failed image reading no longer reported as verified; compressed pages decoded correctly; paused websites resume; paid access always needs approval; connections locked to the checked address; contradiction report no longer confuses dated snapshots or different products). Critical-fact check (R9) added. Tesseract OCR installed with 25 languages.</w:t>
             </w:r>
           </w:p>
         </w:tc>
@@ -3772,7 +3780,7 @@
               <w:rPr>
                 <w:sz w:val="19"/>
               </w:rPr>
-              <w:t>2026-10-16</w:t>
+              <w:t>2026-10-19</w:t>
             </w:r>
           </w:p>
         </w:tc>
@@ -3793,7 +3801,7 @@
               <w:rPr>
                 <w:sz w:val="19"/>
               </w:rPr>
-              <w:t>Per-page verdicts with evidence, first checks (R1–R3, R10), reports (R1 content, review queue, overlap), offline explorer, run engine and command line.</w:t>
+              <w:t>Browser exploration reaches 32 of 34 verified on John Hancock. Checks R6–R8 and R11–R13, page settling and evidence integrity added. Contradiction report (R4), paywall detection, run budgets, robots crawl-delay saved, stuck tasks reported. Office documents (Word, Excel, PowerPoint) supported. 222-case test inventory.</w:t>
             </w:r>
           </w:p>
         </w:tc>
@@ -3817,7 +3825,7 @@
               <w:rPr>
                 <w:sz w:val="19"/>
               </w:rPr>
-              <w:t>2026-10-15</w:t>
+              <w:t>2026-10-16</w:t>
             </w:r>
           </w:p>
         </w:tc>
@@ -3825,6 +3833,50 @@
           <w:tcPr>
             <w:tcW w:type="dxa" w:w="4873"/>
             <w:shd w:val="clear" w:color="auto" w:fill="EEF2F7"/>
+          </w:tcPr>
+          <w:p>
+            <w:pPr>
+              <w:spacing w:after="40"/>
+            </w:pPr>
+            <w:r>
+              <w:rPr>
+                <w:sz w:val="19"/>
+              </w:rPr>
+            </w:r>
+            <w:r>
+              <w:rPr>
+                <w:sz w:val="19"/>
+              </w:rPr>
+              <w:t>Per-page verdicts with evidence, first checks (R1–R3, R10), reports (R1 content, review queue, overlap), offline explorer, run engine and command line.</w:t>
+            </w:r>
+          </w:p>
+        </w:tc>
+      </w:tr>
+      <w:tr>
+        <w:tc>
+          <w:tcPr>
+            <w:tcW w:type="dxa" w:w="4873"/>
+          </w:tcPr>
+          <w:p>
+            <w:pPr>
+              <w:spacing w:after="40"/>
+            </w:pPr>
+            <w:r>
+              <w:rPr>
+                <w:sz w:val="19"/>
+              </w:rPr>
+            </w:r>
+            <w:r>
+              <w:rPr>
+                <w:sz w:val="19"/>
+              </w:rPr>
+              <w:t>2026-10-15</w:t>
+            </w:r>
+          </w:p>
+        </w:tc>
+        <w:tc>
+          <w:tcPr>
+            <w:tcW w:type="dxa" w:w="4873"/>
           </w:tcPr>
           <w:p>
             <w:pPr>

</xml_diff>

<commit_message>
Scrolled table columns are on the page; failed renders retried over minutes
A column reached by scrolling an overflow auto/scroll box is not offscreen
(live John Hancock earnings tables lost their Total Net Assets column).
Render tasks get 4 attempts, retried after 30, 90 and 180 seconds.
Guide and lane log updated.

Co-Authored-By: Claude Opus 5.5 <noreply@anthropic.com>
</commit_message>
<xml_diff>
--- a/Content_Processor_Guide.docx
+++ b/Content_Processor_Guide.docx
@@ -17,7 +17,7 @@
           <w:color w:val="595959"/>
           <w:sz w:val="19"/>
         </w:rPr>
-        <w:t>Last updated: 22 October 2026 · Code version: main after paid access with approvals and spending limits, and the project report's completeness and confidence columns · Maintained by every session that adds a significant feature (see "Keeping this guide current" at the end)</w:t>
+        <w:t>Last updated: 26 October 2026 · Code version: main after the visible-text coverage check, matching pairs listed once, columns in sideways-scrolling tables and spaced-out browser retries · Maintained by every session that adds a significant feature (see "Keeping this guide current" at the end)</w:t>
       </w:r>
     </w:p>
     <w:p>
@@ -1048,6 +1048,11 @@
     </w:p>
     <w:p>
       <w:r>
+        <w:t>Site tools that are not content (sign-in menus, country pickers, search boxes, chat bubbles) are labelled as page furniture and left out of the main text. Words that sit side by side on screen as separate boxes (menu links, buttons, labels) are kept as separate words, never glued together. A wide table inside a box you scroll sideways is read in full: a column you reach by scrolling is on the page, not hidden.</w:t>
+      </w:r>
+    </w:p>
+    <w:p>
+      <w:r>
         <w:t>Crossed-out text is kept and marked. A sale price shown as a struck-out "$200" next to "$150" is recorded as "Price ~~$200~~ $150", so a reader can see which price is current; the contradiction report never treats the crossed-out price as something the page still claims.</w:t>
       </w:r>
     </w:p>
@@ -1102,6 +1107,11 @@
       </w:r>
     </w:p>
     <w:p>
+      <w:r>
+        <w:t>If the browser cannot open a page (for example it does not load within 30 seconds because the network or the website is slow), the engine tries again by itself: after 30 seconds, then 90 seconds, then 3 minutes, four tries in all. A slow spell usually lasts minutes, so tries a few seconds apart would all fail together. A page that still cannot be opened keeps the text read from its HTML and is marked "partly captured", never dropped.</w:t>
+      </w:r>
+    </w:p>
+    <w:p>
       <w:pPr>
         <w:pStyle w:val="Heading2"/>
       </w:pPr>
@@ -1344,7 +1354,7 @@
               <w:rPr>
                 <w:sz w:val="19"/>
               </w:rPr>
-              <w:t>Visual text (R6)</w:t>
+              <w:t>Visible-text coverage</w:t>
             </w:r>
           </w:p>
         </w:tc>
@@ -1366,7 +1376,7 @@
               <w:rPr>
                 <w:sz w:val="19"/>
               </w:rPr>
-              <w:t>Does every line of text visible on the screenshot appear in what was extracted?</w:t>
+              <w:t>Is every line of text the browser shows on the page also in what was extracted? If not, the page is marked "partly captured" and the missing lines are quoted.</w:t>
             </w:r>
           </w:p>
         </w:tc>
@@ -1389,7 +1399,7 @@
               <w:rPr>
                 <w:sz w:val="19"/>
               </w:rPr>
-              <w:t>Channel agreement (R7)</w:t>
+              <w:t>Visual text (R6)</w:t>
             </w:r>
           </w:p>
         </w:tc>
@@ -1410,7 +1420,7 @@
               <w:rPr>
                 <w:sz w:val="19"/>
               </w:rPr>
-              <w:t>Do the raw page and the browser agree? Is the text disguised with scrambled fonts?</w:t>
+              <w:t>Does every line of text visible on the screenshot appear in what was extracted?</w:t>
             </w:r>
           </w:p>
         </w:tc>
@@ -1434,7 +1444,7 @@
               <w:rPr>
                 <w:sz w:val="19"/>
               </w:rPr>
-              <w:t>PDF images (R8)</w:t>
+              <w:t>Channel agreement (R7)</w:t>
             </w:r>
           </w:p>
         </w:tc>
@@ -1456,7 +1466,7 @@
               <w:rPr>
                 <w:sz w:val="19"/>
               </w:rPr>
-              <w:t>Were images inside PDFs read, and does the OCR agree with the PDF's own text?</w:t>
+              <w:t>Do the raw page and the browser agree? Is the text disguised with scrambled fonts?</w:t>
             </w:r>
           </w:p>
         </w:tc>
@@ -1479,7 +1489,7 @@
               <w:rPr>
                 <w:sz w:val="19"/>
               </w:rPr>
-              <w:t>Critical facts (R9)</w:t>
+              <w:t>PDF images (R8)</w:t>
             </w:r>
           </w:p>
         </w:tc>
@@ -1500,7 +1510,7 @@
               <w:rPr>
                 <w:sz w:val="19"/>
               </w:rPr>
-              <w:t>Were numbers, prices, percentages, "not" and footnote marks preserved exactly?</w:t>
+              <w:t>Were images inside PDFs read, and does the OCR agree with the PDF's own text?</w:t>
             </w:r>
           </w:p>
         </w:tc>
@@ -1524,7 +1534,7 @@
               <w:rPr>
                 <w:sz w:val="19"/>
               </w:rPr>
-              <w:t>Payload sanity (R10)</w:t>
+              <w:t>Critical facts (R9)</w:t>
             </w:r>
           </w:p>
         </w:tc>
@@ -1546,7 +1556,7 @@
               <w:rPr>
                 <w:sz w:val="19"/>
               </w:rPr>
-              <w:t>Is this really the page, or a challenge page, disguised "not found" page, redirect to the homepage, cut-off download or wrong file type?</w:t>
+              <w:t>Were numbers, prices, percentages, "not" and footnote marks preserved exactly?</w:t>
             </w:r>
           </w:p>
         </w:tc>
@@ -1569,7 +1579,7 @@
               <w:rPr>
                 <w:sz w:val="19"/>
               </w:rPr>
-              <w:t>Degradation (R11)</w:t>
+              <w:t>Payload sanity (R10)</w:t>
             </w:r>
           </w:p>
         </w:tc>
@@ -1590,7 +1600,7 @@
               <w:rPr>
                 <w:sz w:val="19"/>
               </w:rPr>
-              <w:t>Is this page suspiciously thinner than the site's other pages (a sign of hidden blocking)?</w:t>
+              <w:t>Is this really the page, or a challenge page, disguised "not found" page, redirect to the homepage, cut-off download or wrong file type?</w:t>
             </w:r>
           </w:p>
         </w:tc>
@@ -1614,7 +1624,7 @@
               <w:rPr>
                 <w:sz w:val="19"/>
               </w:rPr>
-              <w:t>Limits (R12)</w:t>
+              <w:t>Degradation (R11)</w:t>
             </w:r>
           </w:p>
         </w:tc>
@@ -1636,7 +1646,7 @@
               <w:rPr>
                 <w:sz w:val="19"/>
               </w:rPr>
-              <w:t>Did exploring the page run out of its allowed time or actions?</w:t>
+              <w:t>Is this page suspiciously thinner than the site's other pages (a sign of hidden blocking)?</w:t>
             </w:r>
           </w:p>
         </w:tc>
@@ -1659,7 +1669,7 @@
               <w:rPr>
                 <w:sz w:val="19"/>
               </w:rPr>
-              <w:t>Hygiene (R13)</w:t>
+              <w:t>Limits (R12)</w:t>
             </w:r>
           </w:p>
         </w:tc>
@@ -1680,7 +1690,7 @@
               <w:rPr>
                 <w:sz w:val="19"/>
               </w:rPr>
-              <w:t>Did icon codes or chat-widget text leak into the main content?</w:t>
+              <w:t>Did exploring the page run out of its allowed time or actions?</w:t>
             </w:r>
           </w:p>
         </w:tc>
@@ -1704,7 +1714,7 @@
               <w:rPr>
                 <w:sz w:val="19"/>
               </w:rPr>
-              <w:t>Settling</w:t>
+              <w:t>Hygiene (R13)</w:t>
             </w:r>
           </w:p>
         </w:tc>
@@ -1726,7 +1736,7 @@
               <w:rPr>
                 <w:sz w:val="19"/>
               </w:rPr>
-              <w:t>Did the page ever stop changing (live tickers and rotating content are flagged)?</w:t>
+              <w:t>Did icon codes or chat-widget text leak into the main content?</w:t>
             </w:r>
           </w:p>
         </w:tc>
@@ -1749,13 +1759,59 @@
               <w:rPr>
                 <w:sz w:val="19"/>
               </w:rPr>
-              <w:t>Evidence integrity</w:t>
+              <w:t>Settling</w:t>
             </w:r>
           </w:p>
         </w:tc>
         <w:tc>
           <w:tcPr>
             <w:tcW w:type="dxa" w:w="4873"/>
+          </w:tcPr>
+          <w:p>
+            <w:pPr>
+              <w:spacing w:after="40"/>
+            </w:pPr>
+            <w:r>
+              <w:rPr>
+                <w:sz w:val="19"/>
+              </w:rPr>
+            </w:r>
+            <w:r>
+              <w:rPr>
+                <w:sz w:val="19"/>
+              </w:rPr>
+              <w:t>Did the page ever stop changing (live tickers and rotating content are flagged)?</w:t>
+            </w:r>
+          </w:p>
+        </w:tc>
+      </w:tr>
+      <w:tr>
+        <w:tc>
+          <w:tcPr>
+            <w:tcW w:type="dxa" w:w="4873"/>
+            <w:shd w:val="clear" w:color="auto" w:fill="EEF2F7"/>
+          </w:tcPr>
+          <w:p>
+            <w:pPr>
+              <w:spacing w:after="40"/>
+            </w:pPr>
+            <w:r>
+              <w:rPr>
+                <w:sz w:val="19"/>
+              </w:rPr>
+            </w:r>
+            <w:r>
+              <w:rPr>
+                <w:sz w:val="19"/>
+              </w:rPr>
+              <w:t>Evidence integrity</w:t>
+            </w:r>
+          </w:p>
+        </w:tc>
+        <w:tc>
+          <w:tcPr>
+            <w:tcW w:type="dxa" w:w="4873"/>
+            <w:shd w:val="clear" w:color="auto" w:fill="EEF2F7"/>
           </w:tcPr>
           <w:p>
             <w:pPr>
@@ -1911,7 +1967,7 @@
               <w:rPr>
                 <w:sz w:val="19"/>
               </w:rPr>
-              <w:t>The one workbook most people need. Sheet "Pages": every address with its whole text (line breaks shown), whether it was fully extracted (Yes/No), a plain "Extraction completeness" statement ("Complete", "Incomplete: 1 tab not opened (Pricing)", "Complete, but the page kept changing", "Placeholder page (Lorem ipsum)"), an overall Confidence of High, Medium or Low that can only be High when the page is fully captured, the share of the captured text confirmed against the live page, how reliably it was read (text from the page's code is 100%, text read from images lower), and what is missing. Sheet "Matching content": for every address, the other addresses that carry the same text and what share of it, one row each, by exact word-for-word matching (menus, headers and footers left out). The share is one-directional: a short page can be 100% inside a long page while the long page is only 20% inside the short one. Sheet "How to read" explains every column.</w:t>
+              <w:t>The one workbook most people need. Sheet "Pages": every address with its whole text (line breaks shown), whether it was fully extracted (Yes/No), a plain "Extraction completeness" statement ("Complete", "Incomplete: 1 tab not opened (Pricing)", "Complete, but the page kept changing", "Placeholder page (Lorem ipsum)"), an overall Confidence of High, Medium or Low that can only be High when the page is fully captured, the share of the captured text confirmed against the live page, how reliably it was read (text from the page's code is 100%, text read from images lower), and what is missing. Sheet "Matching content": every pair of addresses that carry the same text, listed once (A with B is never repeated as B with A), by exact word-for-word matching (menus, headers and footers left out), with two percentages: how much of the first page's text is on the second, and how much of the second's is on the first. They differ when the pages differ in length: a short page can be 100% inside a long page while the long page is only 20% inside the short one. To see every match of one page, look for it in both address columns. Very long page text that does not fit in one Excel cell continues in extra "Content_part_2", "Content_part_3" columns; "Content_parts" says how many cells the text uses and "Content_split" says whether it was split (normally 1 and FALSE). Sheet "How to read" explains every column.</w:t>
             </w:r>
           </w:p>
         </w:tc>
@@ -2308,7 +2364,7 @@
               <w:rPr>
                 <w:sz w:val="19"/>
               </w:rPr>
-              <w:t>Live John Hancock website, 34 pages (21 October 2026)</w:t>
+              <w:t>Live John Hancock website, 303 pages (26 October 2026)</w:t>
             </w:r>
           </w:p>
         </w:tc>
@@ -2329,7 +2385,7 @@
               <w:rPr>
                 <w:sz w:val="19"/>
               </w:rPr>
-              <w:t>32 of 34 pages VERIFIED_WITHIN_SCOPE at $0 with every check switched on (stricter than on 19 October: text reading, missing-text and leak checks). The other 2 are correctly flagged NEEDS_REVIEW: their live content is "Lorem ipsum" placeholder text. Reached by opening FAQ sections built as web components, matching text the way the browser shows it, and not letting a brief network hiccup pause the whole site.</w:t>
+              <w:t>279 of 303 VERIFIED_WITHIN_SCOPE at $0, run in 13 batches with unfinished pages re-run automatically. Of the rest: 15 earnings pages missed the last column of a sideways-scrolling table (found by the new coverage check, fixed the same day), 3 pages did not open in the browser during a slow spell (now retried automatically over several minutes), 4 were flagged because cookie-banner and chat-bubble text read from the screenshot was not part of the page's content, and 2 are placeholder pages.</w:t>
             </w:r>
           </w:p>
         </w:tc>
@@ -2353,7 +2409,7 @@
               <w:rPr>
                 <w:sz w:val="19"/>
               </w:rPr>
-              <w:t>Live John Hancock website, 34 pages (19 October 2026)</w:t>
+              <w:t>Live John Hancock website, 34 pages (21 October 2026)</w:t>
             </w:r>
           </w:p>
         </w:tc>
@@ -2375,7 +2431,7 @@
               <w:rPr>
                 <w:sz w:val="19"/>
               </w:rPr>
-              <w:t>32 of 34 pages VERIFIED_WITHIN_SCOPE at $0 with the checks available that day. The other 2 correctly flagged NEEDS_REVIEW because the live pages contain "Lorem ipsum" placeholder text. Before the browser-exploration work, all 34 were PARTIAL.</w:t>
+              <w:t>32 of 34 pages VERIFIED_WITHIN_SCOPE at $0 with every check switched on (stricter than on 19 October: text reading, missing-text and leak checks). The other 2 are correctly flagged NEEDS_REVIEW: their live content is "Lorem ipsum" placeholder text. Reached by opening FAQ sections built as web components, matching text the way the browser shows it, and not letting a brief network hiccup pause the whole site.</w:t>
             </w:r>
           </w:p>
         </w:tc>
@@ -2398,7 +2454,7 @@
               <w:rPr>
                 <w:sz w:val="19"/>
               </w:rPr>
-              <w:t>Same website, re-run with the stricter checks and OCR (20 October 2026)</w:t>
+              <w:t>Live John Hancock website, 34 pages (19 October 2026)</w:t>
             </w:r>
           </w:p>
         </w:tc>
@@ -2419,7 +2475,7 @@
               <w:rPr>
                 <w:sz w:val="19"/>
               </w:rPr>
-              <w:t>3 of 34 VERIFIED. This is the more honest number: the new channel-agreement check found text that exists in the page code but was not captured from the browser on 21 pages (frequently-asked-question answers on the form pages, half of one press release), so those pages were less complete than the earlier run suggested. On 8 pages a text-joining fault introduced on 20 October glues words together; it is being fixed. 2 pages still contain placeholder text.</w:t>
+              <w:t>32 of 34 pages VERIFIED_WITHIN_SCOPE at $0 with the checks available that day. The other 2 correctly flagged NEEDS_REVIEW because the live pages contain "Lorem ipsum" placeholder text. Before the browser-exploration work, all 34 were PARTIAL.</w:t>
             </w:r>
           </w:p>
         </w:tc>
@@ -2443,7 +2499,7 @@
               <w:rPr>
                 <w:sz w:val="19"/>
               </w:rPr>
-              <w:t>Adversarial test suite (28 trick pages)</w:t>
+              <w:t>Same website, re-run with the stricter checks and OCR (20 October 2026)</w:t>
             </w:r>
           </w:p>
         </w:tc>
@@ -2465,7 +2521,7 @@
               <w:rPr>
                 <w:sz w:val="19"/>
               </w:rPr>
-              <w:t>Zero pages wrongly marked VERIFIED. Each trick (fake PDFs, challenge pages, form walls, paywalls, disguised fonts, soft redirects) gets the expected verdict.</w:t>
+              <w:t>3 of 34 VERIFIED. This is the more honest number: the new channel-agreement check found text that exists in the page code but was not captured from the browser on 21 pages (frequently-asked-question answers on the form pages, half of one press release), so those pages were less complete than the earlier run suggested. On 8 pages a text-joining fault introduced on 20 October glues words together; it is being fixed. 2 pages still contain placeholder text.</w:t>
             </w:r>
           </w:p>
         </w:tc>
@@ -2488,7 +2544,7 @@
               <w:rPr>
                 <w:sz w:val="19"/>
               </w:rPr>
-              <w:t>Automated tests</w:t>
+              <w:t>Adversarial test suite (28 trick pages)</w:t>
             </w:r>
           </w:p>
         </w:tc>
@@ -2509,7 +2565,7 @@
               <w:rPr>
                 <w:sz w:val="19"/>
               </w:rPr>
-              <w:t>771 tests passing, 93.7% of the code exercised by tests. A CI pipeline runs all quality checks and the release gate on every change once the code is on GitHub.</w:t>
+              <w:t>Zero pages wrongly marked VERIFIED. Each trick (fake PDFs, challenge pages, form walls, paywalls, disguised fonts, soft redirects) gets the expected verdict.</w:t>
             </w:r>
           </w:p>
         </w:tc>
@@ -2533,7 +2589,7 @@
               <w:rPr>
                 <w:sz w:val="19"/>
               </w:rPr>
-              <w:t>Contradiction report on John Hancock</w:t>
+              <w:t>Automated tests</w:t>
             </w:r>
           </w:p>
         </w:tc>
@@ -2541,6 +2597,50 @@
           <w:tcPr>
             <w:tcW w:type="dxa" w:w="4873"/>
             <w:shd w:val="clear" w:color="auto" w:fill="EEF2F7"/>
+          </w:tcPr>
+          <w:p>
+            <w:pPr>
+              <w:spacing w:after="40"/>
+            </w:pPr>
+            <w:r>
+              <w:rPr>
+                <w:sz w:val="19"/>
+              </w:rPr>
+            </w:r>
+            <w:r>
+              <w:rPr>
+                <w:sz w:val="19"/>
+              </w:rPr>
+              <w:t>771 tests passing, 93.7% of the code exercised by tests. A CI pipeline runs all quality checks and the release gate on every change once the code is on GitHub.</w:t>
+            </w:r>
+          </w:p>
+        </w:tc>
+      </w:tr>
+      <w:tr>
+        <w:tc>
+          <w:tcPr>
+            <w:tcW w:type="dxa" w:w="4873"/>
+          </w:tcPr>
+          <w:p>
+            <w:pPr>
+              <w:spacing w:after="40"/>
+            </w:pPr>
+            <w:r>
+              <w:rPr>
+                <w:sz w:val="19"/>
+              </w:rPr>
+            </w:r>
+            <w:r>
+              <w:rPr>
+                <w:sz w:val="19"/>
+              </w:rPr>
+              <w:t>Contradiction report on John Hancock</w:t>
+            </w:r>
+          </w:p>
+        </w:tc>
+        <w:tc>
+          <w:tcPr>
+            <w:tcW w:type="dxa" w:w="4873"/>
           </w:tcPr>
           <w:p>
             <w:pPr>
@@ -3330,7 +3430,7 @@
               <w:rPr>
                 <w:sz w:val="19"/>
               </w:rPr>
-              <w:t>2026-10-22</w:t>
+              <w:t>2026-10-26</w:t>
             </w:r>
           </w:p>
         </w:tc>
@@ -3351,7 +3451,7 @@
               <w:rPr>
                 <w:sz w:val="19"/>
               </w:rPr>
-              <w:t>Paid access (Bright Data) built but off by default: one approval per website with a spending cap, checked before every paid request, with a spending log.</w:t>
+              <w:t>Columns of wide tables that you scroll sideways are captured (they were wrongly treated as hidden). A page the browser cannot open is retried by itself over about five minutes instead of a few seconds. Live John Hancock, 303 pages: 279 verified.</w:t>
             </w:r>
           </w:p>
         </w:tc>
@@ -3375,7 +3475,7 @@
               <w:rPr>
                 <w:sz w:val="19"/>
               </w:rPr>
-              <w:t>2026-10-21</w:t>
+              <w:t>2026-10-26</w:t>
             </w:r>
           </w:p>
         </w:tc>
@@ -3397,7 +3497,7 @@
               <w:rPr>
                 <w:sz w:val="19"/>
               </w:rPr>
-              <w:t>Reviewers save decisions in the web app (with name, time and full history); the next report carries them forward.</w:t>
+              <w:t>Project report: each pair of matching pages is listed once, with the shared share in both directions.</w:t>
             </w:r>
           </w:p>
         </w:tc>
@@ -3420,7 +3520,7 @@
               <w:rPr>
                 <w:sz w:val="19"/>
               </w:rPr>
-              <w:t>2026-10-21</w:t>
+              <w:t>2026-10-24</w:t>
             </w:r>
           </w:p>
         </w:tc>
@@ -3441,7 +3541,7 @@
               <w:rPr>
                 <w:sz w:val="19"/>
               </w:rPr>
-              <w:t>Live John Hancock: 32 of 34 verified again with all checks on (the 2 others are placeholder pages). FAQ sections built as web components are now opened, text is matched the way the browser shows it, and a brief network hiccup no longer pauses a whole website.</w:t>
+              <w:t>New check that every line of text the browser shows was extracted. Web components no longer mistaken for hidden text; a duplicate copy of text never replaces the visible one; site tools (sign-in, country picker, chat) kept out of the content; words in side-by-side boxes no longer glued; a page is judged settled by its text, not by background elements.</w:t>
             </w:r>
           </w:p>
         </w:tc>
@@ -3487,7 +3587,7 @@
               <w:rPr>
                 <w:sz w:val="19"/>
               </w:rPr>
-              <w:t>Project report made unambiguous: an extraction-completeness statement and a High/Medium/Low confidence per page that always agree with the page's status; the confirmed share is named for what it measures; page text keeps its line breaks in Excel.</w:t>
+              <w:t>Paid access (Bright Data) built but off by default: one approval per website with a spending cap, checked before every paid request, with a spending log.</w:t>
             </w:r>
           </w:p>
         </w:tc>
@@ -3531,7 +3631,7 @@
               <w:rPr>
                 <w:sz w:val="19"/>
               </w:rPr>
-              <w:t>Project report: one Excel workbook per run with every page's text, whether it was fully extracted, the confirmed share and the confidence, plus, for every page, which other pages carry the same text and how much (exact matching).</w:t>
+              <w:t>Reviewers save decisions in the web app (with name, time and full history); the next report carries them forward.</w:t>
             </w:r>
           </w:p>
         </w:tc>
@@ -3577,7 +3677,7 @@
               <w:rPr>
                 <w:sz w:val="19"/>
               </w:rPr>
-              <w:t>Evidence stored compactly: repeated fonts and style sheets kept once, the rest compressed, originals unchanged. About 18 times less disk on the live John Hancock run; a 5,000-page run now fits the 20 GB budget. Older evidence can be converted with one command.</w:t>
+              <w:t>Live John Hancock: 32 of 34 verified again with all checks on (the 2 others are placeholder pages). FAQ sections built as web components are now opened, text is matched the way the browser shows it, and a brief network hiccup no longer pauses a whole website.</w:t>
             </w:r>
           </w:p>
         </w:tc>
@@ -3600,7 +3700,7 @@
               <w:rPr>
                 <w:sz w:val="19"/>
               </w:rPr>
-              <w:t>2026-10-21</w:t>
+              <w:t>2026-10-22</w:t>
             </w:r>
           </w:p>
         </w:tc>
@@ -3621,7 +3721,7 @@
               <w:rPr>
                 <w:sz w:val="19"/>
               </w:rPr>
-              <w:t>Crossed-out text (for example an old sale price) is kept and marked with ~~ instead of reading as a current price.</w:t>
+              <w:t>Project report made unambiguous: an extraction-completeness statement and a High/Medium/Low confidence per page that always agree with the page's status; the confirmed share is named for what it measures; page text keeps its line breaks in Excel.</w:t>
             </w:r>
           </w:p>
         </w:tc>
@@ -3645,7 +3745,7 @@
               <w:rPr>
                 <w:sz w:val="19"/>
               </w:rPr>
-              <w:t>2026-10-20</w:t>
+              <w:t>2026-10-21</w:t>
             </w:r>
           </w:p>
         </w:tc>
@@ -3667,7 +3767,7 @@
               <w:rPr>
                 <w:sz w:val="19"/>
               </w:rPr>
-              <w:t>Report file names start with the run's name, so downloads from different runs stay separate.</w:t>
+              <w:t>Project report: one Excel workbook per run with every page's text, whether it was fully extracted, the confirmed share and the confidence, plus, for every page, which other pages carry the same text and how much (exact matching).</w:t>
             </w:r>
           </w:p>
         </w:tc>
@@ -3690,7 +3790,7 @@
               <w:rPr>
                 <w:sz w:val="19"/>
               </w:rPr>
-              <w:t>2026-10-20</w:t>
+              <w:t>2026-10-21</w:t>
             </w:r>
           </w:p>
         </w:tc>
@@ -3711,7 +3811,7 @@
               <w:rPr>
                 <w:sz w:val="19"/>
               </w:rPr>
-              <w:t>Analyst web app for reviewing runs in a browser. Optional grouping of pages by design template, so shared files are fetched once per group.</w:t>
+              <w:t>Evidence stored compactly: repeated fonts and style sheets kept once, the rest compressed, originals unchanged. About 18 times less disk on the live John Hancock run; a 5,000-page run now fits the 20 GB budget. Older evidence can be converted with one command.</w:t>
             </w:r>
           </w:p>
         </w:tc>
@@ -3735,7 +3835,7 @@
               <w:rPr>
                 <w:sz w:val="19"/>
               </w:rPr>
-              <w:t>2026-10-20</w:t>
+              <w:t>2026-10-21</w:t>
             </w:r>
           </w:p>
         </w:tc>
@@ -3757,7 +3857,7 @@
               <w:rPr>
                 <w:sz w:val="19"/>
               </w:rPr>
-              <w:t>Image and scanned-text reading switched on (Tesseract with 25 languages, found automatically). The visual-text check was tuned on the live John Hancock site so ordinary reading errors and cookie banners no longer cause false alarms. Images and PDFs no longer wait for a browser exploration they cannot have. Automated quality pipeline (CI) added. Live re-run: 3 of 34 verified, with the stricter checks finding real missing text.</w:t>
+              <w:t>Crossed-out text (for example an old sale price) is kept and marked with ~~ instead of reading as a current price.</w:t>
             </w:r>
           </w:p>
         </w:tc>
@@ -3801,7 +3901,7 @@
               <w:rPr>
                 <w:sz w:val="19"/>
               </w:rPr>
-              <w:t>Six safety and accuracy fixes (failed image reading no longer reported as verified; compressed pages decoded correctly; paused websites resume; paid access always needs approval; connections locked to the checked address; contradiction report no longer confuses dated snapshots or different products). Critical-fact check (R9) added. Tesseract OCR installed with 25 languages.</w:t>
+              <w:t>Report file names start with the run's name, so downloads from different runs stay separate.</w:t>
             </w:r>
           </w:p>
         </w:tc>
@@ -3825,7 +3925,7 @@
               <w:rPr>
                 <w:sz w:val="19"/>
               </w:rPr>
-              <w:t>2026-10-19</w:t>
+              <w:t>2026-10-20</w:t>
             </w:r>
           </w:p>
         </w:tc>
@@ -3847,7 +3947,7 @@
               <w:rPr>
                 <w:sz w:val="19"/>
               </w:rPr>
-              <w:t>Browser exploration reaches 32 of 34 verified on John Hancock. Checks R6–R8 and R11–R13, page settling and evidence integrity added. Contradiction report (R4), paywall detection, run budgets, robots crawl-delay saved, stuck tasks reported. Office documents (Word, Excel, PowerPoint) supported. 222-case test inventory.</w:t>
+              <w:t>Analyst web app for reviewing runs in a browser. Optional grouping of pages by design template, so shared files are fetched once per group.</w:t>
             </w:r>
           </w:p>
         </w:tc>
@@ -3870,7 +3970,7 @@
               <w:rPr>
                 <w:sz w:val="19"/>
               </w:rPr>
-              <w:t>2026-10-16</w:t>
+              <w:t>2026-10-20</w:t>
             </w:r>
           </w:p>
         </w:tc>
@@ -3891,7 +3991,7 @@
               <w:rPr>
                 <w:sz w:val="19"/>
               </w:rPr>
-              <w:t>Per-page verdicts with evidence, first checks (R1–R3, R10), reports (R1 content, review queue, overlap), offline explorer, run engine and command line.</w:t>
+              <w:t>Image and scanned-text reading switched on (Tesseract with 25 languages, found automatically). The visual-text check was tuned on the live John Hancock site so ordinary reading errors and cookie banners no longer cause false alarms. Images and PDFs no longer wait for a browser exploration they cannot have. Automated quality pipeline (CI) added. Live re-run: 3 of 34 verified, with the stricter checks finding real missing text.</w:t>
             </w:r>
           </w:p>
         </w:tc>
@@ -3915,7 +4015,7 @@
               <w:rPr>
                 <w:sz w:val="19"/>
               </w:rPr>
-              <w:t>2026-10-15</w:t>
+              <w:t>2026-10-20</w:t>
             </w:r>
           </w:p>
         </w:tc>
@@ -3923,6 +4023,140 @@
           <w:tcPr>
             <w:tcW w:type="dxa" w:w="4873"/>
             <w:shd w:val="clear" w:color="auto" w:fill="EEF2F7"/>
+          </w:tcPr>
+          <w:p>
+            <w:pPr>
+              <w:spacing w:after="40"/>
+            </w:pPr>
+            <w:r>
+              <w:rPr>
+                <w:sz w:val="19"/>
+              </w:rPr>
+            </w:r>
+            <w:r>
+              <w:rPr>
+                <w:sz w:val="19"/>
+              </w:rPr>
+              <w:t>Six safety and accuracy fixes (failed image reading no longer reported as verified; compressed pages decoded correctly; paused websites resume; paid access always needs approval; connections locked to the checked address; contradiction report no longer confuses dated snapshots or different products). Critical-fact check (R9) added. Tesseract OCR installed with 25 languages.</w:t>
+            </w:r>
+          </w:p>
+        </w:tc>
+      </w:tr>
+      <w:tr>
+        <w:tc>
+          <w:tcPr>
+            <w:tcW w:type="dxa" w:w="4873"/>
+          </w:tcPr>
+          <w:p>
+            <w:pPr>
+              <w:spacing w:after="40"/>
+            </w:pPr>
+            <w:r>
+              <w:rPr>
+                <w:sz w:val="19"/>
+              </w:rPr>
+            </w:r>
+            <w:r>
+              <w:rPr>
+                <w:sz w:val="19"/>
+              </w:rPr>
+              <w:t>2026-10-19</w:t>
+            </w:r>
+          </w:p>
+        </w:tc>
+        <w:tc>
+          <w:tcPr>
+            <w:tcW w:type="dxa" w:w="4873"/>
+          </w:tcPr>
+          <w:p>
+            <w:pPr>
+              <w:spacing w:after="40"/>
+            </w:pPr>
+            <w:r>
+              <w:rPr>
+                <w:sz w:val="19"/>
+              </w:rPr>
+            </w:r>
+            <w:r>
+              <w:rPr>
+                <w:sz w:val="19"/>
+              </w:rPr>
+              <w:t>Browser exploration reaches 32 of 34 verified on John Hancock. Checks R6–R8 and R11–R13, page settling and evidence integrity added. Contradiction report (R4), paywall detection, run budgets, robots crawl-delay saved, stuck tasks reported. Office documents (Word, Excel, PowerPoint) supported. 222-case test inventory.</w:t>
+            </w:r>
+          </w:p>
+        </w:tc>
+      </w:tr>
+      <w:tr>
+        <w:tc>
+          <w:tcPr>
+            <w:tcW w:type="dxa" w:w="4873"/>
+            <w:shd w:val="clear" w:color="auto" w:fill="EEF2F7"/>
+          </w:tcPr>
+          <w:p>
+            <w:pPr>
+              <w:spacing w:after="40"/>
+            </w:pPr>
+            <w:r>
+              <w:rPr>
+                <w:sz w:val="19"/>
+              </w:rPr>
+            </w:r>
+            <w:r>
+              <w:rPr>
+                <w:sz w:val="19"/>
+              </w:rPr>
+              <w:t>2026-10-16</w:t>
+            </w:r>
+          </w:p>
+        </w:tc>
+        <w:tc>
+          <w:tcPr>
+            <w:tcW w:type="dxa" w:w="4873"/>
+            <w:shd w:val="clear" w:color="auto" w:fill="EEF2F7"/>
+          </w:tcPr>
+          <w:p>
+            <w:pPr>
+              <w:spacing w:after="40"/>
+            </w:pPr>
+            <w:r>
+              <w:rPr>
+                <w:sz w:val="19"/>
+              </w:rPr>
+            </w:r>
+            <w:r>
+              <w:rPr>
+                <w:sz w:val="19"/>
+              </w:rPr>
+              <w:t>Per-page verdicts with evidence, first checks (R1–R3, R10), reports (R1 content, review queue, overlap), offline explorer, run engine and command line.</w:t>
+            </w:r>
+          </w:p>
+        </w:tc>
+      </w:tr>
+      <w:tr>
+        <w:tc>
+          <w:tcPr>
+            <w:tcW w:type="dxa" w:w="4873"/>
+          </w:tcPr>
+          <w:p>
+            <w:pPr>
+              <w:spacing w:after="40"/>
+            </w:pPr>
+            <w:r>
+              <w:rPr>
+                <w:sz w:val="19"/>
+              </w:rPr>
+            </w:r>
+            <w:r>
+              <w:rPr>
+                <w:sz w:val="19"/>
+              </w:rPr>
+              <w:t>2026-10-15</w:t>
+            </w:r>
+          </w:p>
+        </w:tc>
+        <w:tc>
+          <w:tcPr>
+            <w:tcW w:type="dxa" w:w="4873"/>
           </w:tcPr>
           <w:p>
             <w:pPr>

</xml_diff>

<commit_message>
Content-type section: catalogue, Office type detection, read-only API, web page; guide updated
Co-Authored-By: Claude Haiku 5.5 <noreply@anthropic.com>
</commit_message>
<xml_diff>
--- a/Content_Processor_Guide.docx
+++ b/Content_Processor_Guide.docx
@@ -17,7 +17,7 @@
           <w:color w:val="595959"/>
           <w:sz w:val="19"/>
         </w:rPr>
-        <w:t>Last updated: 22 October 2026 · Code version: main after paid access with approvals and spending limits, and the project report's completeness and confidence columns · Maintained by every session that adds a significant feature (see "Keeping this guide current" at the end)</w:t>
+        <w:t>Last updated: 26 October 2026 · Code version: content-type section and Office type detection, on top of main after paid access with approvals and spending limits</w:t>
       </w:r>
     </w:p>
     <w:p>
@@ -2159,6 +2159,20 @@
     </w:p>
     <w:p>
       <w:r>
+        <w:t xml:space="preserve">A </w:t>
+      </w:r>
+      <w:r>
+        <w:rPr>
+          <w:b/>
+        </w:rPr>
+        <w:t>content types</w:t>
+      </w:r>
+      <w:r>
+        <w:t xml:space="preserve"> section lets you choose which kinds of files a crawl should look for: web pages (always read, because that is how links to files are found), PDF documents, images, Word, Excel and PowerPoint files, and, marked as not supported yet, older Office files, plain spreadsheet text files, zip archives, audio and video, and email files. Each choice shows whether the engine can read that kind of file today. Picking a type it cannot read yet is allowed, but the report then says those files were found and counted as excluded, with the reason. The section does not start a crawl: it produces the filter and the command for you to run in a terminal, so the web app stays read-only.</w:t>
+      </w:r>
+    </w:p>
+    <w:p>
+      <w:r>
         <w:t>Reviewers can record decisions directly in the app: for each possible contradiction (confirmed, not a contradiction, different context) and for each page that needs review (for example "get the content by hand" or "leave out of the results", with a note). You enter your name once; every decision is saved with your name and the time, and every earlier answer is kept, so there is a full history. The next report for that run starts with these decisions already filled in, in the Excel files too.</w:t>
       </w:r>
     </w:p>
@@ -3330,7 +3344,7 @@
               <w:rPr>
                 <w:sz w:val="19"/>
               </w:rPr>
-              <w:t>2026-10-22</w:t>
+              <w:t>2026-10-26</w:t>
             </w:r>
           </w:p>
         </w:tc>
@@ -3351,7 +3365,7 @@
               <w:rPr>
                 <w:sz w:val="19"/>
               </w:rPr>
-              <w:t>Paid access (Bright Data) built but off by default: one approval per website with a spending cap, checked before every paid request, with a spending log.</w:t>
+              <w:t>Content-type section in the analyst app: choose which kinds of files to look for (PDF, images, Word, Excel, PowerPoint), with an honest mark on types the engine cannot read yet; it produces the filter and command for a crawl. Word, Excel and PowerPoint files are now recognised by their real type, not as generic zip archives, so selecting them works.</w:t>
             </w:r>
           </w:p>
         </w:tc>
@@ -3375,7 +3389,7 @@
               <w:rPr>
                 <w:sz w:val="19"/>
               </w:rPr>
-              <w:t>2026-10-21</w:t>
+              <w:t>2026-10-22</w:t>
             </w:r>
           </w:p>
         </w:tc>
@@ -3397,7 +3411,7 @@
               <w:rPr>
                 <w:sz w:val="19"/>
               </w:rPr>
-              <w:t>Reviewers save decisions in the web app (with name, time and full history); the next report carries them forward.</w:t>
+              <w:t>Paid access (Bright Data) built but off by default: one approval per website with a spending cap, checked before every paid request, with a spending log.</w:t>
             </w:r>
           </w:p>
         </w:tc>
@@ -3441,7 +3455,7 @@
               <w:rPr>
                 <w:sz w:val="19"/>
               </w:rPr>
-              <w:t>Live John Hancock: 32 of 34 verified again with all checks on (the 2 others are placeholder pages). FAQ sections built as web components are now opened, text is matched the way the browser shows it, and a brief network hiccup no longer pauses a whole website.</w:t>
+              <w:t>Reviewers save decisions in the web app (with name, time and full history); the next report carries them forward.</w:t>
             </w:r>
           </w:p>
         </w:tc>
@@ -3465,7 +3479,7 @@
               <w:rPr>
                 <w:sz w:val="19"/>
               </w:rPr>
-              <w:t>2026-10-22</w:t>
+              <w:t>2026-10-21</w:t>
             </w:r>
           </w:p>
         </w:tc>
@@ -3487,7 +3501,7 @@
               <w:rPr>
                 <w:sz w:val="19"/>
               </w:rPr>
-              <w:t>Project report made unambiguous: an extraction-completeness statement and a High/Medium/Low confidence per page that always agree with the page's status; the confirmed share is named for what it measures; page text keeps its line breaks in Excel.</w:t>
+              <w:t>Live John Hancock: 32 of 34 verified again with all checks on (the 2 others are placeholder pages). FAQ sections built as web components are now opened, text is matched the way the browser shows it, and a brief network hiccup no longer pauses a whole website.</w:t>
             </w:r>
           </w:p>
         </w:tc>
@@ -3510,7 +3524,7 @@
               <w:rPr>
                 <w:sz w:val="19"/>
               </w:rPr>
-              <w:t>2026-10-21</w:t>
+              <w:t>2026-10-22</w:t>
             </w:r>
           </w:p>
         </w:tc>
@@ -3531,7 +3545,7 @@
               <w:rPr>
                 <w:sz w:val="19"/>
               </w:rPr>
-              <w:t>Project report: one Excel workbook per run with every page's text, whether it was fully extracted, the confirmed share and the confidence, plus, for every page, which other pages carry the same text and how much (exact matching).</w:t>
+              <w:t>Project report made unambiguous: an extraction-completeness statement and a High/Medium/Low confidence per page that always agree with the page's status; the confirmed share is named for what it measures; page text keeps its line breaks in Excel.</w:t>
             </w:r>
           </w:p>
         </w:tc>
@@ -3577,7 +3591,7 @@
               <w:rPr>
                 <w:sz w:val="19"/>
               </w:rPr>
-              <w:t>Evidence stored compactly: repeated fonts and style sheets kept once, the rest compressed, originals unchanged. About 18 times less disk on the live John Hancock run; a 5,000-page run now fits the 20 GB budget. Older evidence can be converted with one command.</w:t>
+              <w:t>Project report: one Excel workbook per run with every page's text, whether it was fully extracted, the confirmed share and the confidence, plus, for every page, which other pages carry the same text and how much (exact matching).</w:t>
             </w:r>
           </w:p>
         </w:tc>
@@ -3621,7 +3635,7 @@
               <w:rPr>
                 <w:sz w:val="19"/>
               </w:rPr>
-              <w:t>Crossed-out text (for example an old sale price) is kept and marked with ~~ instead of reading as a current price.</w:t>
+              <w:t>Evidence stored compactly: repeated fonts and style sheets kept once, the rest compressed, originals unchanged. About 18 times less disk on the live John Hancock run; a 5,000-page run now fits the 20 GB budget. Older evidence can be converted with one command.</w:t>
             </w:r>
           </w:p>
         </w:tc>
@@ -3645,7 +3659,7 @@
               <w:rPr>
                 <w:sz w:val="19"/>
               </w:rPr>
-              <w:t>2026-10-20</w:t>
+              <w:t>2026-10-21</w:t>
             </w:r>
           </w:p>
         </w:tc>
@@ -3667,7 +3681,7 @@
               <w:rPr>
                 <w:sz w:val="19"/>
               </w:rPr>
-              <w:t>Report file names start with the run's name, so downloads from different runs stay separate.</w:t>
+              <w:t>Crossed-out text (for example an old sale price) is kept and marked with ~~ instead of reading as a current price.</w:t>
             </w:r>
           </w:p>
         </w:tc>
@@ -3711,7 +3725,7 @@
               <w:rPr>
                 <w:sz w:val="19"/>
               </w:rPr>
-              <w:t>Analyst web app for reviewing runs in a browser. Optional grouping of pages by design template, so shared files are fetched once per group.</w:t>
+              <w:t>Report file names start with the run's name, so downloads from different runs stay separate.</w:t>
             </w:r>
           </w:p>
         </w:tc>
@@ -3757,7 +3771,7 @@
               <w:rPr>
                 <w:sz w:val="19"/>
               </w:rPr>
-              <w:t>Image and scanned-text reading switched on (Tesseract with 25 languages, found automatically). The visual-text check was tuned on the live John Hancock site so ordinary reading errors and cookie banners no longer cause false alarms. Images and PDFs no longer wait for a browser exploration they cannot have. Automated quality pipeline (CI) added. Live re-run: 3 of 34 verified, with the stricter checks finding real missing text.</w:t>
+              <w:t>Analyst web app for reviewing runs in a browser. Optional grouping of pages by design template, so shared files are fetched once per group.</w:t>
             </w:r>
           </w:p>
         </w:tc>
@@ -3801,7 +3815,7 @@
               <w:rPr>
                 <w:sz w:val="19"/>
               </w:rPr>
-              <w:t>Six safety and accuracy fixes (failed image reading no longer reported as verified; compressed pages decoded correctly; paused websites resume; paid access always needs approval; connections locked to the checked address; contradiction report no longer confuses dated snapshots or different products). Critical-fact check (R9) added. Tesseract OCR installed with 25 languages.</w:t>
+              <w:t>Image and scanned-text reading switched on (Tesseract with 25 languages, found automatically). The visual-text check was tuned on the live John Hancock site so ordinary reading errors and cookie banners no longer cause false alarms. Images and PDFs no longer wait for a browser exploration they cannot have. Automated quality pipeline (CI) added. Live re-run: 3 of 34 verified, with the stricter checks finding real missing text.</w:t>
             </w:r>
           </w:p>
         </w:tc>
@@ -3825,7 +3839,7 @@
               <w:rPr>
                 <w:sz w:val="19"/>
               </w:rPr>
-              <w:t>2026-10-19</w:t>
+              <w:t>2026-10-20</w:t>
             </w:r>
           </w:p>
         </w:tc>
@@ -3847,7 +3861,7 @@
               <w:rPr>
                 <w:sz w:val="19"/>
               </w:rPr>
-              <w:t>Browser exploration reaches 32 of 34 verified on John Hancock. Checks R6–R8 and R11–R13, page settling and evidence integrity added. Contradiction report (R4), paywall detection, run budgets, robots crawl-delay saved, stuck tasks reported. Office documents (Word, Excel, PowerPoint) supported. 222-case test inventory.</w:t>
+              <w:t>Six safety and accuracy fixes (failed image reading no longer reported as verified; compressed pages decoded correctly; paused websites resume; paid access always needs approval; connections locked to the checked address; contradiction report no longer confuses dated snapshots or different products). Critical-fact check (R9) added. Tesseract OCR installed with 25 languages.</w:t>
             </w:r>
           </w:p>
         </w:tc>
@@ -3870,7 +3884,7 @@
               <w:rPr>
                 <w:sz w:val="19"/>
               </w:rPr>
-              <w:t>2026-10-16</w:t>
+              <w:t>2026-10-19</w:t>
             </w:r>
           </w:p>
         </w:tc>
@@ -3891,7 +3905,7 @@
               <w:rPr>
                 <w:sz w:val="19"/>
               </w:rPr>
-              <w:t>Per-page verdicts with evidence, first checks (R1–R3, R10), reports (R1 content, review queue, overlap), offline explorer, run engine and command line.</w:t>
+              <w:t>Browser exploration reaches 32 of 34 verified on John Hancock. Checks R6–R8 and R11–R13, page settling and evidence integrity added. Contradiction report (R4), paywall detection, run budgets, robots crawl-delay saved, stuck tasks reported. Office documents (Word, Excel, PowerPoint) supported. 222-case test inventory.</w:t>
             </w:r>
           </w:p>
         </w:tc>
@@ -3915,7 +3929,7 @@
               <w:rPr>
                 <w:sz w:val="19"/>
               </w:rPr>
-              <w:t>2026-10-15</w:t>
+              <w:t>2026-10-16</w:t>
             </w:r>
           </w:p>
         </w:tc>
@@ -3923,6 +3937,50 @@
           <w:tcPr>
             <w:tcW w:type="dxa" w:w="4873"/>
             <w:shd w:val="clear" w:color="auto" w:fill="EEF2F7"/>
+          </w:tcPr>
+          <w:p>
+            <w:pPr>
+              <w:spacing w:after="40"/>
+            </w:pPr>
+            <w:r>
+              <w:rPr>
+                <w:sz w:val="19"/>
+              </w:rPr>
+            </w:r>
+            <w:r>
+              <w:rPr>
+                <w:sz w:val="19"/>
+              </w:rPr>
+              <w:t>Per-page verdicts with evidence, first checks (R1–R3, R10), reports (R1 content, review queue, overlap), offline explorer, run engine and command line.</w:t>
+            </w:r>
+          </w:p>
+        </w:tc>
+      </w:tr>
+      <w:tr>
+        <w:tc>
+          <w:tcPr>
+            <w:tcW w:type="dxa" w:w="4873"/>
+          </w:tcPr>
+          <w:p>
+            <w:pPr>
+              <w:spacing w:after="40"/>
+            </w:pPr>
+            <w:r>
+              <w:rPr>
+                <w:sz w:val="19"/>
+              </w:rPr>
+            </w:r>
+            <w:r>
+              <w:rPr>
+                <w:sz w:val="19"/>
+              </w:rPr>
+              <w:t>2026-10-15</w:t>
+            </w:r>
+          </w:p>
+        </w:tc>
+        <w:tc>
+          <w:tcPr>
+            <w:tcW w:type="dxa" w:w="4873"/>
           </w:tcPr>
           <w:p>
             <w:pPr>

</xml_diff>

<commit_message>
Wait default covers render retries (360 s); R6 ignores chat-widget invitations; matching-sheet headers renamed
Co-Authored-By: Claude Haiku 5.5 <noreply@anthropic.com>
</commit_message>
<xml_diff>
--- a/Content_Processor_Guide.docx
+++ b/Content_Processor_Guide.docx
@@ -3451,7 +3451,7 @@
               <w:rPr>
                 <w:sz w:val="19"/>
               </w:rPr>
-              <w:t>Columns of wide tables that you scroll sideways are captured (they were wrongly treated as hidden). A page the browser cannot open is retried by itself over about five minutes instead of a few seconds. Live John Hancock, 303 pages: 279 verified.</w:t>
+              <w:t>Matching-content sheet columns renamed for clarity: "URL (A)", "Matching URL (B)", "% of A in B" and "% of B in A". Chat-widget invitations (for example "Live chat") are no longer treated as missed page content. Unattended runs wait up to six minutes for held work, so render retries (30, 90 and 180 seconds) finish before a run stops.</w:t>
             </w:r>
           </w:p>
         </w:tc>
@@ -3497,7 +3497,7 @@
               <w:rPr>
                 <w:sz w:val="19"/>
               </w:rPr>
-              <w:t>Project report: each pair of matching pages is listed once, with the shared share in both directions.</w:t>
+              <w:t>Columns of wide tables that you scroll sideways are captured (they were wrongly treated as hidden). A page the browser cannot open is retried by itself over about five minutes instead of a few seconds. Live John Hancock, 303 pages: 279 verified.</w:t>
             </w:r>
           </w:p>
         </w:tc>
@@ -3520,7 +3520,7 @@
               <w:rPr>
                 <w:sz w:val="19"/>
               </w:rPr>
-              <w:t>2026-10-24</w:t>
+              <w:t>2026-10-26</w:t>
             </w:r>
           </w:p>
         </w:tc>
@@ -3541,7 +3541,7 @@
               <w:rPr>
                 <w:sz w:val="19"/>
               </w:rPr>
-              <w:t>New check that every line of text the browser shows was extracted. Web components no longer mistaken for hidden text; a duplicate copy of text never replaces the visible one; site tools (sign-in, country picker, chat) kept out of the content; words in side-by-side boxes no longer glued; a page is judged settled by its text, not by background elements.</w:t>
+              <w:t>Project report: each pair of matching pages is listed once, with the shared share in both directions.</w:t>
             </w:r>
           </w:p>
         </w:tc>
@@ -3565,7 +3565,7 @@
               <w:rPr>
                 <w:sz w:val="19"/>
               </w:rPr>
-              <w:t>2026-10-22</w:t>
+              <w:t>2026-10-24</w:t>
             </w:r>
           </w:p>
         </w:tc>
@@ -3587,7 +3587,7 @@
               <w:rPr>
                 <w:sz w:val="19"/>
               </w:rPr>
-              <w:t>Paid access (Bright Data) built but off by default: one approval per website with a spending cap, checked before every paid request, with a spending log.</w:t>
+              <w:t>New check that every line of text the browser shows was extracted. Web components no longer mistaken for hidden text; a duplicate copy of text never replaces the visible one; site tools (sign-in, country picker, chat) kept out of the content; words in side-by-side boxes no longer glued; a page is judged settled by its text, not by background elements.</w:t>
             </w:r>
           </w:p>
         </w:tc>
@@ -3610,7 +3610,7 @@
               <w:rPr>
                 <w:sz w:val="19"/>
               </w:rPr>
-              <w:t>2026-10-21</w:t>
+              <w:t>2026-10-22</w:t>
             </w:r>
           </w:p>
         </w:tc>
@@ -3631,7 +3631,7 @@
               <w:rPr>
                 <w:sz w:val="19"/>
               </w:rPr>
-              <w:t>Reviewers save decisions in the web app (with name, time and full history); the next report carries them forward.</w:t>
+              <w:t>Paid access (Bright Data) built but off by default: one approval per website with a spending cap, checked before every paid request, with a spending log.</w:t>
             </w:r>
           </w:p>
         </w:tc>
@@ -3677,7 +3677,7 @@
               <w:rPr>
                 <w:sz w:val="19"/>
               </w:rPr>
-              <w:t>Live John Hancock: 32 of 34 verified again with all checks on (the 2 others are placeholder pages). FAQ sections built as web components are now opened, text is matched the way the browser shows it, and a brief network hiccup no longer pauses a whole website.</w:t>
+              <w:t>Reviewers save decisions in the web app (with name, time and full history); the next report carries them forward.</w:t>
             </w:r>
           </w:p>
         </w:tc>
@@ -3700,7 +3700,7 @@
               <w:rPr>
                 <w:sz w:val="19"/>
               </w:rPr>
-              <w:t>2026-10-22</w:t>
+              <w:t>2026-10-21</w:t>
             </w:r>
           </w:p>
         </w:tc>
@@ -3721,7 +3721,7 @@
               <w:rPr>
                 <w:sz w:val="19"/>
               </w:rPr>
-              <w:t>Project report made unambiguous: an extraction-completeness statement and a High/Medium/Low confidence per page that always agree with the page's status; the confirmed share is named for what it measures; page text keeps its line breaks in Excel.</w:t>
+              <w:t>Live John Hancock: 32 of 34 verified again with all checks on (the 2 others are placeholder pages). FAQ sections built as web components are now opened, text is matched the way the browser shows it, and a brief network hiccup no longer pauses a whole website.</w:t>
             </w:r>
           </w:p>
         </w:tc>
@@ -3745,7 +3745,7 @@
               <w:rPr>
                 <w:sz w:val="19"/>
               </w:rPr>
-              <w:t>2026-10-21</w:t>
+              <w:t>2026-10-22</w:t>
             </w:r>
           </w:p>
         </w:tc>
@@ -3767,7 +3767,7 @@
               <w:rPr>
                 <w:sz w:val="19"/>
               </w:rPr>
-              <w:t>Project report: one Excel workbook per run with every page's text, whether it was fully extracted, the confirmed share and the confidence, plus, for every page, which other pages carry the same text and how much (exact matching).</w:t>
+              <w:t>Project report made unambiguous: an extraction-completeness statement and a High/Medium/Low confidence per page that always agree with the page's status; the confirmed share is named for what it measures; page text keeps its line breaks in Excel.</w:t>
             </w:r>
           </w:p>
         </w:tc>
@@ -3811,7 +3811,7 @@
               <w:rPr>
                 <w:sz w:val="19"/>
               </w:rPr>
-              <w:t>Evidence stored compactly: repeated fonts and style sheets kept once, the rest compressed, originals unchanged. About 18 times less disk on the live John Hancock run; a 5,000-page run now fits the 20 GB budget. Older evidence can be converted with one command.</w:t>
+              <w:t>Project report: one Excel workbook per run with every page's text, whether it was fully extracted, the confirmed share and the confidence, plus, for every page, which other pages carry the same text and how much (exact matching).</w:t>
             </w:r>
           </w:p>
         </w:tc>
@@ -3857,7 +3857,7 @@
               <w:rPr>
                 <w:sz w:val="19"/>
               </w:rPr>
-              <w:t>Crossed-out text (for example an old sale price) is kept and marked with ~~ instead of reading as a current price.</w:t>
+              <w:t>Evidence stored compactly: repeated fonts and style sheets kept once, the rest compressed, originals unchanged. About 18 times less disk on the live John Hancock run; a 5,000-page run now fits the 20 GB budget. Older evidence can be converted with one command.</w:t>
             </w:r>
           </w:p>
         </w:tc>
@@ -3880,7 +3880,7 @@
               <w:rPr>
                 <w:sz w:val="19"/>
               </w:rPr>
-              <w:t>2026-10-20</w:t>
+              <w:t>2026-10-21</w:t>
             </w:r>
           </w:p>
         </w:tc>
@@ -3901,7 +3901,7 @@
               <w:rPr>
                 <w:sz w:val="19"/>
               </w:rPr>
-              <w:t>Report file names start with the run's name, so downloads from different runs stay separate.</w:t>
+              <w:t>Crossed-out text (for example an old sale price) is kept and marked with ~~ instead of reading as a current price.</w:t>
             </w:r>
           </w:p>
         </w:tc>
@@ -3947,7 +3947,7 @@
               <w:rPr>
                 <w:sz w:val="19"/>
               </w:rPr>
-              <w:t>Analyst web app for reviewing runs in a browser. Optional grouping of pages by design template, so shared files are fetched once per group.</w:t>
+              <w:t>Report file names start with the run's name, so downloads from different runs stay separate.</w:t>
             </w:r>
           </w:p>
         </w:tc>
@@ -3991,7 +3991,7 @@
               <w:rPr>
                 <w:sz w:val="19"/>
               </w:rPr>
-              <w:t>Image and scanned-text reading switched on (Tesseract with 25 languages, found automatically). The visual-text check was tuned on the live John Hancock site so ordinary reading errors and cookie banners no longer cause false alarms. Images and PDFs no longer wait for a browser exploration they cannot have. Automated quality pipeline (CI) added. Live re-run: 3 of 34 verified, with the stricter checks finding real missing text.</w:t>
+              <w:t>Analyst web app for reviewing runs in a browser. Optional grouping of pages by design template, so shared files are fetched once per group.</w:t>
             </w:r>
           </w:p>
         </w:tc>
@@ -4037,7 +4037,7 @@
               <w:rPr>
                 <w:sz w:val="19"/>
               </w:rPr>
-              <w:t>Six safety and accuracy fixes (failed image reading no longer reported as verified; compressed pages decoded correctly; paused websites resume; paid access always needs approval; connections locked to the checked address; contradiction report no longer confuses dated snapshots or different products). Critical-fact check (R9) added. Tesseract OCR installed with 25 languages.</w:t>
+              <w:t>Image and scanned-text reading switched on (Tesseract with 25 languages, found automatically). The visual-text check was tuned on the live John Hancock site so ordinary reading errors and cookie banners no longer cause false alarms. Images and PDFs no longer wait for a browser exploration they cannot have. Automated quality pipeline (CI) added. Live re-run: 3 of 34 verified, with the stricter checks finding real missing text.</w:t>
             </w:r>
           </w:p>
         </w:tc>
@@ -4060,7 +4060,7 @@
               <w:rPr>
                 <w:sz w:val="19"/>
               </w:rPr>
-              <w:t>2026-10-19</w:t>
+              <w:t>2026-10-20</w:t>
             </w:r>
           </w:p>
         </w:tc>
@@ -4081,7 +4081,7 @@
               <w:rPr>
                 <w:sz w:val="19"/>
               </w:rPr>
-              <w:t>Browser exploration reaches 32 of 34 verified on John Hancock. Checks R6–R8 and R11–R13, page settling and evidence integrity added. Contradiction report (R4), paywall detection, run budgets, robots crawl-delay saved, stuck tasks reported. Office documents (Word, Excel, PowerPoint) supported. 222-case test inventory.</w:t>
+              <w:t>Six safety and accuracy fixes (failed image reading no longer reported as verified; compressed pages decoded correctly; paused websites resume; paid access always needs approval; connections locked to the checked address; contradiction report no longer confuses dated snapshots or different products). Critical-fact check (R9) added. Tesseract OCR installed with 25 languages.</w:t>
             </w:r>
           </w:p>
         </w:tc>
@@ -4105,7 +4105,7 @@
               <w:rPr>
                 <w:sz w:val="19"/>
               </w:rPr>
-              <w:t>2026-10-16</w:t>
+              <w:t>2026-10-19</w:t>
             </w:r>
           </w:p>
         </w:tc>
@@ -4127,7 +4127,7 @@
               <w:rPr>
                 <w:sz w:val="19"/>
               </w:rPr>
-              <w:t>Per-page verdicts with evidence, first checks (R1–R3, R10), reports (R1 content, review queue, overlap), offline explorer, run engine and command line.</w:t>
+              <w:t>Browser exploration reaches 32 of 34 verified on John Hancock. Checks R6–R8 and R11–R13, page settling and evidence integrity added. Contradiction report (R4), paywall detection, run budgets, robots crawl-delay saved, stuck tasks reported. Office documents (Word, Excel, PowerPoint) supported. 222-case test inventory.</w:t>
             </w:r>
           </w:p>
         </w:tc>
@@ -4150,13 +4150,59 @@
               <w:rPr>
                 <w:sz w:val="19"/>
               </w:rPr>
-              <w:t>2026-10-15</w:t>
+              <w:t>2026-10-16</w:t>
             </w:r>
           </w:p>
         </w:tc>
         <w:tc>
           <w:tcPr>
             <w:tcW w:type="dxa" w:w="4873"/>
+          </w:tcPr>
+          <w:p>
+            <w:pPr>
+              <w:spacing w:after="40"/>
+            </w:pPr>
+            <w:r>
+              <w:rPr>
+                <w:sz w:val="19"/>
+              </w:rPr>
+            </w:r>
+            <w:r>
+              <w:rPr>
+                <w:sz w:val="19"/>
+              </w:rPr>
+              <w:t>Per-page verdicts with evidence, first checks (R1–R3, R10), reports (R1 content, review queue, overlap), offline explorer, run engine and command line.</w:t>
+            </w:r>
+          </w:p>
+        </w:tc>
+      </w:tr>
+      <w:tr>
+        <w:tc>
+          <w:tcPr>
+            <w:tcW w:type="dxa" w:w="4873"/>
+            <w:shd w:val="clear" w:color="auto" w:fill="EEF2F7"/>
+          </w:tcPr>
+          <w:p>
+            <w:pPr>
+              <w:spacing w:after="40"/>
+            </w:pPr>
+            <w:r>
+              <w:rPr>
+                <w:sz w:val="19"/>
+              </w:rPr>
+            </w:r>
+            <w:r>
+              <w:rPr>
+                <w:sz w:val="19"/>
+              </w:rPr>
+              <w:t>2026-10-15</w:t>
+            </w:r>
+          </w:p>
+        </w:tc>
+        <w:tc>
+          <w:tcPr>
+            <w:tcW w:type="dxa" w:w="4873"/>
+            <w:shd w:val="clear" w:color="auto" w:fill="EEF2F7"/>
           </w:tcPr>
           <w:p>
             <w:pPr>

</xml_diff>

<commit_message>
RFC 0002 step 1: page stamps, site menu trees and context-preserving chunks
New `stamp` command reads a finished run and its stored evidence (no network,
no model) and writes per-page stamps, chunks and run-level site facts:
- head metadata, JSON-LD facts, H1, breadcrumbs, CTAs, numbers, readability
- full menu trees merged across rendered views, mega-menu panels under tabs
- exclusions with reasons (assets, tracking, error/placeholder, duplicates);
  near-duplicates listed, never dropped
- chunks with context header, neighbour links, sentence overlap, atomic
  tables/panels/forms, small-section merging

Guide and Word file updated; lane log entry added.

Co-Authored-By: Claude Opus 5.5 <noreply@anthropic.com>
</commit_message>
<xml_diff>
--- a/Content_Processor_Guide.docx
+++ b/Content_Processor_Guide.docx
@@ -17,7 +17,7 @@
           <w:color w:val="595959"/>
           <w:sz w:val="19"/>
         </w:rPr>
-        <w:t>Last updated: 26 October 2026 · Code version: main after the visible-text coverage check, matching pairs listed once, columns in sideways-scrolling tables and spaced-out browser retries · Maintained by every session that adds a significant feature (see "Keeping this guide current" at the end)</w:t>
+        <w:t>Last updated: 26 October 2026 · Code version: main after page stamping and context-keeping sections (step 1 of the knowledge base) · Maintained by every session that adds a significant feature (see "Keeping this guide current" at the end)</w:t>
       </w:r>
     </w:p>
     <w:p>
@@ -2220,6 +2220,128 @@
     </w:p>
     <w:p>
       <w:pPr>
+        <w:pStyle w:val="Heading2"/>
+      </w:pPr>
+      <w:r>
+        <w:t>Step 11: Getting pages ready for the knowledge base ("stamping")</w:t>
+      </w:r>
+    </w:p>
+    <w:p>
+      <w:r>
+        <w:t>The next stage of the project turns a finished run into a knowledge base: every service and product a website offers, with all of its content mapped to them, so websites can be searched, compared with competitors and checked for gaps. Step 1 of that work is done: one command ("stamp") reads a finished run and its stored evidence, without visiting the website again and without any AI model, and writes three files.</w:t>
+      </w:r>
+    </w:p>
+    <w:p>
+      <w:pPr>
+        <w:pStyle w:val="ListBullet"/>
+      </w:pPr>
+      <w:r>
+        <w:rPr>
+          <w:b/>
+        </w:rPr>
+        <w:t>A stamp per page</w:t>
+      </w:r>
+      <w:r>
+        <w:t>: its title, description, canonical address, language versions, social-media tags, the page's main heading, its breadcrumb trail, where it sits in the site's address structure, the services, products, prices, questions and dates it declares in its structured data, the calls to action in its content (for example "Get a quote"), the numbers it states, word counts, a readability score for English pages, a one-sentence summary, and its verdict and dates from the run.</w:t>
+      </w:r>
+    </w:p>
+    <w:p>
+      <w:pPr>
+        <w:pStyle w:val="ListBullet"/>
+      </w:pPr>
+      <w:r>
+        <w:rPr>
+          <w:b/>
+        </w:rPr>
+        <w:t>The site's menus, once per run</w:t>
+      </w:r>
+      <w:r>
+        <w:t>: the full menu tree as visitors see it, including mega-menus that only appear when a visitor opens them (the engine merges every opened menu into one tree). On John Hancock this gives the whole product hierarchy, for example Life insurance › Products &amp; services › Term life insurance. This is the starting point for the list of offerings in the next step.</w:t>
+      </w:r>
+    </w:p>
+    <w:p>
+      <w:pPr>
+        <w:pStyle w:val="ListBullet"/>
+      </w:pPr>
+      <w:r>
+        <w:rPr>
+          <w:b/>
+        </w:rPr>
+        <w:t>Sections of each page ("chunks")</w:t>
+      </w:r>
+      <w:r>
+        <w:t>: each page's main content split into sections of a few hundred words, ready for search.</w:t>
+      </w:r>
+    </w:p>
+    <w:p>
+      <w:r>
+        <w:rPr>
+          <w:b/>
+        </w:rPr>
+        <w:t>Which pages go in.</w:t>
+      </w:r>
+      <w:r>
+        <w:t xml:space="preserve"> Images, tracking pixels, blocked pages, "page not found" pages, error pages, placeholder pages ("Lorem ipsum") and exact copies of another page are left out, each with the reason written on its stamp. Pages that are only nearly the same are kept, because they may differ in the details that matter (for example two fund notices that differ only in their numbers); the near-copies are listed on each page's stamp.</w:t>
+      </w:r>
+    </w:p>
+    <w:p>
+      <w:r>
+        <w:rPr>
+          <w:b/>
+        </w:rPr>
+        <w:t>Splitting pages without losing their meaning.</w:t>
+      </w:r>
+      <w:r>
+        <w:t xml:space="preserve"> Cutting a page into sections can lose context, so every section keeps what it needs:</w:t>
+      </w:r>
+    </w:p>
+    <w:p>
+      <w:pPr>
+        <w:pStyle w:val="ListBullet"/>
+      </w:pPr>
+      <w:r>
+        <w:t>a header naming the website, the page and the headings above it, plus the page's one-line summary, so a section never loses what it is about;</w:t>
+      </w:r>
+    </w:p>
+    <w:p>
+      <w:pPr>
+        <w:pStyle w:val="ListBullet"/>
+      </w:pPr>
+      <w:r>
+        <w:t>links to the sections before and after it, and the last sentence of the previous section when a long passage had to be split;</w:t>
+      </w:r>
+    </w:p>
+    <w:p>
+      <w:pPr>
+        <w:pStyle w:val="ListBullet"/>
+      </w:pPr>
+      <w:r>
+        <w:t>tables, question-and-answer panels and forms are never cut in half;</w:t>
+      </w:r>
+    </w:p>
+    <w:p>
+      <w:pPr>
+        <w:pStyle w:val="ListBullet"/>
+      </w:pPr>
+      <w:r>
+        <w:t>a long passage is split between sentences, never inside one; very short sections are joined to their neighbours;</w:t>
+      </w:r>
+    </w:p>
+    <w:p>
+      <w:pPr>
+        <w:pStyle w:val="ListBullet"/>
+      </w:pPr>
+      <w:r>
+        <w:t>the section text itself is kept exactly as extracted, with links back to the evidence, so every answer can be cited.</w:t>
+      </w:r>
+    </w:p>
+    <w:p>
+      <w:r>
+        <w:t>On the John Hancock run (39 addresses) it took about 9 seconds: 12 pages went into the knowledge base (20 exact copies, 4 images, 1 tracking pixel, 1 error page and 1 placeholder page left out), giving 51 sections of about 155 words on average (none over about 400), a header menu tree of 72 entries and a footer of 58.</w:t>
+      </w:r>
+    </w:p>
+    <w:p>
+      <w:pPr>
         <w:pStyle w:val="Heading1"/>
       </w:pPr>
       <w:r>
@@ -2715,6 +2837,14 @@
         <w:pStyle w:val="ListBullet"/>
       </w:pPr>
       <w:r>
+        <w:t>The rest of the knowledge base: the list of each website's offerings, labelling every page and section with them, search across sections, and competitor comparison and gap reports are designed but not built yet (step 1, stamping and sections, is done).</w:t>
+      </w:r>
+    </w:p>
+    <w:p>
+      <w:pPr>
+        <w:pStyle w:val="ListBullet"/>
+      </w:pPr>
+      <w:r>
         <w:t>Hidden page text: some text present in the page code (for example frequently-asked-question answers) is not yet revealed and captured by the browser exploration; the engine flags these pages for review rather than counting them complete.</w:t>
       </w:r>
     </w:p>
@@ -3338,6 +3468,140 @@
           </w:p>
         </w:tc>
       </w:tr>
+      <w:tr>
+        <w:tc>
+          <w:tcPr>
+            <w:tcW w:type="dxa" w:w="4873"/>
+          </w:tcPr>
+          <w:p>
+            <w:pPr>
+              <w:spacing w:after="40"/>
+            </w:pPr>
+            <w:r>
+              <w:rPr>
+                <w:sz w:val="19"/>
+              </w:rPr>
+            </w:r>
+            <w:r>
+              <w:rPr>
+                <w:sz w:val="19"/>
+              </w:rPr>
+              <w:t>Stamp</w:t>
+            </w:r>
+          </w:p>
+        </w:tc>
+        <w:tc>
+          <w:tcPr>
+            <w:tcW w:type="dxa" w:w="4873"/>
+          </w:tcPr>
+          <w:p>
+            <w:pPr>
+              <w:spacing w:after="40"/>
+            </w:pPr>
+            <w:r>
+              <w:rPr>
+                <w:sz w:val="19"/>
+              </w:rPr>
+            </w:r>
+            <w:r>
+              <w:rPr>
+                <w:sz w:val="19"/>
+              </w:rPr>
+              <w:t>The set of facts recorded about one page before it goes into the knowledge base.</w:t>
+            </w:r>
+          </w:p>
+        </w:tc>
+      </w:tr>
+      <w:tr>
+        <w:tc>
+          <w:tcPr>
+            <w:tcW w:type="dxa" w:w="4873"/>
+            <w:shd w:val="clear" w:color="auto" w:fill="EEF2F7"/>
+          </w:tcPr>
+          <w:p>
+            <w:pPr>
+              <w:spacing w:after="40"/>
+            </w:pPr>
+            <w:r>
+              <w:rPr>
+                <w:sz w:val="19"/>
+              </w:rPr>
+            </w:r>
+            <w:r>
+              <w:rPr>
+                <w:sz w:val="19"/>
+              </w:rPr>
+              <w:t>Chunk (section)</w:t>
+            </w:r>
+          </w:p>
+        </w:tc>
+        <w:tc>
+          <w:tcPr>
+            <w:tcW w:type="dxa" w:w="4873"/>
+            <w:shd w:val="clear" w:color="auto" w:fill="EEF2F7"/>
+          </w:tcPr>
+          <w:p>
+            <w:pPr>
+              <w:spacing w:after="40"/>
+            </w:pPr>
+            <w:r>
+              <w:rPr>
+                <w:sz w:val="19"/>
+              </w:rPr>
+            </w:r>
+            <w:r>
+              <w:rPr>
+                <w:sz w:val="19"/>
+              </w:rPr>
+              <w:t>A piece of a page's content, a few hundred words long, that keeps a note of which page and heading it came from.</w:t>
+            </w:r>
+          </w:p>
+        </w:tc>
+      </w:tr>
+      <w:tr>
+        <w:tc>
+          <w:tcPr>
+            <w:tcW w:type="dxa" w:w="4873"/>
+          </w:tcPr>
+          <w:p>
+            <w:pPr>
+              <w:spacing w:after="40"/>
+            </w:pPr>
+            <w:r>
+              <w:rPr>
+                <w:sz w:val="19"/>
+              </w:rPr>
+            </w:r>
+            <w:r>
+              <w:rPr>
+                <w:sz w:val="19"/>
+              </w:rPr>
+              <w:t>Offering</w:t>
+            </w:r>
+          </w:p>
+        </w:tc>
+        <w:tc>
+          <w:tcPr>
+            <w:tcW w:type="dxa" w:w="4873"/>
+          </w:tcPr>
+          <w:p>
+            <w:pPr>
+              <w:spacing w:after="40"/>
+            </w:pPr>
+            <w:r>
+              <w:rPr>
+                <w:sz w:val="19"/>
+              </w:rPr>
+            </w:r>
+            <w:r>
+              <w:rPr>
+                <w:sz w:val="19"/>
+              </w:rPr>
+              <w:t>A service, product or practice a website offers; the knowledge base maps every page to them.</w:t>
+            </w:r>
+          </w:p>
+        </w:tc>
+      </w:tr>
     </w:tbl>
     <w:p/>
     <w:p>
@@ -3451,7 +3715,7 @@
               <w:rPr>
                 <w:sz w:val="19"/>
               </w:rPr>
-              <w:t>Columns of wide tables that you scroll sideways are captured (they were wrongly treated as hidden). A page the browser cannot open is retried by itself over about five minutes instead of a few seconds. Live John Hancock, 303 pages: 279 verified.</w:t>
+              <w:t>Knowledge base step 1: a "stamp" command records each page's facts (titles, descriptions, structured data, menus, calls to action, numbers, dates), builds the site's full menu tree including mega-menus, leaves out images, error, placeholder and duplicate pages with the reason, and splits each page into sections that keep their page, heading and neighbours. John Hancock: 12 pages, 51 sections, a 72-entry menu tree, in about 9 seconds at $0.</w:t>
             </w:r>
           </w:p>
         </w:tc>
@@ -3497,7 +3761,7 @@
               <w:rPr>
                 <w:sz w:val="19"/>
               </w:rPr>
-              <w:t>Project report: each pair of matching pages is listed once, with the shared share in both directions.</w:t>
+              <w:t>Columns of wide tables that you scroll sideways are captured (they were wrongly treated as hidden). A page the browser cannot open is retried by itself over about five minutes instead of a few seconds. Live John Hancock, 303 pages: 279 verified.</w:t>
             </w:r>
           </w:p>
         </w:tc>
@@ -3520,7 +3784,7 @@
               <w:rPr>
                 <w:sz w:val="19"/>
               </w:rPr>
-              <w:t>2026-10-24</w:t>
+              <w:t>2026-10-26</w:t>
             </w:r>
           </w:p>
         </w:tc>
@@ -3541,7 +3805,7 @@
               <w:rPr>
                 <w:sz w:val="19"/>
               </w:rPr>
-              <w:t>New check that every line of text the browser shows was extracted. Web components no longer mistaken for hidden text; a duplicate copy of text never replaces the visible one; site tools (sign-in, country picker, chat) kept out of the content; words in side-by-side boxes no longer glued; a page is judged settled by its text, not by background elements.</w:t>
+              <w:t>Project report: each pair of matching pages is listed once, with the shared share in both directions.</w:t>
             </w:r>
           </w:p>
         </w:tc>
@@ -3565,7 +3829,7 @@
               <w:rPr>
                 <w:sz w:val="19"/>
               </w:rPr>
-              <w:t>2026-10-22</w:t>
+              <w:t>2026-10-24</w:t>
             </w:r>
           </w:p>
         </w:tc>
@@ -3587,7 +3851,7 @@
               <w:rPr>
                 <w:sz w:val="19"/>
               </w:rPr>
-              <w:t>Paid access (Bright Data) built but off by default: one approval per website with a spending cap, checked before every paid request, with a spending log.</w:t>
+              <w:t>New check that every line of text the browser shows was extracted. Web components no longer mistaken for hidden text; a duplicate copy of text never replaces the visible one; site tools (sign-in, country picker, chat) kept out of the content; words in side-by-side boxes no longer glued; a page is judged settled by its text, not by background elements.</w:t>
             </w:r>
           </w:p>
         </w:tc>
@@ -3610,7 +3874,7 @@
               <w:rPr>
                 <w:sz w:val="19"/>
               </w:rPr>
-              <w:t>2026-10-21</w:t>
+              <w:t>2026-10-22</w:t>
             </w:r>
           </w:p>
         </w:tc>
@@ -3631,7 +3895,7 @@
               <w:rPr>
                 <w:sz w:val="19"/>
               </w:rPr>
-              <w:t>Reviewers save decisions in the web app (with name, time and full history); the next report carries them forward.</w:t>
+              <w:t>Paid access (Bright Data) built but off by default: one approval per website with a spending cap, checked before every paid request, with a spending log.</w:t>
             </w:r>
           </w:p>
         </w:tc>
@@ -3677,7 +3941,7 @@
               <w:rPr>
                 <w:sz w:val="19"/>
               </w:rPr>
-              <w:t>Live John Hancock: 32 of 34 verified again with all checks on (the 2 others are placeholder pages). FAQ sections built as web components are now opened, text is matched the way the browser shows it, and a brief network hiccup no longer pauses a whole website.</w:t>
+              <w:t>Reviewers save decisions in the web app (with name, time and full history); the next report carries them forward.</w:t>
             </w:r>
           </w:p>
         </w:tc>
@@ -3700,7 +3964,7 @@
               <w:rPr>
                 <w:sz w:val="19"/>
               </w:rPr>
-              <w:t>2026-10-22</w:t>
+              <w:t>2026-10-21</w:t>
             </w:r>
           </w:p>
         </w:tc>
@@ -3721,7 +3985,7 @@
               <w:rPr>
                 <w:sz w:val="19"/>
               </w:rPr>
-              <w:t>Project report made unambiguous: an extraction-completeness statement and a High/Medium/Low confidence per page that always agree with the page's status; the confirmed share is named for what it measures; page text keeps its line breaks in Excel.</w:t>
+              <w:t>Live John Hancock: 32 of 34 verified again with all checks on (the 2 others are placeholder pages). FAQ sections built as web components are now opened, text is matched the way the browser shows it, and a brief network hiccup no longer pauses a whole website.</w:t>
             </w:r>
           </w:p>
         </w:tc>
@@ -3745,7 +4009,7 @@
               <w:rPr>
                 <w:sz w:val="19"/>
               </w:rPr>
-              <w:t>2026-10-21</w:t>
+              <w:t>2026-10-22</w:t>
             </w:r>
           </w:p>
         </w:tc>
@@ -3767,7 +4031,7 @@
               <w:rPr>
                 <w:sz w:val="19"/>
               </w:rPr>
-              <w:t>Project report: one Excel workbook per run with every page's text, whether it was fully extracted, the confirmed share and the confidence, plus, for every page, which other pages carry the same text and how much (exact matching).</w:t>
+              <w:t>Project report made unambiguous: an extraction-completeness statement and a High/Medium/Low confidence per page that always agree with the page's status; the confirmed share is named for what it measures; page text keeps its line breaks in Excel.</w:t>
             </w:r>
           </w:p>
         </w:tc>
@@ -3811,7 +4075,7 @@
               <w:rPr>
                 <w:sz w:val="19"/>
               </w:rPr>
-              <w:t>Evidence stored compactly: repeated fonts and style sheets kept once, the rest compressed, originals unchanged. About 18 times less disk on the live John Hancock run; a 5,000-page run now fits the 20 GB budget. Older evidence can be converted with one command.</w:t>
+              <w:t>Project report: one Excel workbook per run with every page's text, whether it was fully extracted, the confirmed share and the confidence, plus, for every page, which other pages carry the same text and how much (exact matching).</w:t>
             </w:r>
           </w:p>
         </w:tc>
@@ -3857,7 +4121,7 @@
               <w:rPr>
                 <w:sz w:val="19"/>
               </w:rPr>
-              <w:t>Crossed-out text (for example an old sale price) is kept and marked with ~~ instead of reading as a current price.</w:t>
+              <w:t>Evidence stored compactly: repeated fonts and style sheets kept once, the rest compressed, originals unchanged. About 18 times less disk on the live John Hancock run; a 5,000-page run now fits the 20 GB budget. Older evidence can be converted with one command.</w:t>
             </w:r>
           </w:p>
         </w:tc>
@@ -3880,7 +4144,7 @@
               <w:rPr>
                 <w:sz w:val="19"/>
               </w:rPr>
-              <w:t>2026-10-20</w:t>
+              <w:t>2026-10-21</w:t>
             </w:r>
           </w:p>
         </w:tc>
@@ -3901,7 +4165,7 @@
               <w:rPr>
                 <w:sz w:val="19"/>
               </w:rPr>
-              <w:t>Report file names start with the run's name, so downloads from different runs stay separate.</w:t>
+              <w:t>Crossed-out text (for example an old sale price) is kept and marked with ~~ instead of reading as a current price.</w:t>
             </w:r>
           </w:p>
         </w:tc>
@@ -3947,7 +4211,7 @@
               <w:rPr>
                 <w:sz w:val="19"/>
               </w:rPr>
-              <w:t>Analyst web app for reviewing runs in a browser. Optional grouping of pages by design template, so shared files are fetched once per group.</w:t>
+              <w:t>Report file names start with the run's name, so downloads from different runs stay separate.</w:t>
             </w:r>
           </w:p>
         </w:tc>
@@ -3991,7 +4255,7 @@
               <w:rPr>
                 <w:sz w:val="19"/>
               </w:rPr>
-              <w:t>Image and scanned-text reading switched on (Tesseract with 25 languages, found automatically). The visual-text check was tuned on the live John Hancock site so ordinary reading errors and cookie banners no longer cause false alarms. Images and PDFs no longer wait for a browser exploration they cannot have. Automated quality pipeline (CI) added. Live re-run: 3 of 34 verified, with the stricter checks finding real missing text.</w:t>
+              <w:t>Analyst web app for reviewing runs in a browser. Optional grouping of pages by design template, so shared files are fetched once per group.</w:t>
             </w:r>
           </w:p>
         </w:tc>
@@ -4037,7 +4301,7 @@
               <w:rPr>
                 <w:sz w:val="19"/>
               </w:rPr>
-              <w:t>Six safety and accuracy fixes (failed image reading no longer reported as verified; compressed pages decoded correctly; paused websites resume; paid access always needs approval; connections locked to the checked address; contradiction report no longer confuses dated snapshots or different products). Critical-fact check (R9) added. Tesseract OCR installed with 25 languages.</w:t>
+              <w:t>Image and scanned-text reading switched on (Tesseract with 25 languages, found automatically). The visual-text check was tuned on the live John Hancock site so ordinary reading errors and cookie banners no longer cause false alarms. Images and PDFs no longer wait for a browser exploration they cannot have. Automated quality pipeline (CI) added. Live re-run: 3 of 34 verified, with the stricter checks finding real missing text.</w:t>
             </w:r>
           </w:p>
         </w:tc>
@@ -4060,7 +4324,7 @@
               <w:rPr>
                 <w:sz w:val="19"/>
               </w:rPr>
-              <w:t>2026-10-19</w:t>
+              <w:t>2026-10-20</w:t>
             </w:r>
           </w:p>
         </w:tc>
@@ -4081,7 +4345,7 @@
               <w:rPr>
                 <w:sz w:val="19"/>
               </w:rPr>
-              <w:t>Browser exploration reaches 32 of 34 verified on John Hancock. Checks R6–R8 and R11–R13, page settling and evidence integrity added. Contradiction report (R4), paywall detection, run budgets, robots crawl-delay saved, stuck tasks reported. Office documents (Word, Excel, PowerPoint) supported. 222-case test inventory.</w:t>
+              <w:t>Six safety and accuracy fixes (failed image reading no longer reported as verified; compressed pages decoded correctly; paused websites resume; paid access always needs approval; connections locked to the checked address; contradiction report no longer confuses dated snapshots or different products). Critical-fact check (R9) added. Tesseract OCR installed with 25 languages.</w:t>
             </w:r>
           </w:p>
         </w:tc>
@@ -4105,7 +4369,7 @@
               <w:rPr>
                 <w:sz w:val="19"/>
               </w:rPr>
-              <w:t>2026-10-16</w:t>
+              <w:t>2026-10-19</w:t>
             </w:r>
           </w:p>
         </w:tc>
@@ -4127,7 +4391,7 @@
               <w:rPr>
                 <w:sz w:val="19"/>
               </w:rPr>
-              <w:t>Per-page verdicts with evidence, first checks (R1–R3, R10), reports (R1 content, review queue, overlap), offline explorer, run engine and command line.</w:t>
+              <w:t>Browser exploration reaches 32 of 34 verified on John Hancock. Checks R6–R8 and R11–R13, page settling and evidence integrity added. Contradiction report (R4), paywall detection, run budgets, robots crawl-delay saved, stuck tasks reported. Office documents (Word, Excel, PowerPoint) supported. 222-case test inventory.</w:t>
             </w:r>
           </w:p>
         </w:tc>
@@ -4150,13 +4414,59 @@
               <w:rPr>
                 <w:sz w:val="19"/>
               </w:rPr>
-              <w:t>2026-10-15</w:t>
+              <w:t>2026-10-16</w:t>
             </w:r>
           </w:p>
         </w:tc>
         <w:tc>
           <w:tcPr>
             <w:tcW w:type="dxa" w:w="4873"/>
+          </w:tcPr>
+          <w:p>
+            <w:pPr>
+              <w:spacing w:after="40"/>
+            </w:pPr>
+            <w:r>
+              <w:rPr>
+                <w:sz w:val="19"/>
+              </w:rPr>
+            </w:r>
+            <w:r>
+              <w:rPr>
+                <w:sz w:val="19"/>
+              </w:rPr>
+              <w:t>Per-page verdicts with evidence, first checks (R1–R3, R10), reports (R1 content, review queue, overlap), offline explorer, run engine and command line.</w:t>
+            </w:r>
+          </w:p>
+        </w:tc>
+      </w:tr>
+      <w:tr>
+        <w:tc>
+          <w:tcPr>
+            <w:tcW w:type="dxa" w:w="4873"/>
+            <w:shd w:val="clear" w:color="auto" w:fill="EEF2F7"/>
+          </w:tcPr>
+          <w:p>
+            <w:pPr>
+              <w:spacing w:after="40"/>
+            </w:pPr>
+            <w:r>
+              <w:rPr>
+                <w:sz w:val="19"/>
+              </w:rPr>
+            </w:r>
+            <w:r>
+              <w:rPr>
+                <w:sz w:val="19"/>
+              </w:rPr>
+              <w:t>2026-10-15</w:t>
+            </w:r>
+          </w:p>
+        </w:tc>
+        <w:tc>
+          <w:tcPr>
+            <w:tcW w:type="dxa" w:w="4873"/>
+            <w:shd w:val="clear" w:color="auto" w:fill="EEF2F7"/>
           </w:tcPr>
           <w:p>
             <w:pPr>

</xml_diff>

<commit_message>
URL history as the automatic baseline; report freshness columns; widget text for R6
Every run checks a per-tenant URL history (latest capture of every URL from every
run): known pages are fetched conditionally and reused when unchanged, and the
run's captures are remembered afterwards. cli history lists which URLs were
scraped before and when. The project report gains Last checked, Site last
updated and Action. Cookie and chat widgets are read at screenshot time and kept
as third-party blocks so R6 no longer flags them. Guide and lane log updated.

Co-Authored-By: Claude Opus 5.5 <noreply@anthropic.com>
</commit_message>
<xml_diff>
--- a/Content_Processor_Guide.docx
+++ b/Content_Processor_Guide.docx
@@ -17,7 +17,7 @@
           <w:color w:val="595959"/>
           <w:sz w:val="19"/>
         </w:rPr>
-        <w:t>Last updated: 26 October 2026 · Code version: main after page stamping and context-keeping sections (step 1 of the knowledge base) · Maintained by every session that adds a significant feature (see "Keeping this guide current" at the end)</w:t>
+        <w:t>Last updated: 27 October 2026 · Code version: main after page stamping and context-keeping sections (step 1 of the knowledge base), the URL history (only new or changed pages are scraped again), the report's Last checked / Site last updated / Action columns, and cookie and chat widgets read at screenshot time · Maintained by every session that adds a significant feature (see "Keeping this guide current" at the end)</w:t>
       </w:r>
     </w:p>
     <w:p>
@@ -1038,6 +1038,48 @@
         <w:pStyle w:val="Heading2"/>
       </w:pPr>
       <w:r>
+        <w:t>Running again: only new or changed pages are scraped</w:t>
+      </w:r>
+    </w:p>
+    <w:p>
+      <w:r>
+        <w:t>The engine keeps a URL history: for every address it has ever captured, the latest capture, the day it was scraped, and the date the website itself gives for the page's last update. Every run checks it automatically, whatever list of addresses you give it and whichever earlier runs they came from.</w:t>
+      </w:r>
+    </w:p>
+    <w:p>
+      <w:pPr>
+        <w:pStyle w:val="ListBullet"/>
+      </w:pPr>
+      <w:r>
+        <w:t>An address never seen before is scraped in full.</w:t>
+      </w:r>
+    </w:p>
+    <w:p>
+      <w:pPr>
+        <w:pStyle w:val="ListBullet"/>
+      </w:pPr>
+      <w:r>
+        <w:t>An address seen before gets one light "has this changed since our last visit?" request. If the site answers "not changed", or the page's text is word for word the same, the earlier content is kept and the slow browser step is skipped.</w:t>
+      </w:r>
+    </w:p>
+    <w:p>
+      <w:pPr>
+        <w:pStyle w:val="ListBullet"/>
+      </w:pPr>
+      <w:r>
+        <w:t>If the text changed, the page is scraped again, even when the site's update date did not move (sites often edit pages without changing the date). If only the date moved and the text is the same, the earlier content is kept.</w:t>
+      </w:r>
+    </w:p>
+    <w:p>
+      <w:r>
+        <w:t>After each run the history is updated, so the next run starts from the newest captures. Before a run you can check a list of addresses: for each one, whether it was scraped before, when, and the site's last-update date. The history can be switched off for a run that should scrape everything afresh.</w:t>
+      </w:r>
+    </w:p>
+    <w:p>
+      <w:pPr>
+        <w:pStyle w:val="Heading2"/>
+      </w:pPr>
+      <w:r>
         <w:t>Step 5: Reading the page's text</w:t>
       </w:r>
     </w:p>
@@ -1420,7 +1462,7 @@
               <w:rPr>
                 <w:sz w:val="19"/>
               </w:rPr>
-              <w:t>Does every line of text visible on the screenshot appear in what was extracted?</w:t>
+              <w:t>Does every line of text visible on the screenshot appear in what was extracted? Cookie banners and chat bubbles that appear on the screenshot are read at the same moment and recognised as widget text, so they do not cause false alarms.</w:t>
             </w:r>
           </w:p>
         </w:tc>
@@ -1967,7 +2009,7 @@
               <w:rPr>
                 <w:sz w:val="19"/>
               </w:rPr>
-              <w:t>The one workbook most people need. Sheet "Pages": every address with its whole text (line breaks shown), whether it was fully extracted (Yes/No), a plain "Extraction completeness" statement ("Complete", "Incomplete: 1 tab not opened (Pricing)", "Complete, but the page kept changing", "Placeholder page (Lorem ipsum)"), an overall Confidence of High, Medium or Low that can only be High when the page is fully captured, the share of the captured text confirmed against the live page, how reliably it was read (text from the page's code is 100%, text read from images lower), and what is missing. Sheet "Matching content": every pair of addresses that carry the same text, listed once (A with B is never repeated as B with A), by exact word-for-word matching (menus, headers and footers left out), with two percentages: how much of the first page's text is on the second, and how much of the second's is on the first. They differ when the pages differ in length: a short page can be 100% inside a long page while the long page is only 20% inside the short one. To see every match of one page, look for it in both address columns. Very long page text that does not fit in one Excel cell continues in extra "Content_part_2", "Content_part_3" columns; "Content_parts" says how many cells the text uses and "Content_split" says whether it was split (normally 1 and FALSE). Sheet "How to read" explains every column.</w:t>
+              <w:t>The one workbook most people need. Sheet "Pages": every address with its whole text (line breaks shown), whether it was fully extracted (Yes/No), a plain "Extraction completeness" statement ("Complete", "Incomplete: 1 tab not opened (Pricing)", "Complete, but the page kept changing", "Placeholder page (Lorem ipsum)"), an overall Confidence of High, Medium or Low that can only be High when the page is fully captured, the share of the captured text confirmed against the live page, how reliably it was read (text from the page's code is 100%, text read from images lower), what is missing, the day the page was last checked, the date the website gives for its last update, and what the run did ("New: scraped in full", "Reused: unchanged since 26 October" or "Re-scraped: changed since the last capture"). Sheet "Matching content": every pair of addresses that carry the same text, listed once (A with B is never repeated as B with A), by exact word-for-word matching (menus, headers and footers left out), with two percentages: how much of the first page's text is on the second, and how much of the second's is on the first. They differ when the pages differ in length: a short page can be 100% inside a long page while the long page is only 20% inside the short one. To see every match of one page, look for it in both address columns. Very long page text that does not fit in one Excel cell continues in extra "Content_part_2", "Content_part_3" columns; "Content_parts" says how many cells the text uses and "Content_split" says whether it was split (normally 1 and FALSE). Sheet "How to read" explains every column.</w:t>
             </w:r>
           </w:p>
         </w:tc>
@@ -2853,7 +2895,7 @@
         <w:pStyle w:val="ListBullet"/>
       </w:pPr>
       <w:r>
-        <w:t>A text-joining fault (20 October) glues neighbouring words on some live pages; until it is fixed those pages are flagged for review.</w:t>
+        <w:t>Skipping a page without asking the website at all (for example from the dates in the site's sitemap): every page seen before still gets one light request.</w:t>
       </w:r>
     </w:p>
     <w:p>
@@ -3715,7 +3757,7 @@
               <w:rPr>
                 <w:sz w:val="19"/>
               </w:rPr>
-              <w:t>Knowledge base step 1: a "stamp" command records each page's facts (titles, descriptions, structured data, menus, calls to action, numbers, dates), builds the site's full menu tree including mega-menus, leaves out images, error, placeholder and duplicate pages with the reason, and splits each page into sections that keep their page, heading and neighbours. John Hancock: 12 pages, 51 sections, a 72-entry menu tree, in about 9 seconds at $0.</w:t>
+              <w:t>URL history: any list of addresses is checked against every earlier run; unchanged pages keep their earlier content and are not scraped again, only new or changed ones are. A pre-run check lists which addresses were scraped before and when. The project report shows Last checked, Site last updated and Action for every page. Cookie banners and chat bubbles on the screenshot no longer cause false "needs a check" verdicts.</w:t>
             </w:r>
           </w:p>
         </w:tc>
@@ -3739,7 +3781,7 @@
               <w:rPr>
                 <w:sz w:val="19"/>
               </w:rPr>
-              <w:t>2026-10-26</w:t>
+              <w:t>2026-10-27</w:t>
             </w:r>
           </w:p>
         </w:tc>
@@ -3761,7 +3803,7 @@
               <w:rPr>
                 <w:sz w:val="19"/>
               </w:rPr>
-              <w:t>Matching-content sheet columns renamed for clarity: "URL (A)", "Matching URL (B)", "% of A in B" and "% of B in A". Chat-widget invitations (for example "Live chat") are no longer treated as missed page content. Unattended runs wait up to six minutes for held work, so render retries (30, 90 and 180 seconds) finish before a run stops.</w:t>
+              <w:t>Knowledge base step 1: a "stamp" command records each page's facts (titles, descriptions, structured data, menus, calls to action, numbers, dates), builds the site's full menu tree including mega-menus, leaves out images, error, placeholder and duplicate pages with the reason, and splits each page into sections that keep their page, heading and neighbours. John Hancock: 12 pages, 51 sections, a 72-entry menu tree, in about 9 seconds at $0.</w:t>
             </w:r>
           </w:p>
         </w:tc>
@@ -3805,7 +3847,7 @@
               <w:rPr>
                 <w:sz w:val="19"/>
               </w:rPr>
-              <w:t>Columns of wide tables that you scroll sideways are captured (they were wrongly treated as hidden). A page the browser cannot open is retried by itself over about five minutes instead of a few seconds. Live John Hancock, 303 pages: 279 verified.</w:t>
+              <w:t>Matching-content sheet columns renamed for clarity: "URL (A)", "Matching URL (B)", "% of A in B" and "% of B in A". Chat-widget invitations (for example "Live chat") are no longer treated as missed page content. Unattended runs wait up to six minutes for held work, so render retries (30, 90 and 180 seconds) finish before a run stops.</w:t>
             </w:r>
           </w:p>
         </w:tc>
@@ -3851,7 +3893,7 @@
               <w:rPr>
                 <w:sz w:val="19"/>
               </w:rPr>
-              <w:t>Project report: each pair of matching pages is listed once, with the shared share in both directions.</w:t>
+              <w:t>Columns of wide tables that you scroll sideways are captured (they were wrongly treated as hidden). A page the browser cannot open is retried by itself over about five minutes instead of a few seconds. Live John Hancock, 303 pages: 279 verified.</w:t>
             </w:r>
           </w:p>
         </w:tc>
@@ -3874,7 +3916,7 @@
               <w:rPr>
                 <w:sz w:val="19"/>
               </w:rPr>
-              <w:t>2026-10-24</w:t>
+              <w:t>2026-10-26</w:t>
             </w:r>
           </w:p>
         </w:tc>
@@ -3895,7 +3937,7 @@
               <w:rPr>
                 <w:sz w:val="19"/>
               </w:rPr>
-              <w:t>New check that every line of text the browser shows was extracted. Web components no longer mistaken for hidden text; a duplicate copy of text never replaces the visible one; site tools (sign-in, country picker, chat) kept out of the content; words in side-by-side boxes no longer glued; a page is judged settled by its text, not by background elements.</w:t>
+              <w:t>Project report: each pair of matching pages is listed once, with the shared share in both directions.</w:t>
             </w:r>
           </w:p>
         </w:tc>
@@ -3919,7 +3961,7 @@
               <w:rPr>
                 <w:sz w:val="19"/>
               </w:rPr>
-              <w:t>2026-10-22</w:t>
+              <w:t>2026-10-24</w:t>
             </w:r>
           </w:p>
         </w:tc>
@@ -3941,7 +3983,7 @@
               <w:rPr>
                 <w:sz w:val="19"/>
               </w:rPr>
-              <w:t>Paid access (Bright Data) built but off by default: one approval per website with a spending cap, checked before every paid request, with a spending log.</w:t>
+              <w:t>New check that every line of text the browser shows was extracted. Web components no longer mistaken for hidden text; a duplicate copy of text never replaces the visible one; site tools (sign-in, country picker, chat) kept out of the content; words in side-by-side boxes no longer glued; a page is judged settled by its text, not by background elements.</w:t>
             </w:r>
           </w:p>
         </w:tc>
@@ -3964,7 +4006,7 @@
               <w:rPr>
                 <w:sz w:val="19"/>
               </w:rPr>
-              <w:t>2026-10-21</w:t>
+              <w:t>2026-10-22</w:t>
             </w:r>
           </w:p>
         </w:tc>
@@ -3985,7 +4027,7 @@
               <w:rPr>
                 <w:sz w:val="19"/>
               </w:rPr>
-              <w:t>Reviewers save decisions in the web app (with name, time and full history); the next report carries them forward.</w:t>
+              <w:t>Paid access (Bright Data) built but off by default: one approval per website with a spending cap, checked before every paid request, with a spending log.</w:t>
             </w:r>
           </w:p>
         </w:tc>
@@ -4031,7 +4073,7 @@
               <w:rPr>
                 <w:sz w:val="19"/>
               </w:rPr>
-              <w:t>Live John Hancock: 32 of 34 verified again with all checks on (the 2 others are placeholder pages). FAQ sections built as web components are now opened, text is matched the way the browser shows it, and a brief network hiccup no longer pauses a whole website.</w:t>
+              <w:t>Reviewers save decisions in the web app (with name, time and full history); the next report carries them forward.</w:t>
             </w:r>
           </w:p>
         </w:tc>
@@ -4054,7 +4096,7 @@
               <w:rPr>
                 <w:sz w:val="19"/>
               </w:rPr>
-              <w:t>2026-10-22</w:t>
+              <w:t>2026-10-21</w:t>
             </w:r>
           </w:p>
         </w:tc>
@@ -4075,7 +4117,7 @@
               <w:rPr>
                 <w:sz w:val="19"/>
               </w:rPr>
-              <w:t>Project report made unambiguous: an extraction-completeness statement and a High/Medium/Low confidence per page that always agree with the page's status; the confirmed share is named for what it measures; page text keeps its line breaks in Excel.</w:t>
+              <w:t>Live John Hancock: 32 of 34 verified again with all checks on (the 2 others are placeholder pages). FAQ sections built as web components are now opened, text is matched the way the browser shows it, and a brief network hiccup no longer pauses a whole website.</w:t>
             </w:r>
           </w:p>
         </w:tc>
@@ -4099,7 +4141,7 @@
               <w:rPr>
                 <w:sz w:val="19"/>
               </w:rPr>
-              <w:t>2026-10-21</w:t>
+              <w:t>2026-10-22</w:t>
             </w:r>
           </w:p>
         </w:tc>
@@ -4121,7 +4163,7 @@
               <w:rPr>
                 <w:sz w:val="19"/>
               </w:rPr>
-              <w:t>Project report: one Excel workbook per run with every page's text, whether it was fully extracted, the confirmed share and the confidence, plus, for every page, which other pages carry the same text and how much (exact matching).</w:t>
+              <w:t>Project report made unambiguous: an extraction-completeness statement and a High/Medium/Low confidence per page that always agree with the page's status; the confirmed share is named for what it measures; page text keeps its line breaks in Excel.</w:t>
             </w:r>
           </w:p>
         </w:tc>
@@ -4165,7 +4207,7 @@
               <w:rPr>
                 <w:sz w:val="19"/>
               </w:rPr>
-              <w:t>Evidence stored compactly: repeated fonts and style sheets kept once, the rest compressed, originals unchanged. About 18 times less disk on the live John Hancock run; a 5,000-page run now fits the 20 GB budget. Older evidence can be converted with one command.</w:t>
+              <w:t>Project report: one Excel workbook per run with every page's text, whether it was fully extracted, the confirmed share and the confidence, plus, for every page, which other pages carry the same text and how much (exact matching).</w:t>
             </w:r>
           </w:p>
         </w:tc>
@@ -4211,7 +4253,7 @@
               <w:rPr>
                 <w:sz w:val="19"/>
               </w:rPr>
-              <w:t>Crossed-out text (for example an old sale price) is kept and marked with ~~ instead of reading as a current price.</w:t>
+              <w:t>Evidence stored compactly: repeated fonts and style sheets kept once, the rest compressed, originals unchanged. About 18 times less disk on the live John Hancock run; a 5,000-page run now fits the 20 GB budget. Older evidence can be converted with one command.</w:t>
             </w:r>
           </w:p>
         </w:tc>
@@ -4234,7 +4276,7 @@
               <w:rPr>
                 <w:sz w:val="19"/>
               </w:rPr>
-              <w:t>2026-10-20</w:t>
+              <w:t>2026-10-21</w:t>
             </w:r>
           </w:p>
         </w:tc>
@@ -4255,7 +4297,7 @@
               <w:rPr>
                 <w:sz w:val="19"/>
               </w:rPr>
-              <w:t>Report file names start with the run's name, so downloads from different runs stay separate.</w:t>
+              <w:t>Crossed-out text (for example an old sale price) is kept and marked with ~~ instead of reading as a current price.</w:t>
             </w:r>
           </w:p>
         </w:tc>
@@ -4301,7 +4343,7 @@
               <w:rPr>
                 <w:sz w:val="19"/>
               </w:rPr>
-              <w:t>Analyst web app for reviewing runs in a browser. Optional grouping of pages by design template, so shared files are fetched once per group.</w:t>
+              <w:t>Report file names start with the run's name, so downloads from different runs stay separate.</w:t>
             </w:r>
           </w:p>
         </w:tc>
@@ -4345,7 +4387,7 @@
               <w:rPr>
                 <w:sz w:val="19"/>
               </w:rPr>
-              <w:t>Image and scanned-text reading switched on (Tesseract with 25 languages, found automatically). The visual-text check was tuned on the live John Hancock site so ordinary reading errors and cookie banners no longer cause false alarms. Images and PDFs no longer wait for a browser exploration they cannot have. Automated quality pipeline (CI) added. Live re-run: 3 of 34 verified, with the stricter checks finding real missing text.</w:t>
+              <w:t>Analyst web app for reviewing runs in a browser. Optional grouping of pages by design template, so shared files are fetched once per group.</w:t>
             </w:r>
           </w:p>
         </w:tc>
@@ -4391,7 +4433,7 @@
               <w:rPr>
                 <w:sz w:val="19"/>
               </w:rPr>
-              <w:t>Six safety and accuracy fixes (failed image reading no longer reported as verified; compressed pages decoded correctly; paused websites resume; paid access always needs approval; connections locked to the checked address; contradiction report no longer confuses dated snapshots or different products). Critical-fact check (R9) added. Tesseract OCR installed with 25 languages.</w:t>
+              <w:t>Image and scanned-text reading switched on (Tesseract with 25 languages, found automatically). The visual-text check was tuned on the live John Hancock site so ordinary reading errors and cookie banners no longer cause false alarms. Images and PDFs no longer wait for a browser exploration they cannot have. Automated quality pipeline (CI) added. Live re-run: 3 of 34 verified, with the stricter checks finding real missing text.</w:t>
             </w:r>
           </w:p>
         </w:tc>
@@ -4414,7 +4456,7 @@
               <w:rPr>
                 <w:sz w:val="19"/>
               </w:rPr>
-              <w:t>2026-10-19</w:t>
+              <w:t>2026-10-20</w:t>
             </w:r>
           </w:p>
         </w:tc>
@@ -4435,7 +4477,7 @@
               <w:rPr>
                 <w:sz w:val="19"/>
               </w:rPr>
-              <w:t>Browser exploration reaches 32 of 34 verified on John Hancock. Checks R6–R8 and R11–R13, page settling and evidence integrity added. Contradiction report (R4), paywall detection, run budgets, robots crawl-delay saved, stuck tasks reported. Office documents (Word, Excel, PowerPoint) supported. 222-case test inventory.</w:t>
+              <w:t>Six safety and accuracy fixes (failed image reading no longer reported as verified; compressed pages decoded correctly; paused websites resume; paid access always needs approval; connections locked to the checked address; contradiction report no longer confuses dated snapshots or different products). Critical-fact check (R9) added. Tesseract OCR installed with 25 languages.</w:t>
             </w:r>
           </w:p>
         </w:tc>
@@ -4459,7 +4501,7 @@
               <w:rPr>
                 <w:sz w:val="19"/>
               </w:rPr>
-              <w:t>2026-10-16</w:t>
+              <w:t>2026-10-19</w:t>
             </w:r>
           </w:p>
         </w:tc>
@@ -4481,7 +4523,7 @@
               <w:rPr>
                 <w:sz w:val="19"/>
               </w:rPr>
-              <w:t>Per-page verdicts with evidence, first checks (R1–R3, R10), reports (R1 content, review queue, overlap), offline explorer, run engine and command line.</w:t>
+              <w:t>Browser exploration reaches 32 of 34 verified on John Hancock. Checks R6–R8 and R11–R13, page settling and evidence integrity added. Contradiction report (R4), paywall detection, run budgets, robots crawl-delay saved, stuck tasks reported. Office documents (Word, Excel, PowerPoint) supported. 222-case test inventory.</w:t>
             </w:r>
           </w:p>
         </w:tc>
@@ -4504,13 +4546,59 @@
               <w:rPr>
                 <w:sz w:val="19"/>
               </w:rPr>
-              <w:t>2026-10-15</w:t>
+              <w:t>2026-10-16</w:t>
             </w:r>
           </w:p>
         </w:tc>
         <w:tc>
           <w:tcPr>
             <w:tcW w:type="dxa" w:w="4873"/>
+          </w:tcPr>
+          <w:p>
+            <w:pPr>
+              <w:spacing w:after="40"/>
+            </w:pPr>
+            <w:r>
+              <w:rPr>
+                <w:sz w:val="19"/>
+              </w:rPr>
+            </w:r>
+            <w:r>
+              <w:rPr>
+                <w:sz w:val="19"/>
+              </w:rPr>
+              <w:t>Per-page verdicts with evidence, first checks (R1–R3, R10), reports (R1 content, review queue, overlap), offline explorer, run engine and command line.</w:t>
+            </w:r>
+          </w:p>
+        </w:tc>
+      </w:tr>
+      <w:tr>
+        <w:tc>
+          <w:tcPr>
+            <w:tcW w:type="dxa" w:w="4873"/>
+            <w:shd w:val="clear" w:color="auto" w:fill="EEF2F7"/>
+          </w:tcPr>
+          <w:p>
+            <w:pPr>
+              <w:spacing w:after="40"/>
+            </w:pPr>
+            <w:r>
+              <w:rPr>
+                <w:sz w:val="19"/>
+              </w:rPr>
+            </w:r>
+            <w:r>
+              <w:rPr>
+                <w:sz w:val="19"/>
+              </w:rPr>
+              <w:t>2026-10-15</w:t>
+            </w:r>
+          </w:p>
+        </w:tc>
+        <w:tc>
+          <w:tcPr>
+            <w:tcW w:type="dxa" w:w="4873"/>
+            <w:shd w:val="clear" w:color="auto" w:fill="EEF2F7"/>
           </w:tcPr>
           <w:p>
             <w:pPr>

</xml_diff>

<commit_message>
A web page's recent Last-Modified header is a cache time, not its edit date
For HTML, an HTTP Last-Modified newer than 7 days is not reported as the page's
update date (live John Hancock sent regeneration times on 2021 press releases).
Files keep the 120 s rule. Guide and lane log updated.

Co-Authored-By: Claude Opus 5.5 <noreply@anthropic.com>
</commit_message>
<xml_diff>
--- a/Content_Processor_Guide.docx
+++ b/Content_Processor_Guide.docx
@@ -1044,6 +1044,11 @@
     <w:p>
       <w:r>
         <w:t>The engine keeps a URL history: for every address it has ever captured, the latest capture, the day it was scraped, and the date the website itself gives for the page's last update. Every run checks it automatically, whatever list of addresses you give it and whichever earlier runs they came from.</w:t>
+      </w:r>
+    </w:p>
+    <w:p>
+      <w:r>
+        <w:t>The site's update date is taken from what the page itself states (its structured data or tags). A web server's own "last modified" time is used only when it is at least a week old: many sites send the time the page was last rebuilt on their servers, not the time someone edited it. When a site does not say, the column is left empty rather than guessed.</w:t>
       </w:r>
     </w:p>
     <w:p>

</xml_diff>

<commit_message>
RFC 0002 step 2: offering catalog from menus, folders and structured data
New `catalog` command builds the site's offering tree (families, offerings,
sub-offerings) from step 1's stamps, places every page under an offering or
a non-offering section, and fills cards in which every value cites its menu
entry, page, structured-data field or chunk. Writes <run>.catalog.json and
<run>_offering_catalog.xlsx.

Optional local-model help (local/private endpoints only): embedding merges
need a second signal, model attributes need a verbatim quote checked in code,
offering types need structured-data agreement; the rest become suggestions.

Step 1 fixes: script-button menu links have no destination; over-long
sentences are cut between words.

Co-Authored-By: Claude Opus 5.5 <noreply@anthropic.com>
</commit_message>
<xml_diff>
--- a/Content_Processor_Guide.docx
+++ b/Content_Processor_Guide.docx
@@ -17,7 +17,7 @@
           <w:color w:val="595959"/>
           <w:sz w:val="19"/>
         </w:rPr>
-        <w:t>Last updated: 26 October 2026 · Code version: main after page stamping and context-keeping sections (step 1 of the knowledge base) · Maintained by every session that adds a significant feature (see "Keeping this guide current" at the end)</w:t>
+        <w:t>Last updated: 26 October 2026 · Code version: main after page stamping (step 1) and the offering catalog (step 2) of the knowledge base · Maintained by every session that adds a significant feature (see "Keeping this guide current" at the end)</w:t>
       </w:r>
     </w:p>
     <w:p>
@@ -2342,6 +2342,84 @@
     </w:p>
     <w:p>
       <w:pPr>
+        <w:pStyle w:val="Heading2"/>
+      </w:pPr>
+      <w:r>
+        <w:t>Step 12: The offering catalog ("website theming")</w:t>
+      </w:r>
+    </w:p>
+    <w:p>
+      <w:r>
+        <w:t>A second command ("catalog") turns the stamps into the website's catalog of offerings: every service, product and programme it offers, arranged as a tree of families, offerings and sub-offerings, with a card for each. It writes a file for other tools and an Excel workbook (`&lt;run&gt;_offering_catalog.xlsx`).</w:t>
+      </w:r>
+    </w:p>
+    <w:p>
+      <w:r>
+        <w:rPr>
+          <w:b/>
+        </w:rPr>
+        <w:t>How the list is found.</w:t>
+      </w:r>
+      <w:r>
+        <w:t xml:space="preserve"> The engine reads the website's own menus, including the mega-menus, and sorts every entry: an offering group ("Products &amp; services") holds offerings; tasks ("File a claim", "Sign in"), tools ("calculators"), content ("Insights"), corporate pages ("Careers", privacy links) and audiences ("Individuals", "Financial professionals") are set aside and listed separately. Entries that point to the same page, or that have the same name once words such as "insurance" are set aside, become one offering with both names kept. Products and services the pages declare in their structured data are added, and so are folders of the website shared by several pages.</w:t>
+      </w:r>
+    </w:p>
+    <w:p>
+      <w:r>
+        <w:rPr>
+          <w:b/>
+        </w:rPr>
+        <w:t>Every page is placed.</w:t>
+      </w:r>
+      <w:r>
+        <w:t xml:space="preserve"> Each page is put under the offering whose web address it sits in (or that its breadcrumb or structured data names); pages that belong to no offering are filed under the section that covers them (for example News); the rest are listed as unplaced.</w:t>
+      </w:r>
+    </w:p>
+    <w:p>
+      <w:r>
+        <w:rPr>
+          <w:b/>
+        </w:rPr>
+        <w:t>Every value has its proof.</w:t>
+      </w:r>
+      <w:r>
+        <w:t xml:space="preserve"> A card holds the offering's description, audiences, numbers (prices, ages, periods), questions, calls to action, tools and pages. Each value names where it came from: the menu entry, the page, the structured-data field, or the exact section and sentence. Nothing without proof is written. Each offering also shows how many independent places list it, so a reviewer can see which rest on a single menu.</w:t>
+      </w:r>
+    </w:p>
+    <w:p>
+      <w:r>
+        <w:rPr>
+          <w:b/>
+        </w:rPr>
+        <w:t>Optional local AI, never trusted blindly.</w:t>
+      </w:r>
+      <w:r>
+        <w:t xml:space="preserve"> When the company's own AI server (Ollama) is connected, two extra steps can run; only servers on this computer or the company network are accepted, so client content never leaves the company and nothing is paid:</w:t>
+      </w:r>
+    </w:p>
+    <w:p>
+      <w:pPr>
+        <w:pStyle w:val="ListBullet"/>
+      </w:pPr>
+      <w:r>
+        <w:t>Similar names are compared by meaning; two offerings are merged only when they are also in the same family and share words. Otherwise the pair is listed as a suggestion for a reviewer.</w:t>
+      </w:r>
+    </w:p>
+    <w:p>
+      <w:pPr>
+        <w:pStyle w:val="ListBullet"/>
+      </w:pPr>
+      <w:r>
+        <w:t>The AI reads each offering's sections and proposes features, deliverables, audiences and pricing. Each proposal must quote the section word for word; the engine checks the quote and drops anything that does not match. A proposed kind of offering (product, service, ...) is applied only when the page's structured data agrees; otherwise it is a suggestion.</w:t>
+      </w:r>
+    </w:p>
+    <w:p>
+      <w:r>
+        <w:t>On the live John Hancock run (303 addresses), without AI, in a few seconds: 5 families (Life insurance with Permanent, Hybrid, Term, Executive benefits and Vitality; Long-term care; Annuities with Individual and Group annuities; Investments; Retirement with IRAs) and 7 more offerings listed only in the footer (for example College savings, Rollover, Travel insurance), with 63 menu entries set aside as tasks, tools, content and corporate pages. 271 of the 272 pages were placed: 4 under Individual annuities, 267 under News and the podcast sections (this run's addresses were mostly news releases); 1 privacy PDF is unplaced.</w:t>
+      </w:r>
+    </w:p>
+    <w:p>
+      <w:pPr>
         <w:pStyle w:val="Heading1"/>
       </w:pPr>
       <w:r>
@@ -2837,7 +2915,7 @@
         <w:pStyle w:val="ListBullet"/>
       </w:pPr>
       <w:r>
-        <w:t>The rest of the knowledge base: the list of each website's offerings, labelling every page and section with them, search across sections, and competitor comparison and gap reports are designed but not built yet (step 1, stamping and sections, is done).</w:t>
+        <w:t>The rest of the knowledge base: labelling every page and section by its content (not only by its address), search across sections, and competitor comparison and gap reports are designed but not built yet (steps 1 and 2, stamping and the offering catalog, are done). The AI steps of the catalog have been tested against a simulated server only, until the company's Ollama server address is available.</w:t>
       </w:r>
     </w:p>
     <w:p>
@@ -3602,6 +3680,52 @@
           </w:p>
         </w:tc>
       </w:tr>
+      <w:tr>
+        <w:tc>
+          <w:tcPr>
+            <w:tcW w:type="dxa" w:w="4873"/>
+            <w:shd w:val="clear" w:color="auto" w:fill="EEF2F7"/>
+          </w:tcPr>
+          <w:p>
+            <w:pPr>
+              <w:spacing w:after="40"/>
+            </w:pPr>
+            <w:r>
+              <w:rPr>
+                <w:sz w:val="19"/>
+              </w:rPr>
+            </w:r>
+            <w:r>
+              <w:rPr>
+                <w:sz w:val="19"/>
+              </w:rPr>
+              <w:t>Offering catalog</w:t>
+            </w:r>
+          </w:p>
+        </w:tc>
+        <w:tc>
+          <w:tcPr>
+            <w:tcW w:type="dxa" w:w="4873"/>
+            <w:shd w:val="clear" w:color="auto" w:fill="EEF2F7"/>
+          </w:tcPr>
+          <w:p>
+            <w:pPr>
+              <w:spacing w:after="40"/>
+            </w:pPr>
+            <w:r>
+              <w:rPr>
+                <w:sz w:val="19"/>
+              </w:rPr>
+            </w:r>
+            <w:r>
+              <w:rPr>
+                <w:sz w:val="19"/>
+              </w:rPr>
+              <w:t>The tree of a website's offerings (families, offerings, sub-offerings), each with a card of evidenced facts.</w:t>
+            </w:r>
+          </w:p>
+        </w:tc>
+      </w:tr>
     </w:tbl>
     <w:p/>
     <w:p>
@@ -3694,7 +3818,7 @@
               <w:rPr>
                 <w:sz w:val="19"/>
               </w:rPr>
-              <w:t>2026-10-26</w:t>
+              <w:t>2026-10-27</w:t>
             </w:r>
           </w:p>
         </w:tc>
@@ -3715,7 +3839,7 @@
               <w:rPr>
                 <w:sz w:val="19"/>
               </w:rPr>
-              <w:t>Knowledge base step 1: a "stamp" command records each page's facts (titles, descriptions, structured data, menus, calls to action, numbers, dates), builds the site's full menu tree including mega-menus, leaves out images, error, placeholder and duplicate pages with the reason, and splits each page into sections that keep their page, heading and neighbours. John Hancock: 12 pages, 51 sections, a 72-entry menu tree, in about 9 seconds at $0.</w:t>
+              <w:t>Knowledge base step 2: a "catalog" command builds each website's offering catalog from its menus, structured data and folders, places every page under an offering or section, and fills evidence-backed cards; optional local AI adds checked features and suggestions. John Hancock (303 addresses): 5 families, 15 more offerings, 271 of 272 pages placed, at $0. Menu links that are script buttons are no longer read as page addresses.</w:t>
             </w:r>
           </w:p>
         </w:tc>
@@ -3761,7 +3885,7 @@
               <w:rPr>
                 <w:sz w:val="19"/>
               </w:rPr>
-              <w:t>Columns of wide tables that you scroll sideways are captured (they were wrongly treated as hidden). A page the browser cannot open is retried by itself over about five minutes instead of a few seconds. Live John Hancock, 303 pages: 279 verified.</w:t>
+              <w:t>Knowledge base step 1: a "stamp" command records each page's facts (titles, descriptions, structured data, menus, calls to action, numbers, dates), builds the site's full menu tree including mega-menus, leaves out images, error, placeholder and duplicate pages with the reason, and splits each page into sections that keep their page, heading and neighbours. John Hancock: 12 pages, 51 sections, a 72-entry menu tree, in about 9 seconds at $0.</w:t>
             </w:r>
           </w:p>
         </w:tc>
@@ -3805,7 +3929,7 @@
               <w:rPr>
                 <w:sz w:val="19"/>
               </w:rPr>
-              <w:t>Project report: each pair of matching pages is listed once, with the shared share in both directions.</w:t>
+              <w:t>Columns of wide tables that you scroll sideways are captured (they were wrongly treated as hidden). A page the browser cannot open is retried by itself over about five minutes instead of a few seconds. Live John Hancock, 303 pages: 279 verified.</w:t>
             </w:r>
           </w:p>
         </w:tc>
@@ -3829,7 +3953,7 @@
               <w:rPr>
                 <w:sz w:val="19"/>
               </w:rPr>
-              <w:t>2026-10-24</w:t>
+              <w:t>2026-10-26</w:t>
             </w:r>
           </w:p>
         </w:tc>
@@ -3851,7 +3975,7 @@
               <w:rPr>
                 <w:sz w:val="19"/>
               </w:rPr>
-              <w:t>New check that every line of text the browser shows was extracted. Web components no longer mistaken for hidden text; a duplicate copy of text never replaces the visible one; site tools (sign-in, country picker, chat) kept out of the content; words in side-by-side boxes no longer glued; a page is judged settled by its text, not by background elements.</w:t>
+              <w:t>Project report: each pair of matching pages is listed once, with the shared share in both directions.</w:t>
             </w:r>
           </w:p>
         </w:tc>
@@ -3874,7 +3998,7 @@
               <w:rPr>
                 <w:sz w:val="19"/>
               </w:rPr>
-              <w:t>2026-10-22</w:t>
+              <w:t>2026-10-24</w:t>
             </w:r>
           </w:p>
         </w:tc>
@@ -3895,7 +4019,7 @@
               <w:rPr>
                 <w:sz w:val="19"/>
               </w:rPr>
-              <w:t>Paid access (Bright Data) built but off by default: one approval per website with a spending cap, checked before every paid request, with a spending log.</w:t>
+              <w:t>New check that every line of text the browser shows was extracted. Web components no longer mistaken for hidden text; a duplicate copy of text never replaces the visible one; site tools (sign-in, country picker, chat) kept out of the content; words in side-by-side boxes no longer glued; a page is judged settled by its text, not by background elements.</w:t>
             </w:r>
           </w:p>
         </w:tc>
@@ -3919,7 +4043,7 @@
               <w:rPr>
                 <w:sz w:val="19"/>
               </w:rPr>
-              <w:t>2026-10-21</w:t>
+              <w:t>2026-10-22</w:t>
             </w:r>
           </w:p>
         </w:tc>
@@ -3941,7 +4065,7 @@
               <w:rPr>
                 <w:sz w:val="19"/>
               </w:rPr>
-              <w:t>Reviewers save decisions in the web app (with name, time and full history); the next report carries them forward.</w:t>
+              <w:t>Paid access (Bright Data) built but off by default: one approval per website with a spending cap, checked before every paid request, with a spending log.</w:t>
             </w:r>
           </w:p>
         </w:tc>
@@ -3985,7 +4109,7 @@
               <w:rPr>
                 <w:sz w:val="19"/>
               </w:rPr>
-              <w:t>Live John Hancock: 32 of 34 verified again with all checks on (the 2 others are placeholder pages). FAQ sections built as web components are now opened, text is matched the way the browser shows it, and a brief network hiccup no longer pauses a whole website.</w:t>
+              <w:t>Reviewers save decisions in the web app (with name, time and full history); the next report carries them forward.</w:t>
             </w:r>
           </w:p>
         </w:tc>
@@ -4009,7 +4133,7 @@
               <w:rPr>
                 <w:sz w:val="19"/>
               </w:rPr>
-              <w:t>2026-10-22</w:t>
+              <w:t>2026-10-21</w:t>
             </w:r>
           </w:p>
         </w:tc>
@@ -4031,7 +4155,7 @@
               <w:rPr>
                 <w:sz w:val="19"/>
               </w:rPr>
-              <w:t>Project report made unambiguous: an extraction-completeness statement and a High/Medium/Low confidence per page that always agree with the page's status; the confirmed share is named for what it measures; page text keeps its line breaks in Excel.</w:t>
+              <w:t>Live John Hancock: 32 of 34 verified again with all checks on (the 2 others are placeholder pages). FAQ sections built as web components are now opened, text is matched the way the browser shows it, and a brief network hiccup no longer pauses a whole website.</w:t>
             </w:r>
           </w:p>
         </w:tc>
@@ -4054,7 +4178,7 @@
               <w:rPr>
                 <w:sz w:val="19"/>
               </w:rPr>
-              <w:t>2026-10-21</w:t>
+              <w:t>2026-10-22</w:t>
             </w:r>
           </w:p>
         </w:tc>
@@ -4075,7 +4199,7 @@
               <w:rPr>
                 <w:sz w:val="19"/>
               </w:rPr>
-              <w:t>Project report: one Excel workbook per run with every page's text, whether it was fully extracted, the confirmed share and the confidence, plus, for every page, which other pages carry the same text and how much (exact matching).</w:t>
+              <w:t>Project report made unambiguous: an extraction-completeness statement and a High/Medium/Low confidence per page that always agree with the page's status; the confirmed share is named for what it measures; page text keeps its line breaks in Excel.</w:t>
             </w:r>
           </w:p>
         </w:tc>
@@ -4121,7 +4245,7 @@
               <w:rPr>
                 <w:sz w:val="19"/>
               </w:rPr>
-              <w:t>Evidence stored compactly: repeated fonts and style sheets kept once, the rest compressed, originals unchanged. About 18 times less disk on the live John Hancock run; a 5,000-page run now fits the 20 GB budget. Older evidence can be converted with one command.</w:t>
+              <w:t>Project report: one Excel workbook per run with every page's text, whether it was fully extracted, the confirmed share and the confidence, plus, for every page, which other pages carry the same text and how much (exact matching).</w:t>
             </w:r>
           </w:p>
         </w:tc>
@@ -4165,7 +4289,7 @@
               <w:rPr>
                 <w:sz w:val="19"/>
               </w:rPr>
-              <w:t>Crossed-out text (for example an old sale price) is kept and marked with ~~ instead of reading as a current price.</w:t>
+              <w:t>Evidence stored compactly: repeated fonts and style sheets kept once, the rest compressed, originals unchanged. About 18 times less disk on the live John Hancock run; a 5,000-page run now fits the 20 GB budget. Older evidence can be converted with one command.</w:t>
             </w:r>
           </w:p>
         </w:tc>
@@ -4189,7 +4313,7 @@
               <w:rPr>
                 <w:sz w:val="19"/>
               </w:rPr>
-              <w:t>2026-10-20</w:t>
+              <w:t>2026-10-21</w:t>
             </w:r>
           </w:p>
         </w:tc>
@@ -4211,7 +4335,7 @@
               <w:rPr>
                 <w:sz w:val="19"/>
               </w:rPr>
-              <w:t>Report file names start with the run's name, so downloads from different runs stay separate.</w:t>
+              <w:t>Crossed-out text (for example an old sale price) is kept and marked with ~~ instead of reading as a current price.</w:t>
             </w:r>
           </w:p>
         </w:tc>
@@ -4255,7 +4379,7 @@
               <w:rPr>
                 <w:sz w:val="19"/>
               </w:rPr>
-              <w:t>Analyst web app for reviewing runs in a browser. Optional grouping of pages by design template, so shared files are fetched once per group.</w:t>
+              <w:t>Report file names start with the run's name, so downloads from different runs stay separate.</w:t>
             </w:r>
           </w:p>
         </w:tc>
@@ -4301,7 +4425,7 @@
               <w:rPr>
                 <w:sz w:val="19"/>
               </w:rPr>
-              <w:t>Image and scanned-text reading switched on (Tesseract with 25 languages, found automatically). The visual-text check was tuned on the live John Hancock site so ordinary reading errors and cookie banners no longer cause false alarms. Images and PDFs no longer wait for a browser exploration they cannot have. Automated quality pipeline (CI) added. Live re-run: 3 of 34 verified, with the stricter checks finding real missing text.</w:t>
+              <w:t>Analyst web app for reviewing runs in a browser. Optional grouping of pages by design template, so shared files are fetched once per group.</w:t>
             </w:r>
           </w:p>
         </w:tc>
@@ -4345,7 +4469,7 @@
               <w:rPr>
                 <w:sz w:val="19"/>
               </w:rPr>
-              <w:t>Six safety and accuracy fixes (failed image reading no longer reported as verified; compressed pages decoded correctly; paused websites resume; paid access always needs approval; connections locked to the checked address; contradiction report no longer confuses dated snapshots or different products). Critical-fact check (R9) added. Tesseract OCR installed with 25 languages.</w:t>
+              <w:t>Image and scanned-text reading switched on (Tesseract with 25 languages, found automatically). The visual-text check was tuned on the live John Hancock site so ordinary reading errors and cookie banners no longer cause false alarms. Images and PDFs no longer wait for a browser exploration they cannot have. Automated quality pipeline (CI) added. Live re-run: 3 of 34 verified, with the stricter checks finding real missing text.</w:t>
             </w:r>
           </w:p>
         </w:tc>
@@ -4369,7 +4493,7 @@
               <w:rPr>
                 <w:sz w:val="19"/>
               </w:rPr>
-              <w:t>2026-10-19</w:t>
+              <w:t>2026-10-20</w:t>
             </w:r>
           </w:p>
         </w:tc>
@@ -4391,7 +4515,7 @@
               <w:rPr>
                 <w:sz w:val="19"/>
               </w:rPr>
-              <w:t>Browser exploration reaches 32 of 34 verified on John Hancock. Checks R6–R8 and R11–R13, page settling and evidence integrity added. Contradiction report (R4), paywall detection, run budgets, robots crawl-delay saved, stuck tasks reported. Office documents (Word, Excel, PowerPoint) supported. 222-case test inventory.</w:t>
+              <w:t>Six safety and accuracy fixes (failed image reading no longer reported as verified; compressed pages decoded correctly; paused websites resume; paid access always needs approval; connections locked to the checked address; contradiction report no longer confuses dated snapshots or different products). Critical-fact check (R9) added. Tesseract OCR installed with 25 languages.</w:t>
             </w:r>
           </w:p>
         </w:tc>
@@ -4414,7 +4538,7 @@
               <w:rPr>
                 <w:sz w:val="19"/>
               </w:rPr>
-              <w:t>2026-10-16</w:t>
+              <w:t>2026-10-19</w:t>
             </w:r>
           </w:p>
         </w:tc>
@@ -4435,7 +4559,7 @@
               <w:rPr>
                 <w:sz w:val="19"/>
               </w:rPr>
-              <w:t>Per-page verdicts with evidence, first checks (R1–R3, R10), reports (R1 content, review queue, overlap), offline explorer, run engine and command line.</w:t>
+              <w:t>Browser exploration reaches 32 of 34 verified on John Hancock. Checks R6–R8 and R11–R13, page settling and evidence integrity added. Contradiction report (R4), paywall detection, run budgets, robots crawl-delay saved, stuck tasks reported. Office documents (Word, Excel, PowerPoint) supported. 222-case test inventory.</w:t>
             </w:r>
           </w:p>
         </w:tc>
@@ -4459,7 +4583,7 @@
               <w:rPr>
                 <w:sz w:val="19"/>
               </w:rPr>
-              <w:t>2026-10-15</w:t>
+              <w:t>2026-10-16</w:t>
             </w:r>
           </w:p>
         </w:tc>
@@ -4467,6 +4591,50 @@
           <w:tcPr>
             <w:tcW w:type="dxa" w:w="4873"/>
             <w:shd w:val="clear" w:color="auto" w:fill="EEF2F7"/>
+          </w:tcPr>
+          <w:p>
+            <w:pPr>
+              <w:spacing w:after="40"/>
+            </w:pPr>
+            <w:r>
+              <w:rPr>
+                <w:sz w:val="19"/>
+              </w:rPr>
+            </w:r>
+            <w:r>
+              <w:rPr>
+                <w:sz w:val="19"/>
+              </w:rPr>
+              <w:t>Per-page verdicts with evidence, first checks (R1–R3, R10), reports (R1 content, review queue, overlap), offline explorer, run engine and command line.</w:t>
+            </w:r>
+          </w:p>
+        </w:tc>
+      </w:tr>
+      <w:tr>
+        <w:tc>
+          <w:tcPr>
+            <w:tcW w:type="dxa" w:w="4873"/>
+          </w:tcPr>
+          <w:p>
+            <w:pPr>
+              <w:spacing w:after="40"/>
+            </w:pPr>
+            <w:r>
+              <w:rPr>
+                <w:sz w:val="19"/>
+              </w:rPr>
+            </w:r>
+            <w:r>
+              <w:rPr>
+                <w:sz w:val="19"/>
+              </w:rPr>
+              <w:t>2026-10-15</w:t>
+            </w:r>
+          </w:p>
+        </w:tc>
+        <w:tc>
+          <w:tcPr>
+            <w:tcW w:type="dxa" w:w="4873"/>
           </w:tcPr>
           <w:p>
             <w:pPr>

</xml_diff>

<commit_message>
Global URL history across runs; reuse age limit; report audit columns
Every run now looks each URL up in the tenant's SQLite history (all earlier
runs) and adds its own records at the end. Unchanged pages (304, identical
bytes or visible text) reuse the earlier extraction; captures extracted more
than 30 days ago (or before --reuse-since) are compared but re-extracted.
Failed captures never replace good ones; missing evidence is never reused.
`history import|show|stats` command. Project report gains Last scraped,
Site last modified and Scrape action columns.

Co-Authored-By: Claude Opus 5.5 <noreply@anthropic.com>
</commit_message>
<xml_diff>
--- a/Content_Processor_Guide.docx
+++ b/Content_Processor_Guide.docx
@@ -17,7 +17,7 @@
           <w:color w:val="595959"/>
           <w:sz w:val="19"/>
         </w:rPr>
-        <w:t>Last updated: 26 October 2026 · Code version: main after page stamping (step 1) and the offering catalog (step 2) of the knowledge base · Maintained by every session that adds a significant feature (see "Keeping this guide current" at the end)</w:t>
+        <w:t>Last updated: 26 October 2026 · Code version: main after page stamping (step 1), the offering catalog (step 2) and the URL history across runs · Maintained by every session that adds a significant feature (see "Keeping this guide current" at the end)</w:t>
       </w:r>
     </w:p>
     <w:p>
@@ -1038,6 +1038,94 @@
         <w:pStyle w:val="Heading2"/>
       </w:pPr>
       <w:r>
+        <w:t>Remembering every page across runs (re-visits)</w:t>
+      </w:r>
+    </w:p>
+    <w:p>
+      <w:r>
+        <w:t>The engine remembers every page it has captured, in every run, for each client account. When a new list of addresses arrives (some seen before, some new), each address is looked up in that memory first:</w:t>
+      </w:r>
+    </w:p>
+    <w:p>
+      <w:pPr>
+        <w:pStyle w:val="ListBullet"/>
+      </w:pPr>
+      <w:r>
+        <w:rPr>
+          <w:b/>
+        </w:rPr>
+        <w:t>Never seen before</w:t>
+      </w:r>
+      <w:r>
+        <w:t>: captured in full ("New page").</w:t>
+      </w:r>
+    </w:p>
+    <w:p>
+      <w:pPr>
+        <w:pStyle w:val="ListBullet"/>
+      </w:pPr>
+      <w:r>
+        <w:rPr>
+          <w:b/>
+        </w:rPr>
+        <w:t>Seen before</w:t>
+      </w:r>
+      <w:r>
+        <w:t>: the engine asks the website politely whether the page changed since last time (a light request that the server can answer with "not modified"). If the server says it did not change, or the file is identical, or its visible text is word-for-word the same, the earlier extraction is reused: no browser, no exploring, no image reading ("Reused (unchanged)"). Only pages that changed go through the full process again ("Re-scraped (updated)").</w:t>
+      </w:r>
+    </w:p>
+    <w:p>
+      <w:pPr>
+        <w:pStyle w:val="ListBullet"/>
+      </w:pPr>
+      <w:r>
+        <w:rPr>
+          <w:b/>
+        </w:rPr>
+        <w:t>The text decides, not the date</w:t>
+      </w:r>
+      <w:r>
+        <w:t>: a page whose wording changed is captured again even when the website forgot to update its "last modified" date, and a page whose date moved but whose text is identical is reused.</w:t>
+      </w:r>
+    </w:p>
+    <w:p>
+      <w:pPr>
+        <w:pStyle w:val="ListBullet"/>
+      </w:pPr>
+      <w:r>
+        <w:rPr>
+          <w:b/>
+        </w:rPr>
+        <w:t>Old memories are not trusted forever</w:t>
+      </w:r>
+      <w:r>
+        <w:t>: an extraction older than 30 days (changeable per run, or "only reuse what was captured after a given date", for example after an improvement to the engine) is compared but captured again in full, so improvements to the engine reach every page. A page reused run after run still ages from the day it was actually read.</w:t>
+      </w:r>
+    </w:p>
+    <w:p>
+      <w:pPr>
+        <w:pStyle w:val="ListBullet"/>
+      </w:pPr>
+      <w:r>
+        <w:rPr>
+          <w:b/>
+        </w:rPr>
+        <w:t>A bad day never erases what is known</w:t>
+      </w:r>
+      <w:r>
+        <w:t>: a failed or blocked visit is recorded but does not replace the last good capture, and a capture whose stored evidence is missing is not reused.</w:t>
+      </w:r>
+    </w:p>
+    <w:p>
+      <w:r>
+        <w:t>The memory lives next to the evidence for that client account, and one command can add older runs to it. This makes repeat runs much faster and gentler on websites: unchanged pages cost one light request instead of a full browser visit. On the two John Hancock runs it holds 357 captures of 308 pages from 16 batches, in under 5 MB.</w:t>
+      </w:r>
+    </w:p>
+    <w:p>
+      <w:pPr>
+        <w:pStyle w:val="Heading2"/>
+      </w:pPr>
+      <w:r>
         <w:t>Step 5: Reading the page's text</w:t>
       </w:r>
     </w:p>
@@ -1967,7 +2055,7 @@
               <w:rPr>
                 <w:sz w:val="19"/>
               </w:rPr>
-              <w:t>The one workbook most people need. Sheet "Pages": every address with its whole text (line breaks shown), whether it was fully extracted (Yes/No), a plain "Extraction completeness" statement ("Complete", "Incomplete: 1 tab not opened (Pricing)", "Complete, but the page kept changing", "Placeholder page (Lorem ipsum)"), an overall Confidence of High, Medium or Low that can only be High when the page is fully captured, the share of the captured text confirmed against the live page, how reliably it was read (text from the page's code is 100%, text read from images lower), and what is missing. Sheet "Matching content": every pair of addresses that carry the same text, listed once (A with B is never repeated as B with A), by exact word-for-word matching (menus, headers and footers left out), with two percentages: how much of the first page's text is on the second, and how much of the second's is on the first. They differ when the pages differ in length: a short page can be 100% inside a long page while the long page is only 20% inside the short one. To see every match of one page, look for it in both address columns. Very long page text that does not fit in one Excel cell continues in extra "Content_part_2", "Content_part_3" columns; "Content_parts" says how many cells the text uses and "Content_split" says whether it was split (normally 1 and FALSE). Sheet "How to read" explains every column.</w:t>
+              <w:t>The one workbook most people need. Sheet "Pages": every address with its whole text (line breaks shown), whether it was fully extracted (Yes/No), when its content was last scraped, when the site says it last changed, and what this run did with it ("New page", "Reused (unchanged: server said not modified)", "Re-scraped (updated: visible text changed)"), a plain "Extraction completeness" statement ("Complete", "Incomplete: 1 tab not opened (Pricing)", "Complete, but the page kept changing", "Placeholder page (Lorem ipsum)"), an overall Confidence of High, Medium or Low that can only be High when the page is fully captured, the share of the captured text confirmed against the live page, how reliably it was read (text from the page's code is 100%, text read from images lower), and what is missing. Sheet "Matching content": every pair of addresses that carry the same text, listed once (A with B is never repeated as B with A), by exact word-for-word matching (menus, headers and footers left out), with two percentages: how much of the first page's text is on the second, and how much of the second's is on the first. They differ when the pages differ in length: a short page can be 100% inside a long page while the long page is only 20% inside the short one. To see every match of one page, look for it in both address columns. Very long page text that does not fit in one Excel cell continues in extra "Content_part_2", "Content_part_3" columns; "Content_parts" says how many cells the text uses and "Content_split" says whether it was split (normally 1 and FALSE). Sheet "How to read" explains every column.</w:t>
             </w:r>
           </w:p>
         </w:tc>
@@ -3564,7 +3652,7 @@
               <w:rPr>
                 <w:sz w:val="19"/>
               </w:rPr>
-              <w:t>Stamp</w:t>
+              <w:t>URL history</w:t>
             </w:r>
           </w:p>
         </w:tc>
@@ -3585,7 +3673,7 @@
               <w:rPr>
                 <w:sz w:val="19"/>
               </w:rPr>
-              <w:t>The set of facts recorded about one page before it goes into the knowledge base.</w:t>
+              <w:t>The engine's memory of every page captured in every run, used to reuse unchanged pages.</w:t>
             </w:r>
           </w:p>
         </w:tc>
@@ -3609,7 +3697,7 @@
               <w:rPr>
                 <w:sz w:val="19"/>
               </w:rPr>
-              <w:t>Chunk (section)</w:t>
+              <w:t>Stamp</w:t>
             </w:r>
           </w:p>
         </w:tc>
@@ -3631,7 +3719,7 @@
               <w:rPr>
                 <w:sz w:val="19"/>
               </w:rPr>
-              <w:t>A piece of a page's content, a few hundred words long, that keeps a note of which page and heading it came from.</w:t>
+              <w:t>The set of facts recorded about one page before it goes into the knowledge base.</w:t>
             </w:r>
           </w:p>
         </w:tc>
@@ -3654,7 +3742,7 @@
               <w:rPr>
                 <w:sz w:val="19"/>
               </w:rPr>
-              <w:t>Offering</w:t>
+              <w:t>Chunk (section)</w:t>
             </w:r>
           </w:p>
         </w:tc>
@@ -3675,7 +3763,7 @@
               <w:rPr>
                 <w:sz w:val="19"/>
               </w:rPr>
-              <w:t>A service, product or practice a website offers; the knowledge base maps every page to them.</w:t>
+              <w:t>A piece of a page's content, a few hundred words long, that keeps a note of which page and heading it came from.</w:t>
             </w:r>
           </w:p>
         </w:tc>
@@ -3699,7 +3787,7 @@
               <w:rPr>
                 <w:sz w:val="19"/>
               </w:rPr>
-              <w:t>Offering catalog</w:t>
+              <w:t>Offering</w:t>
             </w:r>
           </w:p>
         </w:tc>
@@ -3707,6 +3795,50 @@
           <w:tcPr>
             <w:tcW w:type="dxa" w:w="4873"/>
             <w:shd w:val="clear" w:color="auto" w:fill="EEF2F7"/>
+          </w:tcPr>
+          <w:p>
+            <w:pPr>
+              <w:spacing w:after="40"/>
+            </w:pPr>
+            <w:r>
+              <w:rPr>
+                <w:sz w:val="19"/>
+              </w:rPr>
+            </w:r>
+            <w:r>
+              <w:rPr>
+                <w:sz w:val="19"/>
+              </w:rPr>
+              <w:t>A service, product or practice a website offers; the knowledge base maps every page to them.</w:t>
+            </w:r>
+          </w:p>
+        </w:tc>
+      </w:tr>
+      <w:tr>
+        <w:tc>
+          <w:tcPr>
+            <w:tcW w:type="dxa" w:w="4873"/>
+          </w:tcPr>
+          <w:p>
+            <w:pPr>
+              <w:spacing w:after="40"/>
+            </w:pPr>
+            <w:r>
+              <w:rPr>
+                <w:sz w:val="19"/>
+              </w:rPr>
+            </w:r>
+            <w:r>
+              <w:rPr>
+                <w:sz w:val="19"/>
+              </w:rPr>
+              <w:t>Offering catalog</w:t>
+            </w:r>
+          </w:p>
+        </w:tc>
+        <w:tc>
+          <w:tcPr>
+            <w:tcW w:type="dxa" w:w="4873"/>
           </w:tcPr>
           <w:p>
             <w:pPr>
@@ -3839,7 +3971,7 @@
               <w:rPr>
                 <w:sz w:val="19"/>
               </w:rPr>
-              <w:t>Knowledge base step 2: a "catalog" command builds each website's offering catalog from its menus, structured data and folders, places every page under an offering or section, and fills evidence-backed cards; optional local AI adds checked features and suggestions. John Hancock (303 addresses): 5 families, 15 more offerings, 271 of 272 pages placed, at $0. Menu links that are script buttons are no longer read as page addresses.</w:t>
+              <w:t>URL history across runs: every run checks each address against all earlier runs, reuses pages that did not change (the server says so, or the file or its visible text is identical), captures changed and new pages in full, and never reuses an extraction older than 30 days. The project report gains "Last scraped", "Site last modified" and "Scrape action" columns.</w:t>
             </w:r>
           </w:p>
         </w:tc>
@@ -3863,7 +3995,7 @@
               <w:rPr>
                 <w:sz w:val="19"/>
               </w:rPr>
-              <w:t>2026-10-26</w:t>
+              <w:t>2026-10-27</w:t>
             </w:r>
           </w:p>
         </w:tc>
@@ -3885,7 +4017,7 @@
               <w:rPr>
                 <w:sz w:val="19"/>
               </w:rPr>
-              <w:t>Knowledge base step 1: a "stamp" command records each page's facts (titles, descriptions, structured data, menus, calls to action, numbers, dates), builds the site's full menu tree including mega-menus, leaves out images, error, placeholder and duplicate pages with the reason, and splits each page into sections that keep their page, heading and neighbours. John Hancock: 12 pages, 51 sections, a 72-entry menu tree, in about 9 seconds at $0.</w:t>
+              <w:t>Knowledge base step 2: a "catalog" command builds each website's offering catalog from its menus, structured data and folders, places every page under an offering or section, and fills evidence-backed cards; optional local AI adds checked features and suggestions. John Hancock (303 addresses): 5 families, 15 more offerings, 271 of 272 pages placed, at $0. Menu links that are script buttons are no longer read as page addresses.</w:t>
             </w:r>
           </w:p>
         </w:tc>
@@ -3929,7 +4061,7 @@
               <w:rPr>
                 <w:sz w:val="19"/>
               </w:rPr>
-              <w:t>Columns of wide tables that you scroll sideways are captured (they were wrongly treated as hidden). A page the browser cannot open is retried by itself over about five minutes instead of a few seconds. Live John Hancock, 303 pages: 279 verified.</w:t>
+              <w:t>Knowledge base step 1: a "stamp" command records each page's facts (titles, descriptions, structured data, menus, calls to action, numbers, dates), builds the site's full menu tree including mega-menus, leaves out images, error, placeholder and duplicate pages with the reason, and splits each page into sections that keep their page, heading and neighbours. John Hancock: 12 pages, 51 sections, a 72-entry menu tree, in about 9 seconds at $0.</w:t>
             </w:r>
           </w:p>
         </w:tc>
@@ -3975,7 +4107,7 @@
               <w:rPr>
                 <w:sz w:val="19"/>
               </w:rPr>
-              <w:t>Project report: each pair of matching pages is listed once, with the shared share in both directions.</w:t>
+              <w:t>Columns of wide tables that you scroll sideways are captured (they were wrongly treated as hidden). A page the browser cannot open is retried by itself over about five minutes instead of a few seconds. Live John Hancock, 303 pages: 279 verified.</w:t>
             </w:r>
           </w:p>
         </w:tc>
@@ -3998,7 +4130,7 @@
               <w:rPr>
                 <w:sz w:val="19"/>
               </w:rPr>
-              <w:t>2026-10-24</w:t>
+              <w:t>2026-10-26</w:t>
             </w:r>
           </w:p>
         </w:tc>
@@ -4019,7 +4151,7 @@
               <w:rPr>
                 <w:sz w:val="19"/>
               </w:rPr>
-              <w:t>New check that every line of text the browser shows was extracted. Web components no longer mistaken for hidden text; a duplicate copy of text never replaces the visible one; site tools (sign-in, country picker, chat) kept out of the content; words in side-by-side boxes no longer glued; a page is judged settled by its text, not by background elements.</w:t>
+              <w:t>Project report: each pair of matching pages is listed once, with the shared share in both directions.</w:t>
             </w:r>
           </w:p>
         </w:tc>
@@ -4043,7 +4175,7 @@
               <w:rPr>
                 <w:sz w:val="19"/>
               </w:rPr>
-              <w:t>2026-10-22</w:t>
+              <w:t>2026-10-24</w:t>
             </w:r>
           </w:p>
         </w:tc>
@@ -4065,7 +4197,7 @@
               <w:rPr>
                 <w:sz w:val="19"/>
               </w:rPr>
-              <w:t>Paid access (Bright Data) built but off by default: one approval per website with a spending cap, checked before every paid request, with a spending log.</w:t>
+              <w:t>New check that every line of text the browser shows was extracted. Web components no longer mistaken for hidden text; a duplicate copy of text never replaces the visible one; site tools (sign-in, country picker, chat) kept out of the content; words in side-by-side boxes no longer glued; a page is judged settled by its text, not by background elements.</w:t>
             </w:r>
           </w:p>
         </w:tc>
@@ -4088,7 +4220,7 @@
               <w:rPr>
                 <w:sz w:val="19"/>
               </w:rPr>
-              <w:t>2026-10-21</w:t>
+              <w:t>2026-10-22</w:t>
             </w:r>
           </w:p>
         </w:tc>
@@ -4109,7 +4241,7 @@
               <w:rPr>
                 <w:sz w:val="19"/>
               </w:rPr>
-              <w:t>Reviewers save decisions in the web app (with name, time and full history); the next report carries them forward.</w:t>
+              <w:t>Paid access (Bright Data) built but off by default: one approval per website with a spending cap, checked before every paid request, with a spending log.</w:t>
             </w:r>
           </w:p>
         </w:tc>
@@ -4155,7 +4287,7 @@
               <w:rPr>
                 <w:sz w:val="19"/>
               </w:rPr>
-              <w:t>Live John Hancock: 32 of 34 verified again with all checks on (the 2 others are placeholder pages). FAQ sections built as web components are now opened, text is matched the way the browser shows it, and a brief network hiccup no longer pauses a whole website.</w:t>
+              <w:t>Reviewers save decisions in the web app (with name, time and full history); the next report carries them forward.</w:t>
             </w:r>
           </w:p>
         </w:tc>
@@ -4178,7 +4310,7 @@
               <w:rPr>
                 <w:sz w:val="19"/>
               </w:rPr>
-              <w:t>2026-10-22</w:t>
+              <w:t>2026-10-21</w:t>
             </w:r>
           </w:p>
         </w:tc>
@@ -4199,7 +4331,7 @@
               <w:rPr>
                 <w:sz w:val="19"/>
               </w:rPr>
-              <w:t>Project report made unambiguous: an extraction-completeness statement and a High/Medium/Low confidence per page that always agree with the page's status; the confirmed share is named for what it measures; page text keeps its line breaks in Excel.</w:t>
+              <w:t>Live John Hancock: 32 of 34 verified again with all checks on (the 2 others are placeholder pages). FAQ sections built as web components are now opened, text is matched the way the browser shows it, and a brief network hiccup no longer pauses a whole website.</w:t>
             </w:r>
           </w:p>
         </w:tc>
@@ -4223,7 +4355,7 @@
               <w:rPr>
                 <w:sz w:val="19"/>
               </w:rPr>
-              <w:t>2026-10-21</w:t>
+              <w:t>2026-10-22</w:t>
             </w:r>
           </w:p>
         </w:tc>
@@ -4245,7 +4377,7 @@
               <w:rPr>
                 <w:sz w:val="19"/>
               </w:rPr>
-              <w:t>Project report: one Excel workbook per run with every page's text, whether it was fully extracted, the confirmed share and the confidence, plus, for every page, which other pages carry the same text and how much (exact matching).</w:t>
+              <w:t>Project report made unambiguous: an extraction-completeness statement and a High/Medium/Low confidence per page that always agree with the page's status; the confirmed share is named for what it measures; page text keeps its line breaks in Excel.</w:t>
             </w:r>
           </w:p>
         </w:tc>
@@ -4289,7 +4421,7 @@
               <w:rPr>
                 <w:sz w:val="19"/>
               </w:rPr>
-              <w:t>Evidence stored compactly: repeated fonts and style sheets kept once, the rest compressed, originals unchanged. About 18 times less disk on the live John Hancock run; a 5,000-page run now fits the 20 GB budget. Older evidence can be converted with one command.</w:t>
+              <w:t>Project report: one Excel workbook per run with every page's text, whether it was fully extracted, the confirmed share and the confidence, plus, for every page, which other pages carry the same text and how much (exact matching).</w:t>
             </w:r>
           </w:p>
         </w:tc>
@@ -4335,7 +4467,7 @@
               <w:rPr>
                 <w:sz w:val="19"/>
               </w:rPr>
-              <w:t>Crossed-out text (for example an old sale price) is kept and marked with ~~ instead of reading as a current price.</w:t>
+              <w:t>Evidence stored compactly: repeated fonts and style sheets kept once, the rest compressed, originals unchanged. About 18 times less disk on the live John Hancock run; a 5,000-page run now fits the 20 GB budget. Older evidence can be converted with one command.</w:t>
             </w:r>
           </w:p>
         </w:tc>
@@ -4358,7 +4490,7 @@
               <w:rPr>
                 <w:sz w:val="19"/>
               </w:rPr>
-              <w:t>2026-10-20</w:t>
+              <w:t>2026-10-21</w:t>
             </w:r>
           </w:p>
         </w:tc>
@@ -4379,7 +4511,7 @@
               <w:rPr>
                 <w:sz w:val="19"/>
               </w:rPr>
-              <w:t>Report file names start with the run's name, so downloads from different runs stay separate.</w:t>
+              <w:t>Crossed-out text (for example an old sale price) is kept and marked with ~~ instead of reading as a current price.</w:t>
             </w:r>
           </w:p>
         </w:tc>
@@ -4425,7 +4557,7 @@
               <w:rPr>
                 <w:sz w:val="19"/>
               </w:rPr>
-              <w:t>Analyst web app for reviewing runs in a browser. Optional grouping of pages by design template, so shared files are fetched once per group.</w:t>
+              <w:t>Report file names start with the run's name, so downloads from different runs stay separate.</w:t>
             </w:r>
           </w:p>
         </w:tc>
@@ -4469,7 +4601,7 @@
               <w:rPr>
                 <w:sz w:val="19"/>
               </w:rPr>
-              <w:t>Image and scanned-text reading switched on (Tesseract with 25 languages, found automatically). The visual-text check was tuned on the live John Hancock site so ordinary reading errors and cookie banners no longer cause false alarms. Images and PDFs no longer wait for a browser exploration they cannot have. Automated quality pipeline (CI) added. Live re-run: 3 of 34 verified, with the stricter checks finding real missing text.</w:t>
+              <w:t>Analyst web app for reviewing runs in a browser. Optional grouping of pages by design template, so shared files are fetched once per group.</w:t>
             </w:r>
           </w:p>
         </w:tc>
@@ -4515,7 +4647,7 @@
               <w:rPr>
                 <w:sz w:val="19"/>
               </w:rPr>
-              <w:t>Six safety and accuracy fixes (failed image reading no longer reported as verified; compressed pages decoded correctly; paused websites resume; paid access always needs approval; connections locked to the checked address; contradiction report no longer confuses dated snapshots or different products). Critical-fact check (R9) added. Tesseract OCR installed with 25 languages.</w:t>
+              <w:t>Image and scanned-text reading switched on (Tesseract with 25 languages, found automatically). The visual-text check was tuned on the live John Hancock site so ordinary reading errors and cookie banners no longer cause false alarms. Images and PDFs no longer wait for a browser exploration they cannot have. Automated quality pipeline (CI) added. Live re-run: 3 of 34 verified, with the stricter checks finding real missing text.</w:t>
             </w:r>
           </w:p>
         </w:tc>
@@ -4538,7 +4670,7 @@
               <w:rPr>
                 <w:sz w:val="19"/>
               </w:rPr>
-              <w:t>2026-10-19</w:t>
+              <w:t>2026-10-20</w:t>
             </w:r>
           </w:p>
         </w:tc>
@@ -4559,7 +4691,7 @@
               <w:rPr>
                 <w:sz w:val="19"/>
               </w:rPr>
-              <w:t>Browser exploration reaches 32 of 34 verified on John Hancock. Checks R6–R8 and R11–R13, page settling and evidence integrity added. Contradiction report (R4), paywall detection, run budgets, robots crawl-delay saved, stuck tasks reported. Office documents (Word, Excel, PowerPoint) supported. 222-case test inventory.</w:t>
+              <w:t>Six safety and accuracy fixes (failed image reading no longer reported as verified; compressed pages decoded correctly; paused websites resume; paid access always needs approval; connections locked to the checked address; contradiction report no longer confuses dated snapshots or different products). Critical-fact check (R9) added. Tesseract OCR installed with 25 languages.</w:t>
             </w:r>
           </w:p>
         </w:tc>
@@ -4583,7 +4715,7 @@
               <w:rPr>
                 <w:sz w:val="19"/>
               </w:rPr>
-              <w:t>2026-10-16</w:t>
+              <w:t>2026-10-19</w:t>
             </w:r>
           </w:p>
         </w:tc>
@@ -4605,7 +4737,7 @@
               <w:rPr>
                 <w:sz w:val="19"/>
               </w:rPr>
-              <w:t>Per-page verdicts with evidence, first checks (R1–R3, R10), reports (R1 content, review queue, overlap), offline explorer, run engine and command line.</w:t>
+              <w:t>Browser exploration reaches 32 of 34 verified on John Hancock. Checks R6–R8 and R11–R13, page settling and evidence integrity added. Contradiction report (R4), paywall detection, run budgets, robots crawl-delay saved, stuck tasks reported. Office documents (Word, Excel, PowerPoint) supported. 222-case test inventory.</w:t>
             </w:r>
           </w:p>
         </w:tc>
@@ -4628,13 +4760,59 @@
               <w:rPr>
                 <w:sz w:val="19"/>
               </w:rPr>
-              <w:t>2026-10-15</w:t>
+              <w:t>2026-10-16</w:t>
             </w:r>
           </w:p>
         </w:tc>
         <w:tc>
           <w:tcPr>
             <w:tcW w:type="dxa" w:w="4873"/>
+          </w:tcPr>
+          <w:p>
+            <w:pPr>
+              <w:spacing w:after="40"/>
+            </w:pPr>
+            <w:r>
+              <w:rPr>
+                <w:sz w:val="19"/>
+              </w:rPr>
+            </w:r>
+            <w:r>
+              <w:rPr>
+                <w:sz w:val="19"/>
+              </w:rPr>
+              <w:t>Per-page verdicts with evidence, first checks (R1–R3, R10), reports (R1 content, review queue, overlap), offline explorer, run engine and command line.</w:t>
+            </w:r>
+          </w:p>
+        </w:tc>
+      </w:tr>
+      <w:tr>
+        <w:tc>
+          <w:tcPr>
+            <w:tcW w:type="dxa" w:w="4873"/>
+            <w:shd w:val="clear" w:color="auto" w:fill="EEF2F7"/>
+          </w:tcPr>
+          <w:p>
+            <w:pPr>
+              <w:spacing w:after="40"/>
+            </w:pPr>
+            <w:r>
+              <w:rPr>
+                <w:sz w:val="19"/>
+              </w:rPr>
+            </w:r>
+            <w:r>
+              <w:rPr>
+                <w:sz w:val="19"/>
+              </w:rPr>
+              <w:t>2026-10-15</w:t>
+            </w:r>
+          </w:p>
+        </w:tc>
+        <w:tc>
+          <w:tcPr>
+            <w:tcW w:type="dxa" w:w="4873"/>
+            <w:shd w:val="clear" w:color="auto" w:fill="EEF2F7"/>
           </w:tcPr>
           <w:p>
             <w:pPr>

</xml_diff>

<commit_message>
A bot check met by the download hands the page to the real browser
A JS challenge at T1 escalates the host to T3, which no HTTP fetcher serves, so
the page used to end BLOCKED without a render. With a render stage in the run,
the page is now queued for the browser; a clean render replaces the download's
block verdict, and a browser challenged too reports the block at T3.
Guide and lane log updated.

Co-Authored-By: Claude Opus 5.5 <noreply@anthropic.com>
</commit_message>
<xml_diff>
--- a/Content_Processor_Guide.docx
+++ b/Content_Processor_Guide.docx
@@ -17,7 +17,7 @@
           <w:color w:val="595959"/>
           <w:sz w:val="19"/>
         </w:rPr>
-        <w:t>Last updated: 27 October 2026 · Code version: main after page stamping (step 1) and the offering catalog (step 2) of the knowledge base, URL history (only new or changed pages are scraped again), the report's Last checked / Site last updated / Action columns, and cookie/chat widgets read at screenshot time · Maintained by every session that adds a significant feature (see "Keeping this guide current" at the end)</w:t>
+        <w:t>Last updated: 27 October 2026 · Code version: main after pages that meet a bot check being handed to the real browser, page stamping (step 1) and the offering catalog (step 2) of the knowledge base, URL history (only new or changed pages are scraped again), the report's Last checked / Site last updated / Action columns, and cookie/chat widgets read at screenshot time · Maintained by every session that adds a significant feature (see "Keeping this guide current" at the end)</w:t>
       </w:r>
     </w:p>
     <w:p>
@@ -1013,6 +1013,11 @@
     <w:p>
       <w:r>
         <w:t>The engine climbs the ladder only as far as needed. It never enters a paid rung on its own: it stops and asks.</w:t>
+      </w:r>
+    </w:p>
+    <w:p>
+      <w:r>
+        <w:t>When a download meets a bot check (for example Cloudflare's "Just a moment..." page), the page is handed to the real browser (T3) instead of being given up. If the browser gets through, the page is read and checked like any other; if the browser is stopped too, the page is reported as blocked, with the rung where it happened, and paid access can be approved for that website.</w:t>
       </w:r>
     </w:p>
     <w:p>
@@ -3886,7 +3891,7 @@
               <w:rPr>
                 <w:sz w:val="19"/>
               </w:rPr>
-              <w:t>Knowledge base step 2: a "catalog" command builds each website's offering catalog from its menus, structured data and folders, places every page under an offering or section, and fills evidence-backed cards; optional local AI adds checked features and suggestions. John Hancock (303 addresses): 5 families, 15 more offerings, 271 of 272 pages placed, at $0. Menu links that are script buttons are no longer read as page addresses.</w:t>
+              <w:t>A page whose download meets a bot check is now tried in the real browser before being reported blocked; if the browser gets through, the page is captured normally.</w:t>
             </w:r>
           </w:p>
         </w:tc>
@@ -3932,7 +3937,7 @@
               <w:rPr>
                 <w:sz w:val="19"/>
               </w:rPr>
-              <w:t>URL history: any list of addresses is checked against every earlier run; unchanged pages keep their earlier content and are not scraped again, only new or changed ones are. A pre-run check lists which addresses were scraped before and when. The project report shows Last checked, Site last updated and Action for every page. Cookie banners and chat bubbles on the screenshot no longer cause false "needs a check" verdicts.</w:t>
+              <w:t>Knowledge base step 2: a "catalog" command builds each website's offering catalog from its menus, structured data and folders, places every page under an offering or section, and fills evidence-backed cards; optional local AI adds checked features and suggestions. John Hancock (303 addresses): 5 families, 15 more offerings, 271 of 272 pages placed, at $0. Menu links that are script buttons are no longer read as page addresses.</w:t>
             </w:r>
           </w:p>
         </w:tc>
@@ -3976,7 +3981,7 @@
               <w:rPr>
                 <w:sz w:val="19"/>
               </w:rPr>
-              <w:t>Knowledge base step 1: a "stamp" command records each page's facts (titles, descriptions, structured data, menus, calls to action, numbers, dates), builds the site's full menu tree including mega-menus, leaves out images, error, placeholder and duplicate pages with the reason, and splits each page into sections that keep their page, heading and neighbours. John Hancock: 12 pages, 51 sections, a 72-entry menu tree, in about 9 seconds at $0.</w:t>
+              <w:t>URL history: any list of addresses is checked against every earlier run; unchanged pages keep their earlier content and are not scraped again, only new or changed ones are. A pre-run check lists which addresses were scraped before and when. The project report shows Last checked, Site last updated and Action for every page. Cookie banners and chat bubbles on the screenshot no longer cause false "needs a check" verdicts.</w:t>
             </w:r>
           </w:p>
         </w:tc>
@@ -4000,7 +4005,7 @@
               <w:rPr>
                 <w:sz w:val="19"/>
               </w:rPr>
-              <w:t>2026-10-26</w:t>
+              <w:t>2026-10-27</w:t>
             </w:r>
           </w:p>
         </w:tc>
@@ -4022,7 +4027,7 @@
               <w:rPr>
                 <w:sz w:val="19"/>
               </w:rPr>
-              <w:t>Matching-content sheet columns renamed for clarity: "URL (A)", "Matching URL (B)", "% of A in B" and "% of B in A". Chat-widget invitations (for example "Live chat") are no longer treated as missed page content. Unattended runs wait up to six minutes for held work, so render retries (30, 90 and 180 seconds) finish before a run stops.</w:t>
+              <w:t>Knowledge base step 1: a "stamp" command records each page's facts (titles, descriptions, structured data, menus, calls to action, numbers, dates), builds the site's full menu tree including mega-menus, leaves out images, error, placeholder and duplicate pages with the reason, and splits each page into sections that keep their page, heading and neighbours. John Hancock: 12 pages, 51 sections, a 72-entry menu tree, in about 9 seconds at $0.</w:t>
             </w:r>
           </w:p>
         </w:tc>
@@ -4066,7 +4071,7 @@
               <w:rPr>
                 <w:sz w:val="19"/>
               </w:rPr>
-              <w:t>Columns of wide tables that you scroll sideways are captured (they were wrongly treated as hidden). A page the browser cannot open is retried by itself over about five minutes instead of a few seconds. Live John Hancock, 303 pages: 279 verified.</w:t>
+              <w:t>Matching-content sheet columns renamed for clarity: "URL (A)", "Matching URL (B)", "% of A in B" and "% of B in A". Chat-widget invitations (for example "Live chat") are no longer treated as missed page content. Unattended runs wait up to six minutes for held work, so render retries (30, 90 and 180 seconds) finish before a run stops.</w:t>
             </w:r>
           </w:p>
         </w:tc>
@@ -4112,7 +4117,7 @@
               <w:rPr>
                 <w:sz w:val="19"/>
               </w:rPr>
-              <w:t>Project report: each pair of matching pages is listed once, with the shared share in both directions.</w:t>
+              <w:t>Columns of wide tables that you scroll sideways are captured (they were wrongly treated as hidden). A page the browser cannot open is retried by itself over about five minutes instead of a few seconds. Live John Hancock, 303 pages: 279 verified.</w:t>
             </w:r>
           </w:p>
         </w:tc>
@@ -4135,7 +4140,7 @@
               <w:rPr>
                 <w:sz w:val="19"/>
               </w:rPr>
-              <w:t>2026-10-24</w:t>
+              <w:t>2026-10-26</w:t>
             </w:r>
           </w:p>
         </w:tc>
@@ -4156,7 +4161,7 @@
               <w:rPr>
                 <w:sz w:val="19"/>
               </w:rPr>
-              <w:t>New check that every line of text the browser shows was extracted. Web components no longer mistaken for hidden text; a duplicate copy of text never replaces the visible one; site tools (sign-in, country picker, chat) kept out of the content; words in side-by-side boxes no longer glued; a page is judged settled by its text, not by background elements.</w:t>
+              <w:t>Project report: each pair of matching pages is listed once, with the shared share in both directions.</w:t>
             </w:r>
           </w:p>
         </w:tc>
@@ -4180,7 +4185,7 @@
               <w:rPr>
                 <w:sz w:val="19"/>
               </w:rPr>
-              <w:t>2026-10-22</w:t>
+              <w:t>2026-10-24</w:t>
             </w:r>
           </w:p>
         </w:tc>
@@ -4202,7 +4207,7 @@
               <w:rPr>
                 <w:sz w:val="19"/>
               </w:rPr>
-              <w:t>Paid access (Bright Data) built but off by default: one approval per website with a spending cap, checked before every paid request, with a spending log.</w:t>
+              <w:t>New check that every line of text the browser shows was extracted. Web components no longer mistaken for hidden text; a duplicate copy of text never replaces the visible one; site tools (sign-in, country picker, chat) kept out of the content; words in side-by-side boxes no longer glued; a page is judged settled by its text, not by background elements.</w:t>
             </w:r>
           </w:p>
         </w:tc>
@@ -4225,7 +4230,7 @@
               <w:rPr>
                 <w:sz w:val="19"/>
               </w:rPr>
-              <w:t>2026-10-21</w:t>
+              <w:t>2026-10-22</w:t>
             </w:r>
           </w:p>
         </w:tc>
@@ -4246,7 +4251,7 @@
               <w:rPr>
                 <w:sz w:val="19"/>
               </w:rPr>
-              <w:t>Reviewers save decisions in the web app (with name, time and full history); the next report carries them forward.</w:t>
+              <w:t>Paid access (Bright Data) built but off by default: one approval per website with a spending cap, checked before every paid request, with a spending log.</w:t>
             </w:r>
           </w:p>
         </w:tc>
@@ -4292,7 +4297,7 @@
               <w:rPr>
                 <w:sz w:val="19"/>
               </w:rPr>
-              <w:t>Live John Hancock: 32 of 34 verified again with all checks on (the 2 others are placeholder pages). FAQ sections built as web components are now opened, text is matched the way the browser shows it, and a brief network hiccup no longer pauses a whole website.</w:t>
+              <w:t>Reviewers save decisions in the web app (with name, time and full history); the next report carries them forward.</w:t>
             </w:r>
           </w:p>
         </w:tc>
@@ -4315,7 +4320,7 @@
               <w:rPr>
                 <w:sz w:val="19"/>
               </w:rPr>
-              <w:t>2026-10-22</w:t>
+              <w:t>2026-10-21</w:t>
             </w:r>
           </w:p>
         </w:tc>
@@ -4336,7 +4341,7 @@
               <w:rPr>
                 <w:sz w:val="19"/>
               </w:rPr>
-              <w:t>Project report made unambiguous: an extraction-completeness statement and a High/Medium/Low confidence per page that always agree with the page's status; the confirmed share is named for what it measures; page text keeps its line breaks in Excel.</w:t>
+              <w:t>Live John Hancock: 32 of 34 verified again with all checks on (the 2 others are placeholder pages). FAQ sections built as web components are now opened, text is matched the way the browser shows it, and a brief network hiccup no longer pauses a whole website.</w:t>
             </w:r>
           </w:p>
         </w:tc>
@@ -4360,7 +4365,7 @@
               <w:rPr>
                 <w:sz w:val="19"/>
               </w:rPr>
-              <w:t>2026-10-21</w:t>
+              <w:t>2026-10-22</w:t>
             </w:r>
           </w:p>
         </w:tc>
@@ -4382,7 +4387,7 @@
               <w:rPr>
                 <w:sz w:val="19"/>
               </w:rPr>
-              <w:t>Project report: one Excel workbook per run with every page's text, whether it was fully extracted, the confirmed share and the confidence, plus, for every page, which other pages carry the same text and how much (exact matching).</w:t>
+              <w:t>Project report made unambiguous: an extraction-completeness statement and a High/Medium/Low confidence per page that always agree with the page's status; the confirmed share is named for what it measures; page text keeps its line breaks in Excel.</w:t>
             </w:r>
           </w:p>
         </w:tc>
@@ -4426,7 +4431,7 @@
               <w:rPr>
                 <w:sz w:val="19"/>
               </w:rPr>
-              <w:t>Evidence stored compactly: repeated fonts and style sheets kept once, the rest compressed, originals unchanged. About 18 times less disk on the live John Hancock run; a 5,000-page run now fits the 20 GB budget. Older evidence can be converted with one command.</w:t>
+              <w:t>Project report: one Excel workbook per run with every page's text, whether it was fully extracted, the confirmed share and the confidence, plus, for every page, which other pages carry the same text and how much (exact matching).</w:t>
             </w:r>
           </w:p>
         </w:tc>
@@ -4472,7 +4477,7 @@
               <w:rPr>
                 <w:sz w:val="19"/>
               </w:rPr>
-              <w:t>Crossed-out text (for example an old sale price) is kept and marked with ~~ instead of reading as a current price.</w:t>
+              <w:t>Evidence stored compactly: repeated fonts and style sheets kept once, the rest compressed, originals unchanged. About 18 times less disk on the live John Hancock run; a 5,000-page run now fits the 20 GB budget. Older evidence can be converted with one command.</w:t>
             </w:r>
           </w:p>
         </w:tc>
@@ -4495,7 +4500,7 @@
               <w:rPr>
                 <w:sz w:val="19"/>
               </w:rPr>
-              <w:t>2026-10-20</w:t>
+              <w:t>2026-10-21</w:t>
             </w:r>
           </w:p>
         </w:tc>
@@ -4516,7 +4521,7 @@
               <w:rPr>
                 <w:sz w:val="19"/>
               </w:rPr>
-              <w:t>Report file names start with the run's name, so downloads from different runs stay separate.</w:t>
+              <w:t>Crossed-out text (for example an old sale price) is kept and marked with ~~ instead of reading as a current price.</w:t>
             </w:r>
           </w:p>
         </w:tc>
@@ -4562,7 +4567,7 @@
               <w:rPr>
                 <w:sz w:val="19"/>
               </w:rPr>
-              <w:t>Analyst web app for reviewing runs in a browser. Optional grouping of pages by design template, so shared files are fetched once per group.</w:t>
+              <w:t>Report file names start with the run's name, so downloads from different runs stay separate.</w:t>
             </w:r>
           </w:p>
         </w:tc>
@@ -4606,7 +4611,7 @@
               <w:rPr>
                 <w:sz w:val="19"/>
               </w:rPr>
-              <w:t>Image and scanned-text reading switched on (Tesseract with 25 languages, found automatically). The visual-text check was tuned on the live John Hancock site so ordinary reading errors and cookie banners no longer cause false alarms. Images and PDFs no longer wait for a browser exploration they cannot have. Automated quality pipeline (CI) added. Live re-run: 3 of 34 verified, with the stricter checks finding real missing text.</w:t>
+              <w:t>Analyst web app for reviewing runs in a browser. Optional grouping of pages by design template, so shared files are fetched once per group.</w:t>
             </w:r>
           </w:p>
         </w:tc>
@@ -4652,7 +4657,7 @@
               <w:rPr>
                 <w:sz w:val="19"/>
               </w:rPr>
-              <w:t>Six safety and accuracy fixes (failed image reading no longer reported as verified; compressed pages decoded correctly; paused websites resume; paid access always needs approval; connections locked to the checked address; contradiction report no longer confuses dated snapshots or different products). Critical-fact check (R9) added. Tesseract OCR installed with 25 languages.</w:t>
+              <w:t>Image and scanned-text reading switched on (Tesseract with 25 languages, found automatically). The visual-text check was tuned on the live John Hancock site so ordinary reading errors and cookie banners no longer cause false alarms. Images and PDFs no longer wait for a browser exploration they cannot have. Automated quality pipeline (CI) added. Live re-run: 3 of 34 verified, with the stricter checks finding real missing text.</w:t>
             </w:r>
           </w:p>
         </w:tc>
@@ -4675,7 +4680,7 @@
               <w:rPr>
                 <w:sz w:val="19"/>
               </w:rPr>
-              <w:t>2026-10-19</w:t>
+              <w:t>2026-10-20</w:t>
             </w:r>
           </w:p>
         </w:tc>
@@ -4696,7 +4701,7 @@
               <w:rPr>
                 <w:sz w:val="19"/>
               </w:rPr>
-              <w:t>Browser exploration reaches 32 of 34 verified on John Hancock. Checks R6–R8 and R11–R13, page settling and evidence integrity added. Contradiction report (R4), paywall detection, run budgets, robots crawl-delay saved, stuck tasks reported. Office documents (Word, Excel, PowerPoint) supported. 222-case test inventory.</w:t>
+              <w:t>Six safety and accuracy fixes (failed image reading no longer reported as verified; compressed pages decoded correctly; paused websites resume; paid access always needs approval; connections locked to the checked address; contradiction report no longer confuses dated snapshots or different products). Critical-fact check (R9) added. Tesseract OCR installed with 25 languages.</w:t>
             </w:r>
           </w:p>
         </w:tc>
@@ -4720,7 +4725,7 @@
               <w:rPr>
                 <w:sz w:val="19"/>
               </w:rPr>
-              <w:t>2026-10-16</w:t>
+              <w:t>2026-10-19</w:t>
             </w:r>
           </w:p>
         </w:tc>
@@ -4742,7 +4747,7 @@
               <w:rPr>
                 <w:sz w:val="19"/>
               </w:rPr>
-              <w:t>Per-page verdicts with evidence, first checks (R1–R3, R10), reports (R1 content, review queue, overlap), offline explorer, run engine and command line.</w:t>
+              <w:t>Browser exploration reaches 32 of 34 verified on John Hancock. Checks R6–R8 and R11–R13, page settling and evidence integrity added. Contradiction report (R4), paywall detection, run budgets, robots crawl-delay saved, stuck tasks reported. Office documents (Word, Excel, PowerPoint) supported. 222-case test inventory.</w:t>
             </w:r>
           </w:p>
         </w:tc>
@@ -4765,13 +4770,59 @@
               <w:rPr>
                 <w:sz w:val="19"/>
               </w:rPr>
-              <w:t>2026-10-15</w:t>
+              <w:t>2026-10-16</w:t>
             </w:r>
           </w:p>
         </w:tc>
         <w:tc>
           <w:tcPr>
             <w:tcW w:type="dxa" w:w="4873"/>
+          </w:tcPr>
+          <w:p>
+            <w:pPr>
+              <w:spacing w:after="40"/>
+            </w:pPr>
+            <w:r>
+              <w:rPr>
+                <w:sz w:val="19"/>
+              </w:rPr>
+            </w:r>
+            <w:r>
+              <w:rPr>
+                <w:sz w:val="19"/>
+              </w:rPr>
+              <w:t>Per-page verdicts with evidence, first checks (R1–R3, R10), reports (R1 content, review queue, overlap), offline explorer, run engine and command line.</w:t>
+            </w:r>
+          </w:p>
+        </w:tc>
+      </w:tr>
+      <w:tr>
+        <w:tc>
+          <w:tcPr>
+            <w:tcW w:type="dxa" w:w="4873"/>
+            <w:shd w:val="clear" w:color="auto" w:fill="EEF2F7"/>
+          </w:tcPr>
+          <w:p>
+            <w:pPr>
+              <w:spacing w:after="40"/>
+            </w:pPr>
+            <w:r>
+              <w:rPr>
+                <w:sz w:val="19"/>
+              </w:rPr>
+            </w:r>
+            <w:r>
+              <w:rPr>
+                <w:sz w:val="19"/>
+              </w:rPr>
+              <w:t>2026-10-15</w:t>
+            </w:r>
+          </w:p>
+        </w:tc>
+        <w:tc>
+          <w:tcPr>
+            <w:tcW w:type="dxa" w:w="4873"/>
+            <w:shd w:val="clear" w:color="auto" w:fill="EEF2F7"/>
           </w:tcPr>
           <w:p>
             <w:pPr>

</xml_diff>

<commit_message>
RFC 0003 step A: SEO and GEO page inventory
New `inventory` command: every link, image, video and embed of each page,
its head tags, structured data checked against Google's required fields,
and graded SEO/GEO issues, read from the run's stored HTML (no fetch, no
model). Each item records whether it is in the server HTML, appears only
after scripts run, or only after a click. Writes <run>.inventory.jsonl and
<run>_seo_inventory.xlsx. Adds the RFC 0003 research and plan, guide
section, and lane-log entry.

Co-Authored-By: Claude Opus 5.5 <noreply@anthropic.com>
</commit_message>
<xml_diff>
--- a/Content_Processor_Guide.docx
+++ b/Content_Processor_Guide.docx
@@ -17,7 +17,7 @@
           <w:color w:val="595959"/>
           <w:sz w:val="19"/>
         </w:rPr>
-        <w:t>Last updated: 26 October 2026 · Code version: main after page stamping (step 1), the offering catalog (step 2) and the URL history across runs · Maintained by every session that adds a significant feature (see "Keeping this guide current" at the end)</w:t>
+        <w:t>Last updated: 28 October 2026 · Code version: main after page stamping (step 1), the offering catalog (step 2), the URL history across runs and the SEO and GEO inventory · Maintained by every session that adds a significant feature (see "Keeping this guide current" at the end)</w:t>
       </w:r>
     </w:p>
     <w:p>
@@ -2508,6 +2508,116 @@
     </w:p>
     <w:p>
       <w:pPr>
+        <w:pStyle w:val="Heading2"/>
+      </w:pPr>
+      <w:r>
+        <w:t>Step 13: The SEO and GEO inventory</w:t>
+      </w:r>
+    </w:p>
+    <w:p>
+      <w:r>
+        <w:t>A third command ("inventory") lists everything on each page that matters to search engines and to AI answer engines (ChatGPT, Perplexity, Google's AI answers), not only the text a visitor reads. It re-reads the pages the run already saved, so it visits no website and costs nothing, and writes a file for other tools and an Excel workbook (`&lt;run&gt;_seo_inventory.xlsx`).</w:t>
+      </w:r>
+    </w:p>
+    <w:p>
+      <w:pPr>
+        <w:pStyle w:val="ListBullet"/>
+      </w:pPr>
+      <w:r>
+        <w:rPr>
+          <w:b/>
+        </w:rPr>
+        <w:t>Every link</w:t>
+      </w:r>
+      <w:r>
+        <w:t>: where it points, the words it is shown with, whether it goes to the same website, another part of it, another website, a download, an email address or a phone number, its "do not follow" and "sponsored" markings, the part of the page it sits in (menu, main content, card, footer) and the heading above it.</w:t>
+      </w:r>
+    </w:p>
+    <w:p>
+      <w:pPr>
+        <w:pStyle w:val="ListBullet"/>
+      </w:pPr>
+      <w:r>
+        <w:rPr>
+          <w:b/>
+        </w:rPr>
+        <w:t>Every image</w:t>
+      </w:r>
+      <w:r>
+        <w:t>: its description for blind visitors and for search engines (the "alt text"), flagged when missing, empty, or just a file name; its caption, size, whether it loads late, and where it links to.</w:t>
+      </w:r>
+    </w:p>
+    <w:p>
+      <w:pPr>
+        <w:pStyle w:val="ListBullet"/>
+      </w:pPr>
+      <w:r>
+        <w:rPr>
+          <w:b/>
+        </w:rPr>
+        <w:t>Every video, audio clip and embedded frame</w:t>
+      </w:r>
+      <w:r>
+        <w:t xml:space="preserve"> (YouTube, maps, forms, chat widgets), who provides it, and whether a video has captions.</w:t>
+      </w:r>
+    </w:p>
+    <w:p>
+      <w:pPr>
+        <w:pStyle w:val="ListBullet"/>
+      </w:pPr>
+      <w:r>
+        <w:rPr>
+          <w:b/>
+        </w:rPr>
+        <w:t>The page's labels</w:t>
+      </w:r>
+      <w:r>
+        <w:t>: title and description with their length, the "official address" (canonical), instructions to search engines (for example "do not index"), language and language versions, link-preview tags for social media, and the outline of headings.</w:t>
+      </w:r>
+    </w:p>
+    <w:p>
+      <w:pPr>
+        <w:pStyle w:val="ListBullet"/>
+      </w:pPr>
+      <w:r>
+        <w:rPr>
+          <w:b/>
+        </w:rPr>
+        <w:t>Structured data</w:t>
+      </w:r>
+      <w:r>
+        <w:t xml:space="preserve"> (the machine-readable facts some pages carry, for example a product's price) is listed in full and checked against the fields Google requires before it shows a rich result.</w:t>
+      </w:r>
+    </w:p>
+    <w:p>
+      <w:r>
+        <w:rPr>
+          <w:b/>
+        </w:rPr>
+        <w:t>Where each item was found.</w:t>
+      </w:r>
+      <w:r>
+        <w:t xml:space="preserve"> Every link, image and video says whether it is in the page the server sends ("HTML and browser"), only appears once the page's scripts have run ("Browser only (needs scripts)"), or only appears after a click on a tab, menu or "show more" ("After a click only"). This matters because many AI crawlers do not run scripts: anything that needs them is invisible to those crawlers.</w:t>
+      </w:r>
+    </w:p>
+    <w:p>
+      <w:r>
+        <w:rPr>
+          <w:b/>
+        </w:rPr>
+        <w:t>Issues, in plain words.</w:t>
+      </w:r>
+      <w:r>
+        <w:t xml:space="preserve"> Each page gets a list of problems, graded error, warning or notice, with examples: titles too long, missing descriptions, several main headings, skipped heading levels, links with no words or with "read more", links marked "do not follow" to the site's own pages, images without descriptions, videos without captions, structured data that cannot be read or lacks required fields. An "Issue summary" sheet counts how many pages each problem affects.</w:t>
+      </w:r>
+    </w:p>
+    <w:p>
+      <w:r>
+        <w:t>On the John Hancock run (281 pages read, about a minute, $0): 15,813 links, 2,139 images and 311 videos and frames. Nearly every link on the site (15,636) exists only after scripts run, because the menus and links are drawn by the page's scripts rather than sent by the server, and 11,722 appear only once a menu or tab is opened. 262 pages have titles longer than search results show, 230 have no description, 242 have more than one main heading, and 1,033 images are marked as decoration, so crawlers learn nothing from them.</w:t>
+      </w:r>
+    </w:p>
+    <w:p>
+      <w:pPr>
         <w:pStyle w:val="Heading1"/>
       </w:pPr>
       <w:r>
@@ -3858,6 +3968,142 @@
           </w:p>
         </w:tc>
       </w:tr>
+      <w:tr>
+        <w:tc>
+          <w:tcPr>
+            <w:tcW w:type="dxa" w:w="4873"/>
+            <w:shd w:val="clear" w:color="auto" w:fill="EEF2F7"/>
+          </w:tcPr>
+          <w:p>
+            <w:pPr>
+              <w:spacing w:after="40"/>
+            </w:pPr>
+            <w:r>
+              <w:rPr>
+                <w:sz w:val="19"/>
+              </w:rPr>
+            </w:r>
+            <w:r>
+              <w:rPr>
+                <w:sz w:val="19"/>
+              </w:rPr>
+              <w:t>SEO / GEO</w:t>
+            </w:r>
+          </w:p>
+        </w:tc>
+        <w:tc>
+          <w:tcPr>
+            <w:tcW w:type="dxa" w:w="4873"/>
+            <w:shd w:val="clear" w:color="auto" w:fill="EEF2F7"/>
+          </w:tcPr>
+          <w:p>
+            <w:pPr>
+              <w:spacing w:after="40"/>
+            </w:pPr>
+            <w:r>
+              <w:rPr>
+                <w:sz w:val="19"/>
+              </w:rPr>
+            </w:r>
+            <w:r>
+              <w:rPr>
+                <w:sz w:val="19"/>
+              </w:rPr>
+              <w:t>Search engine optimisation / generative engine optimisation: making pages easy for search engines and for AI answer engines to find, read and cite.</w:t>
+            </w:r>
+          </w:p>
+        </w:tc>
+      </w:tr>
+      <w:tr>
+        <w:tc>
+          <w:tcPr>
+            <w:tcW w:type="dxa" w:w="4873"/>
+          </w:tcPr>
+          <w:p>
+            <w:pPr>
+              <w:spacing w:after="40"/>
+            </w:pPr>
+            <w:r>
+              <w:rPr>
+                <w:sz w:val="19"/>
+              </w:rPr>
+            </w:r>
+            <w:r>
+              <w:rPr>
+                <w:sz w:val="19"/>
+              </w:rPr>
+              <w:t>Alt text</w:t>
+            </w:r>
+          </w:p>
+        </w:tc>
+        <w:tc>
+          <w:tcPr>
+            <w:tcW w:type="dxa" w:w="4873"/>
+          </w:tcPr>
+          <w:p>
+            <w:pPr>
+              <w:spacing w:after="40"/>
+            </w:pPr>
+            <w:r>
+              <w:rPr>
+                <w:sz w:val="19"/>
+              </w:rPr>
+            </w:r>
+            <w:r>
+              <w:rPr>
+                <w:sz w:val="19"/>
+              </w:rPr>
+              <w:t>The written description of an image, read by screen readers, search engines and AI tools.</w:t>
+            </w:r>
+          </w:p>
+        </w:tc>
+      </w:tr>
+      <w:tr>
+        <w:tc>
+          <w:tcPr>
+            <w:tcW w:type="dxa" w:w="4873"/>
+            <w:shd w:val="clear" w:color="auto" w:fill="EEF2F7"/>
+          </w:tcPr>
+          <w:p>
+            <w:pPr>
+              <w:spacing w:after="40"/>
+            </w:pPr>
+            <w:r>
+              <w:rPr>
+                <w:sz w:val="19"/>
+              </w:rPr>
+            </w:r>
+            <w:r>
+              <w:rPr>
+                <w:sz w:val="19"/>
+              </w:rPr>
+              <w:t>Structured data</w:t>
+            </w:r>
+          </w:p>
+        </w:tc>
+        <w:tc>
+          <w:tcPr>
+            <w:tcW w:type="dxa" w:w="4873"/>
+            <w:shd w:val="clear" w:color="auto" w:fill="EEF2F7"/>
+          </w:tcPr>
+          <w:p>
+            <w:pPr>
+              <w:spacing w:after="40"/>
+            </w:pPr>
+            <w:r>
+              <w:rPr>
+                <w:sz w:val="19"/>
+              </w:rPr>
+            </w:r>
+            <w:r>
+              <w:rPr>
+                <w:sz w:val="19"/>
+              </w:rPr>
+              <w:t>Machine-readable facts in a page's code (schema.org), for example a product's name and price.</w:t>
+            </w:r>
+          </w:p>
+        </w:tc>
+      </w:tr>
     </w:tbl>
     <w:p/>
     <w:p>
@@ -3950,7 +4196,7 @@
               <w:rPr>
                 <w:sz w:val="19"/>
               </w:rPr>
-              <w:t>2026-10-27</w:t>
+              <w:t>2026-10-28</w:t>
             </w:r>
           </w:p>
         </w:tc>
@@ -3971,7 +4217,7 @@
               <w:rPr>
                 <w:sz w:val="19"/>
               </w:rPr>
-              <w:t>URL history across runs: every run checks each address against all earlier runs, reuses pages that did not change (the server says so, or the file or its visible text is identical), captures changed and new pages in full, and never reuses an extraction older than 30 days. The project report gains "Last scraped", "Site last modified" and "Scrape action" columns.</w:t>
+              <w:t>SEO and GEO inventory: an "inventory" command lists every link, image, video and embedded frame of each page, its title, description, canonical and search-engine instructions, and its structured data checked against Google's required fields; each item says whether it needs scripts or a click to appear, and each page gets graded issues. John Hancock: 281 pages, about a minute, $0.</w:t>
             </w:r>
           </w:p>
         </w:tc>
@@ -4017,7 +4263,7 @@
               <w:rPr>
                 <w:sz w:val="19"/>
               </w:rPr>
-              <w:t>Knowledge base step 2: a "catalog" command builds each website's offering catalog from its menus, structured data and folders, places every page under an offering or section, and fills evidence-backed cards; optional local AI adds checked features and suggestions. John Hancock (303 addresses): 5 families, 15 more offerings, 271 of 272 pages placed, at $0. Menu links that are script buttons are no longer read as page addresses.</w:t>
+              <w:t>URL history across runs: every run checks each address against all earlier runs, reuses pages that did not change (the server says so, or the file or its visible text is identical), captures changed and new pages in full, and never reuses an extraction older than 30 days. The project report gains "Last scraped", "Site last modified" and "Scrape action" columns.</w:t>
             </w:r>
           </w:p>
         </w:tc>
@@ -4040,7 +4286,7 @@
               <w:rPr>
                 <w:sz w:val="19"/>
               </w:rPr>
-              <w:t>2026-10-26</w:t>
+              <w:t>2026-10-27</w:t>
             </w:r>
           </w:p>
         </w:tc>
@@ -4061,7 +4307,7 @@
               <w:rPr>
                 <w:sz w:val="19"/>
               </w:rPr>
-              <w:t>Knowledge base step 1: a "stamp" command records each page's facts (titles, descriptions, structured data, menus, calls to action, numbers, dates), builds the site's full menu tree including mega-menus, leaves out images, error, placeholder and duplicate pages with the reason, and splits each page into sections that keep their page, heading and neighbours. John Hancock: 12 pages, 51 sections, a 72-entry menu tree, in about 9 seconds at $0.</w:t>
+              <w:t>Knowledge base step 2: a "catalog" command builds each website's offering catalog from its menus, structured data and folders, places every page under an offering or section, and fills evidence-backed cards; optional local AI adds checked features and suggestions. John Hancock (303 addresses): 5 families, 15 more offerings, 271 of 272 pages placed, at $0. Menu links that are script buttons are no longer read as page addresses.</w:t>
             </w:r>
           </w:p>
         </w:tc>
@@ -4107,7 +4353,7 @@
               <w:rPr>
                 <w:sz w:val="19"/>
               </w:rPr>
-              <w:t>Columns of wide tables that you scroll sideways are captured (they were wrongly treated as hidden). A page the browser cannot open is retried by itself over about five minutes instead of a few seconds. Live John Hancock, 303 pages: 279 verified.</w:t>
+              <w:t>Knowledge base step 1: a "stamp" command records each page's facts (titles, descriptions, structured data, menus, calls to action, numbers, dates), builds the site's full menu tree including mega-menus, leaves out images, error, placeholder and duplicate pages with the reason, and splits each page into sections that keep their page, heading and neighbours. John Hancock: 12 pages, 51 sections, a 72-entry menu tree, in about 9 seconds at $0.</w:t>
             </w:r>
           </w:p>
         </w:tc>
@@ -4151,7 +4397,7 @@
               <w:rPr>
                 <w:sz w:val="19"/>
               </w:rPr>
-              <w:t>Project report: each pair of matching pages is listed once, with the shared share in both directions.</w:t>
+              <w:t>Columns of wide tables that you scroll sideways are captured (they were wrongly treated as hidden). A page the browser cannot open is retried by itself over about five minutes instead of a few seconds. Live John Hancock, 303 pages: 279 verified.</w:t>
             </w:r>
           </w:p>
         </w:tc>
@@ -4175,7 +4421,7 @@
               <w:rPr>
                 <w:sz w:val="19"/>
               </w:rPr>
-              <w:t>2026-10-24</w:t>
+              <w:t>2026-10-26</w:t>
             </w:r>
           </w:p>
         </w:tc>
@@ -4197,7 +4443,7 @@
               <w:rPr>
                 <w:sz w:val="19"/>
               </w:rPr>
-              <w:t>New check that every line of text the browser shows was extracted. Web components no longer mistaken for hidden text; a duplicate copy of text never replaces the visible one; site tools (sign-in, country picker, chat) kept out of the content; words in side-by-side boxes no longer glued; a page is judged settled by its text, not by background elements.</w:t>
+              <w:t>Project report: each pair of matching pages is listed once, with the shared share in both directions.</w:t>
             </w:r>
           </w:p>
         </w:tc>
@@ -4220,7 +4466,7 @@
               <w:rPr>
                 <w:sz w:val="19"/>
               </w:rPr>
-              <w:t>2026-10-22</w:t>
+              <w:t>2026-10-24</w:t>
             </w:r>
           </w:p>
         </w:tc>
@@ -4241,7 +4487,7 @@
               <w:rPr>
                 <w:sz w:val="19"/>
               </w:rPr>
-              <w:t>Paid access (Bright Data) built but off by default: one approval per website with a spending cap, checked before every paid request, with a spending log.</w:t>
+              <w:t>New check that every line of text the browser shows was extracted. Web components no longer mistaken for hidden text; a duplicate copy of text never replaces the visible one; site tools (sign-in, country picker, chat) kept out of the content; words in side-by-side boxes no longer glued; a page is judged settled by its text, not by background elements.</w:t>
             </w:r>
           </w:p>
         </w:tc>
@@ -4265,7 +4511,7 @@
               <w:rPr>
                 <w:sz w:val="19"/>
               </w:rPr>
-              <w:t>2026-10-21</w:t>
+              <w:t>2026-10-22</w:t>
             </w:r>
           </w:p>
         </w:tc>
@@ -4287,7 +4533,7 @@
               <w:rPr>
                 <w:sz w:val="19"/>
               </w:rPr>
-              <w:t>Reviewers save decisions in the web app (with name, time and full history); the next report carries them forward.</w:t>
+              <w:t>Paid access (Bright Data) built but off by default: one approval per website with a spending cap, checked before every paid request, with a spending log.</w:t>
             </w:r>
           </w:p>
         </w:tc>
@@ -4331,7 +4577,7 @@
               <w:rPr>
                 <w:sz w:val="19"/>
               </w:rPr>
-              <w:t>Live John Hancock: 32 of 34 verified again with all checks on (the 2 others are placeholder pages). FAQ sections built as web components are now opened, text is matched the way the browser shows it, and a brief network hiccup no longer pauses a whole website.</w:t>
+              <w:t>Reviewers save decisions in the web app (with name, time and full history); the next report carries them forward.</w:t>
             </w:r>
           </w:p>
         </w:tc>
@@ -4355,7 +4601,7 @@
               <w:rPr>
                 <w:sz w:val="19"/>
               </w:rPr>
-              <w:t>2026-10-22</w:t>
+              <w:t>2026-10-21</w:t>
             </w:r>
           </w:p>
         </w:tc>
@@ -4377,7 +4623,7 @@
               <w:rPr>
                 <w:sz w:val="19"/>
               </w:rPr>
-              <w:t>Project report made unambiguous: an extraction-completeness statement and a High/Medium/Low confidence per page that always agree with the page's status; the confirmed share is named for what it measures; page text keeps its line breaks in Excel.</w:t>
+              <w:t>Live John Hancock: 32 of 34 verified again with all checks on (the 2 others are placeholder pages). FAQ sections built as web components are now opened, text is matched the way the browser shows it, and a brief network hiccup no longer pauses a whole website.</w:t>
             </w:r>
           </w:p>
         </w:tc>
@@ -4400,7 +4646,7 @@
               <w:rPr>
                 <w:sz w:val="19"/>
               </w:rPr>
-              <w:t>2026-10-21</w:t>
+              <w:t>2026-10-22</w:t>
             </w:r>
           </w:p>
         </w:tc>
@@ -4421,7 +4667,7 @@
               <w:rPr>
                 <w:sz w:val="19"/>
               </w:rPr>
-              <w:t>Project report: one Excel workbook per run with every page's text, whether it was fully extracted, the confirmed share and the confidence, plus, for every page, which other pages carry the same text and how much (exact matching).</w:t>
+              <w:t>Project report made unambiguous: an extraction-completeness statement and a High/Medium/Low confidence per page that always agree with the page's status; the confirmed share is named for what it measures; page text keeps its line breaks in Excel.</w:t>
             </w:r>
           </w:p>
         </w:tc>
@@ -4467,7 +4713,7 @@
               <w:rPr>
                 <w:sz w:val="19"/>
               </w:rPr>
-              <w:t>Evidence stored compactly: repeated fonts and style sheets kept once, the rest compressed, originals unchanged. About 18 times less disk on the live John Hancock run; a 5,000-page run now fits the 20 GB budget. Older evidence can be converted with one command.</w:t>
+              <w:t>Project report: one Excel workbook per run with every page's text, whether it was fully extracted, the confirmed share and the confidence, plus, for every page, which other pages carry the same text and how much (exact matching).</w:t>
             </w:r>
           </w:p>
         </w:tc>
@@ -4511,7 +4757,7 @@
               <w:rPr>
                 <w:sz w:val="19"/>
               </w:rPr>
-              <w:t>Crossed-out text (for example an old sale price) is kept and marked with ~~ instead of reading as a current price.</w:t>
+              <w:t>Evidence stored compactly: repeated fonts and style sheets kept once, the rest compressed, originals unchanged. About 18 times less disk on the live John Hancock run; a 5,000-page run now fits the 20 GB budget. Older evidence can be converted with one command.</w:t>
             </w:r>
           </w:p>
         </w:tc>
@@ -4535,7 +4781,7 @@
               <w:rPr>
                 <w:sz w:val="19"/>
               </w:rPr>
-              <w:t>2026-10-20</w:t>
+              <w:t>2026-10-21</w:t>
             </w:r>
           </w:p>
         </w:tc>
@@ -4557,7 +4803,7 @@
               <w:rPr>
                 <w:sz w:val="19"/>
               </w:rPr>
-              <w:t>Report file names start with the run's name, so downloads from different runs stay separate.</w:t>
+              <w:t>Crossed-out text (for example an old sale price) is kept and marked with ~~ instead of reading as a current price.</w:t>
             </w:r>
           </w:p>
         </w:tc>
@@ -4601,7 +4847,7 @@
               <w:rPr>
                 <w:sz w:val="19"/>
               </w:rPr>
-              <w:t>Analyst web app for reviewing runs in a browser. Optional grouping of pages by design template, so shared files are fetched once per group.</w:t>
+              <w:t>Report file names start with the run's name, so downloads from different runs stay separate.</w:t>
             </w:r>
           </w:p>
         </w:tc>
@@ -4647,7 +4893,7 @@
               <w:rPr>
                 <w:sz w:val="19"/>
               </w:rPr>
-              <w:t>Image and scanned-text reading switched on (Tesseract with 25 languages, found automatically). The visual-text check was tuned on the live John Hancock site so ordinary reading errors and cookie banners no longer cause false alarms. Images and PDFs no longer wait for a browser exploration they cannot have. Automated quality pipeline (CI) added. Live re-run: 3 of 34 verified, with the stricter checks finding real missing text.</w:t>
+              <w:t>Analyst web app for reviewing runs in a browser. Optional grouping of pages by design template, so shared files are fetched once per group.</w:t>
             </w:r>
           </w:p>
         </w:tc>
@@ -4691,7 +4937,7 @@
               <w:rPr>
                 <w:sz w:val="19"/>
               </w:rPr>
-              <w:t>Six safety and accuracy fixes (failed image reading no longer reported as verified; compressed pages decoded correctly; paused websites resume; paid access always needs approval; connections locked to the checked address; contradiction report no longer confuses dated snapshots or different products). Critical-fact check (R9) added. Tesseract OCR installed with 25 languages.</w:t>
+              <w:t>Image and scanned-text reading switched on (Tesseract with 25 languages, found automatically). The visual-text check was tuned on the live John Hancock site so ordinary reading errors and cookie banners no longer cause false alarms. Images and PDFs no longer wait for a browser exploration they cannot have. Automated quality pipeline (CI) added. Live re-run: 3 of 34 verified, with the stricter checks finding real missing text.</w:t>
             </w:r>
           </w:p>
         </w:tc>
@@ -4715,7 +4961,7 @@
               <w:rPr>
                 <w:sz w:val="19"/>
               </w:rPr>
-              <w:t>2026-10-19</w:t>
+              <w:t>2026-10-20</w:t>
             </w:r>
           </w:p>
         </w:tc>
@@ -4737,7 +4983,7 @@
               <w:rPr>
                 <w:sz w:val="19"/>
               </w:rPr>
-              <w:t>Browser exploration reaches 32 of 34 verified on John Hancock. Checks R6–R8 and R11–R13, page settling and evidence integrity added. Contradiction report (R4), paywall detection, run budgets, robots crawl-delay saved, stuck tasks reported. Office documents (Word, Excel, PowerPoint) supported. 222-case test inventory.</w:t>
+              <w:t>Six safety and accuracy fixes (failed image reading no longer reported as verified; compressed pages decoded correctly; paused websites resume; paid access always needs approval; connections locked to the checked address; contradiction report no longer confuses dated snapshots or different products). Critical-fact check (R9) added. Tesseract OCR installed with 25 languages.</w:t>
             </w:r>
           </w:p>
         </w:tc>
@@ -4760,7 +5006,7 @@
               <w:rPr>
                 <w:sz w:val="19"/>
               </w:rPr>
-              <w:t>2026-10-16</w:t>
+              <w:t>2026-10-19</w:t>
             </w:r>
           </w:p>
         </w:tc>
@@ -4781,7 +5027,7 @@
               <w:rPr>
                 <w:sz w:val="19"/>
               </w:rPr>
-              <w:t>Per-page verdicts with evidence, first checks (R1–R3, R10), reports (R1 content, review queue, overlap), offline explorer, run engine and command line.</w:t>
+              <w:t>Browser exploration reaches 32 of 34 verified on John Hancock. Checks R6–R8 and R11–R13, page settling and evidence integrity added. Contradiction report (R4), paywall detection, run budgets, robots crawl-delay saved, stuck tasks reported. Office documents (Word, Excel, PowerPoint) supported. 222-case test inventory.</w:t>
             </w:r>
           </w:p>
         </w:tc>
@@ -4805,7 +5051,7 @@
               <w:rPr>
                 <w:sz w:val="19"/>
               </w:rPr>
-              <w:t>2026-10-15</w:t>
+              <w:t>2026-10-16</w:t>
             </w:r>
           </w:p>
         </w:tc>
@@ -4813,6 +5059,50 @@
           <w:tcPr>
             <w:tcW w:type="dxa" w:w="4873"/>
             <w:shd w:val="clear" w:color="auto" w:fill="EEF2F7"/>
+          </w:tcPr>
+          <w:p>
+            <w:pPr>
+              <w:spacing w:after="40"/>
+            </w:pPr>
+            <w:r>
+              <w:rPr>
+                <w:sz w:val="19"/>
+              </w:rPr>
+            </w:r>
+            <w:r>
+              <w:rPr>
+                <w:sz w:val="19"/>
+              </w:rPr>
+              <w:t>Per-page verdicts with evidence, first checks (R1–R3, R10), reports (R1 content, review queue, overlap), offline explorer, run engine and command line.</w:t>
+            </w:r>
+          </w:p>
+        </w:tc>
+      </w:tr>
+      <w:tr>
+        <w:tc>
+          <w:tcPr>
+            <w:tcW w:type="dxa" w:w="4873"/>
+          </w:tcPr>
+          <w:p>
+            <w:pPr>
+              <w:spacing w:after="40"/>
+            </w:pPr>
+            <w:r>
+              <w:rPr>
+                <w:sz w:val="19"/>
+              </w:rPr>
+            </w:r>
+            <w:r>
+              <w:rPr>
+                <w:sz w:val="19"/>
+              </w:rPr>
+              <w:t>2026-10-15</w:t>
+            </w:r>
+          </w:p>
+        </w:tc>
+        <w:tc>
+          <w:tcPr>
+            <w:tcW w:type="dxa" w:w="4873"/>
           </w:tcPr>
           <w:p>
             <w:pPr>

</xml_diff>

<commit_message>
RFC 0003 step B: page outlines, Markdown per page, page types and site profile
New `structure` command: each page as an ordered tree read from its best
stored view (composed shadow DOM, else browser, else server HTML), with
sections, paragraphs and links, lists, tables, images, media, forms, CTAs,
tabs, accordions/FAQ, cards and carousels; chrome and player controls left
out; collapsed and after-click text marked and placed under its control;
text cited to blocks. One Markdown file per page, a page-type label per
page (code-only, signals and confidence kept) and a site profile.
Guide, RFC 0003 status and site-type decision, lane log updated.

Co-Authored-By: Claude Opus 5.5 <noreply@anthropic.com>
</commit_message>
<xml_diff>
--- a/Content_Processor_Guide.docx
+++ b/Content_Processor_Guide.docx
@@ -17,7 +17,7 @@
           <w:color w:val="595959"/>
           <w:sz w:val="19"/>
         </w:rPr>
-        <w:t>Last updated: 28 October 2026 · Code version: main after pages that meet a bot check being handed to the real browser, page stamping (step 1) and the offering catalog (step 2) of the knowledge base, the URL history across runs (one memory, only new or changed pages scraped again) and the SEO and GEO inventory · Maintained by every session that adds a significant feature (see "Keeping this guide current" at the end)</w:t>
+        <w:t>Last updated: 28 October 2026 · Code version: main after pages that meet a bot check being handed to the real browser, page stamping (step 1) and the offering catalog (step 2) of the knowledge base, the URL history across runs (one memory, only new or changed pages scraped again), the SEO and GEO inventory, and page outlines with page types · Maintained by every session that adds a significant feature (see "Keeping this guide current" at the end)</w:t>
       </w:r>
     </w:p>
     <w:p>
@@ -2628,6 +2628,46 @@
     </w:p>
     <w:p>
       <w:pPr>
+        <w:pStyle w:val="Heading2"/>
+      </w:pPr>
+      <w:r>
+        <w:t>Step 14: Page outlines and page types</w:t>
+      </w:r>
+    </w:p>
+    <w:p>
+      <w:r>
+        <w:t>A fourth command ("structure") rewrites every page as a clean outline in the order a visitor sees it, and says what kind of page it is. It writes one Markdown file per page (readable by people and by AI tools such as Claude or ChatGPT), a file for other tools, and an Excel workbook (`&lt;run&gt;_page_types.xlsx`).</w:t>
+      </w:r>
+    </w:p>
+    <w:p>
+      <w:r>
+        <w:rPr>
+          <w:b/>
+        </w:rPr>
+        <w:t>The outline.</w:t>
+      </w:r>
+      <w:r>
+        <w:t xml:space="preserve"> Each page starts with its title, summary, address, publication and update dates, author, page type and breadcrumb trail, then its content: sections by heading, paragraphs (with their links), lists, tables, images with their descriptions and captions, videos, forms and buttons. The page's building blocks keep their shape: tabs are listed with their labels ("Tab: Pricing"), accordions and questions-and-answers with each question and its answer, groups of cards with each card's title, and carousels. Header, footer, menus, cookie and chat boxes and video-player controls are left out; the site's menus are kept once for the whole site. Text inside a closed tab or accordion is kept and marked "shown after a click"; text that only appeared once the engine clicked something is placed under the button that revealed it and marked "appears after a click". When a page is built from web components, the outline is read from the engine's composed view, which includes their contents. Each piece of text is matched to the engine's extracted text, so it can still be traced to the stored evidence.</w:t>
+      </w:r>
+    </w:p>
+    <w:p>
+      <w:r>
+        <w:rPr>
+          <w:b/>
+        </w:rPr>
+        <w:t>The page type.</w:t>
+      </w:r>
+      <w:r>
+        <w:t xml:space="preserve"> Code decides whether a page is a product, a category (a grid of products), a service, an article, a case study, questions and answers, contact, about, careers, legal, pricing, a location, an event, a form, the home page, a document or other. It weighs independent signals: the page's structured data, its address ("/products/", "/blog/", "/case-studies/"), and what it shows (an add-to-cart button, prices, size or colour choices, a grid of priced items, filters, an author and date, a form). The reasons are listed in plain words with a confidence; a page with no clear signal is "other" rather than a guess. From all pages the engine also names the kind of website: e-commerce, B2B services, publisher or mixed.</w:t>
+      </w:r>
+    </w:p>
+    <w:p>
+      <w:r>
+        <w:t>On the John Hancock run (303 pages, about a minute, $0): 7,455 paragraphs, 551 sections, 756 cards, 255 accordion items in 33 question-and-answer blocks, 244 tables and 760 images; 89% of the outline's text is matched to extracted text; 268 pages are articles (news releases) and 33 are help-centre question pages, so this run reads as a publisher site.</w:t>
+      </w:r>
+    </w:p>
+    <w:p>
+      <w:pPr>
         <w:pStyle w:val="Heading1"/>
       </w:pPr>
       <w:r>
@@ -4114,6 +4154,96 @@
           </w:p>
         </w:tc>
       </w:tr>
+      <w:tr>
+        <w:tc>
+          <w:tcPr>
+            <w:tcW w:type="dxa" w:w="4873"/>
+          </w:tcPr>
+          <w:p>
+            <w:pPr>
+              <w:spacing w:after="40"/>
+            </w:pPr>
+            <w:r>
+              <w:rPr>
+                <w:sz w:val="19"/>
+              </w:rPr>
+            </w:r>
+            <w:r>
+              <w:rPr>
+                <w:sz w:val="19"/>
+              </w:rPr>
+              <w:t>Page outline</w:t>
+            </w:r>
+          </w:p>
+        </w:tc>
+        <w:tc>
+          <w:tcPr>
+            <w:tcW w:type="dxa" w:w="4873"/>
+          </w:tcPr>
+          <w:p>
+            <w:pPr>
+              <w:spacing w:after="40"/>
+            </w:pPr>
+            <w:r>
+              <w:rPr>
+                <w:sz w:val="19"/>
+              </w:rPr>
+            </w:r>
+            <w:r>
+              <w:rPr>
+                <w:sz w:val="19"/>
+              </w:rPr>
+              <w:t>A page rewritten in reading order with its sections, tabs, accordions, cards and tables, as Markdown.</w:t>
+            </w:r>
+          </w:p>
+        </w:tc>
+      </w:tr>
+      <w:tr>
+        <w:tc>
+          <w:tcPr>
+            <w:tcW w:type="dxa" w:w="4873"/>
+            <w:shd w:val="clear" w:color="auto" w:fill="EEF2F7"/>
+          </w:tcPr>
+          <w:p>
+            <w:pPr>
+              <w:spacing w:after="40"/>
+            </w:pPr>
+            <w:r>
+              <w:rPr>
+                <w:sz w:val="19"/>
+              </w:rPr>
+            </w:r>
+            <w:r>
+              <w:rPr>
+                <w:sz w:val="19"/>
+              </w:rPr>
+              <w:t>Page type</w:t>
+            </w:r>
+          </w:p>
+        </w:tc>
+        <w:tc>
+          <w:tcPr>
+            <w:tcW w:type="dxa" w:w="4873"/>
+            <w:shd w:val="clear" w:color="auto" w:fill="EEF2F7"/>
+          </w:tcPr>
+          <w:p>
+            <w:pPr>
+              <w:spacing w:after="40"/>
+            </w:pPr>
+            <w:r>
+              <w:rPr>
+                <w:sz w:val="19"/>
+              </w:rPr>
+            </w:r>
+            <w:r>
+              <w:rPr>
+                <w:sz w:val="19"/>
+              </w:rPr>
+              <w:t>What kind of page it is (product, category, service, article...), decided by code from several signals.</w:t>
+            </w:r>
+          </w:p>
+        </w:tc>
+      </w:tr>
     </w:tbl>
     <w:p/>
     <w:p>
@@ -4206,7 +4336,7 @@
               <w:rPr>
                 <w:sz w:val="19"/>
               </w:rPr>
-              <w:t>2026-10-27</w:t>
+              <w:t>2026-10-28</w:t>
             </w:r>
           </w:p>
         </w:tc>
@@ -4227,7 +4357,7 @@
               <w:rPr>
                 <w:sz w:val="19"/>
               </w:rPr>
-              <w:t>A page whose download meets a bot check is now tried in the real browser before being reported blocked; if the browser gets through, the page is captured normally.</w:t>
+              <w:t>Page outlines and page types: a "structure" command rewrites every page as an outline in reading order (sections, tabs, accordions, questions and answers, cards, tables, images, videos, forms), one Markdown file per page, with text behind clicks marked, and labels each page as product, category, service, article and so on, and the site as e-commerce, B2B services, publisher or mixed. John Hancock: 303 pages, about a minute, $0.</w:t>
             </w:r>
           </w:p>
         </w:tc>
@@ -4251,7 +4381,7 @@
               <w:rPr>
                 <w:sz w:val="19"/>
               </w:rPr>
-              <w:t>2026-10-28</w:t>
+              <w:t>2026-10-27</w:t>
             </w:r>
           </w:p>
         </w:tc>
@@ -4273,7 +4403,7 @@
               <w:rPr>
                 <w:sz w:val="19"/>
               </w:rPr>
-              <w:t>SEO and GEO inventory: an "inventory" command lists every link, image, video and embedded frame of each page, its title, description, canonical and search-engine instructions, and its structured data checked against Google's required fields; each item says whether it needs scripts or a click to appear, and each page gets graded issues. John Hancock: 281 pages, about a minute, $0.</w:t>
+              <w:t>A page whose download meets a bot check is now tried in the real browser before being reported blocked; if the browser gets through, the page is captured normally.</w:t>
             </w:r>
           </w:p>
         </w:tc>
@@ -4296,7 +4426,7 @@
               <w:rPr>
                 <w:sz w:val="19"/>
               </w:rPr>
-              <w:t>2026-10-27</w:t>
+              <w:t>2026-10-28</w:t>
             </w:r>
           </w:p>
         </w:tc>
@@ -4317,7 +4447,7 @@
               <w:rPr>
                 <w:sz w:val="19"/>
               </w:rPr>
-              <w:t>URL history across runs: any list of addresses is checked against every earlier run; pages that did not change (the server says so, or the file or its visible text is identical) keep their earlier content and are not scraped again, changed and new pages are scraped in full, and content older than 30 days is read again. Before a run, a list of addresses can be checked (scraped before? when?). The project report gains "Last scraped", "Site last modified" and "Scrape action" columns.</w:t>
+              <w:t>SEO and GEO inventory: an "inventory" command lists every link, image, video and embedded frame of each page, its title, description, canonical and search-engine instructions, and its structured data checked against Google's required fields; each item says whether it needs scripts or a click to appear, and each page gets graded issues. John Hancock: 281 pages, about a minute, $0.</w:t>
             </w:r>
           </w:p>
         </w:tc>
@@ -4363,7 +4493,7 @@
               <w:rPr>
                 <w:sz w:val="19"/>
               </w:rPr>
-              <w:t>Knowledge base step 2: a "catalog" command builds each website's offering catalog from its menus, structured data and folders, places every page under an offering or section, and fills evidence-backed cards; optional local AI adds checked features and suggestions. John Hancock (303 addresses): 5 families, 15 more offerings, 271 of 272 pages placed, at $0. Menu links that are script buttons are no longer read as page addresses.</w:t>
+              <w:t>URL history across runs: any list of addresses is checked against every earlier run; pages that did not change (the server says so, or the file or its visible text is identical) keep their earlier content and are not scraped again, changed and new pages are scraped in full, and content older than 30 days is read again. Before a run, a list of addresses can be checked (scraped before? when?). The project report gains "Last scraped", "Site last modified" and "Scrape action" columns.</w:t>
             </w:r>
           </w:p>
         </w:tc>
@@ -4407,7 +4537,7 @@
               <w:rPr>
                 <w:sz w:val="19"/>
               </w:rPr>
-              <w:t>Knowledge base step 1: a "stamp" command records each page's facts (titles, descriptions, structured data, menus, calls to action, numbers, dates), builds the site's full menu tree including mega-menus, leaves out images, error, placeholder and duplicate pages with the reason, and splits each page into sections that keep their page, heading and neighbours. John Hancock: 12 pages, 51 sections, a 72-entry menu tree, in about 9 seconds at $0.</w:t>
+              <w:t>Knowledge base step 2: a "catalog" command builds each website's offering catalog from its menus, structured data and folders, places every page under an offering or section, and fills evidence-backed cards; optional local AI adds checked features and suggestions. John Hancock (303 addresses): 5 families, 15 more offerings, 271 of 272 pages placed, at $0. Menu links that are script buttons are no longer read as page addresses.</w:t>
             </w:r>
           </w:p>
         </w:tc>
@@ -4431,7 +4561,7 @@
               <w:rPr>
                 <w:sz w:val="19"/>
               </w:rPr>
-              <w:t>2026-10-26</w:t>
+              <w:t>2026-10-27</w:t>
             </w:r>
           </w:p>
         </w:tc>
@@ -4453,7 +4583,7 @@
               <w:rPr>
                 <w:sz w:val="19"/>
               </w:rPr>
-              <w:t>Matching-content sheet columns renamed for clarity: "URL (A)", "Matching URL (B)", "% of A in B" and "% of B in A". Chat-widget invitations (for example "Live chat") are no longer treated as missed page content. Unattended runs wait up to six minutes for held work, so render retries (30, 90 and 180 seconds) finish before a run stops.</w:t>
+              <w:t>Knowledge base step 1: a "stamp" command records each page's facts (titles, descriptions, structured data, menus, calls to action, numbers, dates), builds the site's full menu tree including mega-menus, leaves out images, error, placeholder and duplicate pages with the reason, and splits each page into sections that keep their page, heading and neighbours. John Hancock: 12 pages, 51 sections, a 72-entry menu tree, in about 9 seconds at $0.</w:t>
             </w:r>
           </w:p>
         </w:tc>
@@ -4497,7 +4627,7 @@
               <w:rPr>
                 <w:sz w:val="19"/>
               </w:rPr>
-              <w:t>Columns of wide tables that you scroll sideways are captured (they were wrongly treated as hidden). A page the browser cannot open is retried by itself over about five minutes instead of a few seconds. Live John Hancock, 303 pages: 279 verified.</w:t>
+              <w:t>Matching-content sheet columns renamed for clarity: "URL (A)", "Matching URL (B)", "% of A in B" and "% of B in A". Chat-widget invitations (for example "Live chat") are no longer treated as missed page content. Unattended runs wait up to six minutes for held work, so render retries (30, 90 and 180 seconds) finish before a run stops.</w:t>
             </w:r>
           </w:p>
         </w:tc>
@@ -4543,7 +4673,7 @@
               <w:rPr>
                 <w:sz w:val="19"/>
               </w:rPr>
-              <w:t>Project report: each pair of matching pages is listed once, with the shared share in both directions.</w:t>
+              <w:t>Columns of wide tables that you scroll sideways are captured (they were wrongly treated as hidden). A page the browser cannot open is retried by itself over about five minutes instead of a few seconds. Live John Hancock, 303 pages: 279 verified.</w:t>
             </w:r>
           </w:p>
         </w:tc>
@@ -4566,7 +4696,7 @@
               <w:rPr>
                 <w:sz w:val="19"/>
               </w:rPr>
-              <w:t>2026-10-24</w:t>
+              <w:t>2026-10-26</w:t>
             </w:r>
           </w:p>
         </w:tc>
@@ -4587,7 +4717,7 @@
               <w:rPr>
                 <w:sz w:val="19"/>
               </w:rPr>
-              <w:t>New check that every line of text the browser shows was extracted. Web components no longer mistaken for hidden text; a duplicate copy of text never replaces the visible one; site tools (sign-in, country picker, chat) kept out of the content; words in side-by-side boxes no longer glued; a page is judged settled by its text, not by background elements.</w:t>
+              <w:t>Project report: each pair of matching pages is listed once, with the shared share in both directions.</w:t>
             </w:r>
           </w:p>
         </w:tc>
@@ -4611,7 +4741,7 @@
               <w:rPr>
                 <w:sz w:val="19"/>
               </w:rPr>
-              <w:t>2026-10-22</w:t>
+              <w:t>2026-10-24</w:t>
             </w:r>
           </w:p>
         </w:tc>
@@ -4633,7 +4763,7 @@
               <w:rPr>
                 <w:sz w:val="19"/>
               </w:rPr>
-              <w:t>Paid access (Bright Data) built but off by default: one approval per website with a spending cap, checked before every paid request, with a spending log.</w:t>
+              <w:t>New check that every line of text the browser shows was extracted. Web components no longer mistaken for hidden text; a duplicate copy of text never replaces the visible one; site tools (sign-in, country picker, chat) kept out of the content; words in side-by-side boxes no longer glued; a page is judged settled by its text, not by background elements.</w:t>
             </w:r>
           </w:p>
         </w:tc>
@@ -4656,7 +4786,7 @@
               <w:rPr>
                 <w:sz w:val="19"/>
               </w:rPr>
-              <w:t>2026-10-21</w:t>
+              <w:t>2026-10-22</w:t>
             </w:r>
           </w:p>
         </w:tc>
@@ -4677,7 +4807,7 @@
               <w:rPr>
                 <w:sz w:val="19"/>
               </w:rPr>
-              <w:t>Reviewers save decisions in the web app (with name, time and full history); the next report carries them forward.</w:t>
+              <w:t>Paid access (Bright Data) built but off by default: one approval per website with a spending cap, checked before every paid request, with a spending log.</w:t>
             </w:r>
           </w:p>
         </w:tc>
@@ -4723,7 +4853,7 @@
               <w:rPr>
                 <w:sz w:val="19"/>
               </w:rPr>
-              <w:t>Live John Hancock: 32 of 34 verified again with all checks on (the 2 others are placeholder pages). FAQ sections built as web components are now opened, text is matched the way the browser shows it, and a brief network hiccup no longer pauses a whole website.</w:t>
+              <w:t>Reviewers save decisions in the web app (with name, time and full history); the next report carries them forward.</w:t>
             </w:r>
           </w:p>
         </w:tc>
@@ -4746,7 +4876,7 @@
               <w:rPr>
                 <w:sz w:val="19"/>
               </w:rPr>
-              <w:t>2026-10-22</w:t>
+              <w:t>2026-10-21</w:t>
             </w:r>
           </w:p>
         </w:tc>
@@ -4767,7 +4897,7 @@
               <w:rPr>
                 <w:sz w:val="19"/>
               </w:rPr>
-              <w:t>Project report made unambiguous: an extraction-completeness statement and a High/Medium/Low confidence per page that always agree with the page's status; the confirmed share is named for what it measures; page text keeps its line breaks in Excel.</w:t>
+              <w:t>Live John Hancock: 32 of 34 verified again with all checks on (the 2 others are placeholder pages). FAQ sections built as web components are now opened, text is matched the way the browser shows it, and a brief network hiccup no longer pauses a whole website.</w:t>
             </w:r>
           </w:p>
         </w:tc>
@@ -4791,7 +4921,7 @@
               <w:rPr>
                 <w:sz w:val="19"/>
               </w:rPr>
-              <w:t>2026-10-21</w:t>
+              <w:t>2026-10-22</w:t>
             </w:r>
           </w:p>
         </w:tc>
@@ -4813,7 +4943,7 @@
               <w:rPr>
                 <w:sz w:val="19"/>
               </w:rPr>
-              <w:t>Project report: one Excel workbook per run with every page's text, whether it was fully extracted, the confirmed share and the confidence, plus, for every page, which other pages carry the same text and how much (exact matching).</w:t>
+              <w:t>Project report made unambiguous: an extraction-completeness statement and a High/Medium/Low confidence per page that always agree with the page's status; the confirmed share is named for what it measures; page text keeps its line breaks in Excel.</w:t>
             </w:r>
           </w:p>
         </w:tc>
@@ -4857,7 +4987,7 @@
               <w:rPr>
                 <w:sz w:val="19"/>
               </w:rPr>
-              <w:t>Evidence stored compactly: repeated fonts and style sheets kept once, the rest compressed, originals unchanged. About 18 times less disk on the live John Hancock run; a 5,000-page run now fits the 20 GB budget. Older evidence can be converted with one command.</w:t>
+              <w:t>Project report: one Excel workbook per run with every page's text, whether it was fully extracted, the confirmed share and the confidence, plus, for every page, which other pages carry the same text and how much (exact matching).</w:t>
             </w:r>
           </w:p>
         </w:tc>
@@ -4903,7 +5033,7 @@
               <w:rPr>
                 <w:sz w:val="19"/>
               </w:rPr>
-              <w:t>Crossed-out text (for example an old sale price) is kept and marked with ~~ instead of reading as a current price.</w:t>
+              <w:t>Evidence stored compactly: repeated fonts and style sheets kept once, the rest compressed, originals unchanged. About 18 times less disk on the live John Hancock run; a 5,000-page run now fits the 20 GB budget. Older evidence can be converted with one command.</w:t>
             </w:r>
           </w:p>
         </w:tc>
@@ -4926,7 +5056,7 @@
               <w:rPr>
                 <w:sz w:val="19"/>
               </w:rPr>
-              <w:t>2026-10-20</w:t>
+              <w:t>2026-10-21</w:t>
             </w:r>
           </w:p>
         </w:tc>
@@ -4947,7 +5077,7 @@
               <w:rPr>
                 <w:sz w:val="19"/>
               </w:rPr>
-              <w:t>Report file names start with the run's name, so downloads from different runs stay separate.</w:t>
+              <w:t>Crossed-out text (for example an old sale price) is kept and marked with ~~ instead of reading as a current price.</w:t>
             </w:r>
           </w:p>
         </w:tc>
@@ -4993,7 +5123,7 @@
               <w:rPr>
                 <w:sz w:val="19"/>
               </w:rPr>
-              <w:t>Analyst web app for reviewing runs in a browser. Optional grouping of pages by design template, so shared files are fetched once per group.</w:t>
+              <w:t>Report file names start with the run's name, so downloads from different runs stay separate.</w:t>
             </w:r>
           </w:p>
         </w:tc>
@@ -5037,7 +5167,7 @@
               <w:rPr>
                 <w:sz w:val="19"/>
               </w:rPr>
-              <w:t>Image and scanned-text reading switched on (Tesseract with 25 languages, found automatically). The visual-text check was tuned on the live John Hancock site so ordinary reading errors and cookie banners no longer cause false alarms. Images and PDFs no longer wait for a browser exploration they cannot have. Automated quality pipeline (CI) added. Live re-run: 3 of 34 verified, with the stricter checks finding real missing text.</w:t>
+              <w:t>Analyst web app for reviewing runs in a browser. Optional grouping of pages by design template, so shared files are fetched once per group.</w:t>
             </w:r>
           </w:p>
         </w:tc>
@@ -5083,7 +5213,7 @@
               <w:rPr>
                 <w:sz w:val="19"/>
               </w:rPr>
-              <w:t>Six safety and accuracy fixes (failed image reading no longer reported as verified; compressed pages decoded correctly; paused websites resume; paid access always needs approval; connections locked to the checked address; contradiction report no longer confuses dated snapshots or different products). Critical-fact check (R9) added. Tesseract OCR installed with 25 languages.</w:t>
+              <w:t>Image and scanned-text reading switched on (Tesseract with 25 languages, found automatically). The visual-text check was tuned on the live John Hancock site so ordinary reading errors and cookie banners no longer cause false alarms. Images and PDFs no longer wait for a browser exploration they cannot have. Automated quality pipeline (CI) added. Live re-run: 3 of 34 verified, with the stricter checks finding real missing text.</w:t>
             </w:r>
           </w:p>
         </w:tc>
@@ -5106,7 +5236,7 @@
               <w:rPr>
                 <w:sz w:val="19"/>
               </w:rPr>
-              <w:t>2026-10-19</w:t>
+              <w:t>2026-10-20</w:t>
             </w:r>
           </w:p>
         </w:tc>
@@ -5127,7 +5257,7 @@
               <w:rPr>
                 <w:sz w:val="19"/>
               </w:rPr>
-              <w:t>Browser exploration reaches 32 of 34 verified on John Hancock. Checks R6–R8 and R11–R13, page settling and evidence integrity added. Contradiction report (R4), paywall detection, run budgets, robots crawl-delay saved, stuck tasks reported. Office documents (Word, Excel, PowerPoint) supported. 222-case test inventory.</w:t>
+              <w:t>Six safety and accuracy fixes (failed image reading no longer reported as verified; compressed pages decoded correctly; paused websites resume; paid access always needs approval; connections locked to the checked address; contradiction report no longer confuses dated snapshots or different products). Critical-fact check (R9) added. Tesseract OCR installed with 25 languages.</w:t>
             </w:r>
           </w:p>
         </w:tc>
@@ -5151,7 +5281,7 @@
               <w:rPr>
                 <w:sz w:val="19"/>
               </w:rPr>
-              <w:t>2026-10-16</w:t>
+              <w:t>2026-10-19</w:t>
             </w:r>
           </w:p>
         </w:tc>
@@ -5173,7 +5303,7 @@
               <w:rPr>
                 <w:sz w:val="19"/>
               </w:rPr>
-              <w:t>Per-page verdicts with evidence, first checks (R1–R3, R10), reports (R1 content, review queue, overlap), offline explorer, run engine and command line.</w:t>
+              <w:t>Browser exploration reaches 32 of 34 verified on John Hancock. Checks R6–R8 and R11–R13, page settling and evidence integrity added. Contradiction report (R4), paywall detection, run budgets, robots crawl-delay saved, stuck tasks reported. Office documents (Word, Excel, PowerPoint) supported. 222-case test inventory.</w:t>
             </w:r>
           </w:p>
         </w:tc>
@@ -5196,13 +5326,59 @@
               <w:rPr>
                 <w:sz w:val="19"/>
               </w:rPr>
-              <w:t>2026-10-15</w:t>
+              <w:t>2026-10-16</w:t>
             </w:r>
           </w:p>
         </w:tc>
         <w:tc>
           <w:tcPr>
             <w:tcW w:type="dxa" w:w="4873"/>
+          </w:tcPr>
+          <w:p>
+            <w:pPr>
+              <w:spacing w:after="40"/>
+            </w:pPr>
+            <w:r>
+              <w:rPr>
+                <w:sz w:val="19"/>
+              </w:rPr>
+            </w:r>
+            <w:r>
+              <w:rPr>
+                <w:sz w:val="19"/>
+              </w:rPr>
+              <w:t>Per-page verdicts with evidence, first checks (R1–R3, R10), reports (R1 content, review queue, overlap), offline explorer, run engine and command line.</w:t>
+            </w:r>
+          </w:p>
+        </w:tc>
+      </w:tr>
+      <w:tr>
+        <w:tc>
+          <w:tcPr>
+            <w:tcW w:type="dxa" w:w="4873"/>
+            <w:shd w:val="clear" w:color="auto" w:fill="EEF2F7"/>
+          </w:tcPr>
+          <w:p>
+            <w:pPr>
+              <w:spacing w:after="40"/>
+            </w:pPr>
+            <w:r>
+              <w:rPr>
+                <w:sz w:val="19"/>
+              </w:rPr>
+            </w:r>
+            <w:r>
+              <w:rPr>
+                <w:sz w:val="19"/>
+              </w:rPr>
+              <w:t>2026-10-15</w:t>
+            </w:r>
+          </w:p>
+        </w:tc>
+        <w:tc>
+          <w:tcPr>
+            <w:tcW w:type="dxa" w:w="4873"/>
+            <w:shd w:val="clear" w:color="auto" w:fill="EEF2F7"/>
           </w:tcPr>
           <w:p>
             <w:pPr>

</xml_diff>

<commit_message>
Project report: show the full shared text of each matching pair
"Matching content" showed only an example of up to two passages cut at 300
characters, so a 100% match looked incomplete. It now lists every shared
passage in full (Shared text, split across cells past Excel's limit) and
how many there are (Shared passages). Guide and lane log updated.

Co-Authored-By: Claude Opus 5.5 <noreply@anthropic.com>
</commit_message>
<xml_diff>
--- a/Content_Processor_Guide.docx
+++ b/Content_Processor_Guide.docx
@@ -17,7 +17,7 @@
           <w:color w:val="595959"/>
           <w:sz w:val="19"/>
         </w:rPr>
-        <w:t>Last updated: 28 October 2026 · Code version: main after pages that meet a bot check being handed to the real browser, page stamping (step 1) and the offering catalog (step 2) of the knowledge base, the URL history across runs (one memory, only new or changed pages scraped again), the SEO and GEO inventory, and page outlines with page types · Maintained by every session that adds a significant feature (see "Keeping this guide current" at the end)</w:t>
+        <w:t>Last updated: 29 October 2026 · Code version: main after pages that meet a bot check being handed to the real browser, page stamping (step 1) and the offering catalog (step 2) of the knowledge base, the URL history across runs (one memory, only new or changed pages scraped again), the SEO and GEO inventory, and page outlines with page types · Maintained by every session that adds a significant feature (see "Keeping this guide current" at the end)</w:t>
       </w:r>
     </w:p>
     <w:p>
@@ -2065,7 +2065,7 @@
               <w:rPr>
                 <w:sz w:val="19"/>
               </w:rPr>
-              <w:t>The one workbook most people need. Sheet "Pages": every address with its whole text (line breaks shown), whether it was fully extracted (Yes/No), when its content was last scraped, when the site says it last changed, and what this run did with it ("New page", "Reused (unchanged: server said not modified)", "Re-scraped (updated: visible text changed)"), a plain "Extraction completeness" statement ("Complete", "Incomplete: 1 tab not opened (Pricing)", "Complete, but the page kept changing", "Placeholder page (Lorem ipsum)"), an overall Confidence of High, Medium or Low that can only be High when the page is fully captured, the share of the captured text confirmed against the live page, how reliably it was read (text from the page's code is 100%, text read from images lower), and what is missing. Sheet "Matching content": every pair of addresses that carry the same text, listed once (A with B is never repeated as B with A), by exact word-for-word matching (menus, headers and footers left out), with two percentages: how much of the first page's text is on the second, and how much of the second's is on the first. They differ when the pages differ in length: a short page can be 100% inside a long page while the long page is only 20% inside the short one. To see every match of one page, look for it in both address columns. Very long page text that does not fit in one Excel cell continues in extra "Content_part_2", "Content_part_3" columns; "Content_parts" says how many cells the text uses and "Content_split" says whether it was split (normally 1 and FALSE). Sheet "How to read" explains every column.</w:t>
+              <w:t>The one workbook most people need. Sheet "Pages": every address with its whole text (line breaks shown), whether it was fully extracted (Yes/No), when its content was last scraped, when the site says it last changed, and what this run did with it ("New page", "Reused (unchanged: server said not modified)", "Re-scraped (updated: visible text changed)"), a plain "Extraction completeness" statement ("Complete", "Incomplete: 1 tab not opened (Pricing)", "Complete, but the page kept changing", "Placeholder page (Lorem ipsum)"), an overall Confidence of High, Medium or Low that can only be High when the page is fully captured, the share of the captured text confirmed against the live page, how reliably it was read (text from the page's code is 100%, text read from images lower), and what is missing. Sheet "Matching content": every pair of addresses that carry the same text, listed once (A with B is never repeated as B with A), by exact word-for-word matching (menus, headers and footers left out), with two percentages: how much of the first page's text is on the second, and how much of the second's is on the first. They differ when the pages differ in length: a short page can be 100% inside a long page while the long page is only 20% inside the short one. To see every match of one page, look for it in both address columns. Each pair also shows the shared text itself, every shared passage in full (separated by "[…]"), and how many separate passages there are; until 29 October only a short example of up to two cut passages was shown, so a 100% match looked incomplete. Very long page text that does not fit in one Excel cell continues in extra "Content_part_2", "Content_part_3" columns; "Content_parts" says how many cells the text uses and "Content_split" says whether it was split (normally 1 and FALSE). Sheet "How to read" explains every column.</w:t>
             </w:r>
           </w:p>
         </w:tc>
@@ -4336,7 +4336,7 @@
               <w:rPr>
                 <w:sz w:val="19"/>
               </w:rPr>
-              <w:t>2026-10-28</w:t>
+              <w:t>2026-10-29</w:t>
             </w:r>
           </w:p>
         </w:tc>
@@ -4357,7 +4357,7 @@
               <w:rPr>
                 <w:sz w:val="19"/>
               </w:rPr>
-              <w:t>Page outlines and page types: a "structure" command rewrites every page as an outline in reading order (sections, tabs, accordions, questions and answers, cards, tables, images, videos, forms), one Markdown file per page, with text behind clicks marked, and labels each page as product, category, service, article and so on, and the site as e-commerce, B2B services, publisher or mixed. John Hancock: 303 pages, about a minute, $0.</w:t>
+              <w:t>Project report, "Matching content": the shared text of each pair of pages is now shown in full (every shared passage, with the number of passages), instead of a short example cut after 300 characters.</w:t>
             </w:r>
           </w:p>
         </w:tc>
@@ -4381,7 +4381,7 @@
               <w:rPr>
                 <w:sz w:val="19"/>
               </w:rPr>
-              <w:t>2026-10-27</w:t>
+              <w:t>2026-10-28</w:t>
             </w:r>
           </w:p>
         </w:tc>
@@ -4403,7 +4403,7 @@
               <w:rPr>
                 <w:sz w:val="19"/>
               </w:rPr>
-              <w:t>A page whose download meets a bot check is now tried in the real browser before being reported blocked; if the browser gets through, the page is captured normally.</w:t>
+              <w:t>Page outlines and page types: a "structure" command rewrites every page as an outline in reading order (sections, tabs, accordions, questions and answers, cards, tables, images, videos, forms), one Markdown file per page, with text behind clicks marked, and labels each page as product, category, service, article and so on, and the site as e-commerce, B2B services, publisher or mixed. John Hancock: 303 pages, about a minute, $0.</w:t>
             </w:r>
           </w:p>
         </w:tc>
@@ -4426,7 +4426,7 @@
               <w:rPr>
                 <w:sz w:val="19"/>
               </w:rPr>
-              <w:t>2026-10-28</w:t>
+              <w:t>2026-10-27</w:t>
             </w:r>
           </w:p>
         </w:tc>
@@ -4447,7 +4447,7 @@
               <w:rPr>
                 <w:sz w:val="19"/>
               </w:rPr>
-              <w:t>SEO and GEO inventory: an "inventory" command lists every link, image, video and embedded frame of each page, its title, description, canonical and search-engine instructions, and its structured data checked against Google's required fields; each item says whether it needs scripts or a click to appear, and each page gets graded issues. John Hancock: 281 pages, about a minute, $0.</w:t>
+              <w:t>A page whose download meets a bot check is now tried in the real browser before being reported blocked; if the browser gets through, the page is captured normally.</w:t>
             </w:r>
           </w:p>
         </w:tc>
@@ -4471,7 +4471,7 @@
               <w:rPr>
                 <w:sz w:val="19"/>
               </w:rPr>
-              <w:t>2026-10-27</w:t>
+              <w:t>2026-10-28</w:t>
             </w:r>
           </w:p>
         </w:tc>
@@ -4493,7 +4493,7 @@
               <w:rPr>
                 <w:sz w:val="19"/>
               </w:rPr>
-              <w:t>URL history across runs: any list of addresses is checked against every earlier run; pages that did not change (the server says so, or the file or its visible text is identical) keep their earlier content and are not scraped again, changed and new pages are scraped in full, and content older than 30 days is read again. Before a run, a list of addresses can be checked (scraped before? when?). The project report gains "Last scraped", "Site last modified" and "Scrape action" columns.</w:t>
+              <w:t>SEO and GEO inventory: an "inventory" command lists every link, image, video and embedded frame of each page, its title, description, canonical and search-engine instructions, and its structured data checked against Google's required fields; each item says whether it needs scripts or a click to appear, and each page gets graded issues. John Hancock: 281 pages, about a minute, $0.</w:t>
             </w:r>
           </w:p>
         </w:tc>
@@ -4537,7 +4537,7 @@
               <w:rPr>
                 <w:sz w:val="19"/>
               </w:rPr>
-              <w:t>Knowledge base step 2: a "catalog" command builds each website's offering catalog from its menus, structured data and folders, places every page under an offering or section, and fills evidence-backed cards; optional local AI adds checked features and suggestions. John Hancock (303 addresses): 5 families, 15 more offerings, 271 of 272 pages placed, at $0. Menu links that are script buttons are no longer read as page addresses.</w:t>
+              <w:t>URL history across runs: any list of addresses is checked against every earlier run; pages that did not change (the server says so, or the file or its visible text is identical) keep their earlier content and are not scraped again, changed and new pages are scraped in full, and content older than 30 days is read again. Before a run, a list of addresses can be checked (scraped before? when?). The project report gains "Last scraped", "Site last modified" and "Scrape action" columns.</w:t>
             </w:r>
           </w:p>
         </w:tc>
@@ -4583,7 +4583,7 @@
               <w:rPr>
                 <w:sz w:val="19"/>
               </w:rPr>
-              <w:t>Knowledge base step 1: a "stamp" command records each page's facts (titles, descriptions, structured data, menus, calls to action, numbers, dates), builds the site's full menu tree including mega-menus, leaves out images, error, placeholder and duplicate pages with the reason, and splits each page into sections that keep their page, heading and neighbours. John Hancock: 12 pages, 51 sections, a 72-entry menu tree, in about 9 seconds at $0.</w:t>
+              <w:t>Knowledge base step 2: a "catalog" command builds each website's offering catalog from its menus, structured data and folders, places every page under an offering or section, and fills evidence-backed cards; optional local AI adds checked features and suggestions. John Hancock (303 addresses): 5 families, 15 more offerings, 271 of 272 pages placed, at $0. Menu links that are script buttons are no longer read as page addresses.</w:t>
             </w:r>
           </w:p>
         </w:tc>
@@ -4606,7 +4606,7 @@
               <w:rPr>
                 <w:sz w:val="19"/>
               </w:rPr>
-              <w:t>2026-10-26</w:t>
+              <w:t>2026-10-27</w:t>
             </w:r>
           </w:p>
         </w:tc>
@@ -4627,7 +4627,7 @@
               <w:rPr>
                 <w:sz w:val="19"/>
               </w:rPr>
-              <w:t>Matching-content sheet columns renamed for clarity: "URL (A)", "Matching URL (B)", "% of A in B" and "% of B in A". Chat-widget invitations (for example "Live chat") are no longer treated as missed page content. Unattended runs wait up to six minutes for held work, so render retries (30, 90 and 180 seconds) finish before a run stops.</w:t>
+              <w:t>Knowledge base step 1: a "stamp" command records each page's facts (titles, descriptions, structured data, menus, calls to action, numbers, dates), builds the site's full menu tree including mega-menus, leaves out images, error, placeholder and duplicate pages with the reason, and splits each page into sections that keep their page, heading and neighbours. John Hancock: 12 pages, 51 sections, a 72-entry menu tree, in about 9 seconds at $0.</w:t>
             </w:r>
           </w:p>
         </w:tc>
@@ -4673,7 +4673,7 @@
               <w:rPr>
                 <w:sz w:val="19"/>
               </w:rPr>
-              <w:t>Columns of wide tables that you scroll sideways are captured (they were wrongly treated as hidden). A page the browser cannot open is retried by itself over about five minutes instead of a few seconds. Live John Hancock, 303 pages: 279 verified.</w:t>
+              <w:t>Matching-content sheet columns renamed for clarity: "URL (A)", "Matching URL (B)", "% of A in B" and "% of B in A". Chat-widget invitations (for example "Live chat") are no longer treated as missed page content. Unattended runs wait up to six minutes for held work, so render retries (30, 90 and 180 seconds) finish before a run stops.</w:t>
             </w:r>
           </w:p>
         </w:tc>
@@ -4717,7 +4717,7 @@
               <w:rPr>
                 <w:sz w:val="19"/>
               </w:rPr>
-              <w:t>Project report: each pair of matching pages is listed once, with the shared share in both directions.</w:t>
+              <w:t>Columns of wide tables that you scroll sideways are captured (they were wrongly treated as hidden). A page the browser cannot open is retried by itself over about five minutes instead of a few seconds. Live John Hancock, 303 pages: 279 verified.</w:t>
             </w:r>
           </w:p>
         </w:tc>
@@ -4741,7 +4741,7 @@
               <w:rPr>
                 <w:sz w:val="19"/>
               </w:rPr>
-              <w:t>2026-10-24</w:t>
+              <w:t>2026-10-26</w:t>
             </w:r>
           </w:p>
         </w:tc>
@@ -4763,7 +4763,7 @@
               <w:rPr>
                 <w:sz w:val="19"/>
               </w:rPr>
-              <w:t>New check that every line of text the browser shows was extracted. Web components no longer mistaken for hidden text; a duplicate copy of text never replaces the visible one; site tools (sign-in, country picker, chat) kept out of the content; words in side-by-side boxes no longer glued; a page is judged settled by its text, not by background elements.</w:t>
+              <w:t>Project report: each pair of matching pages is listed once, with the shared share in both directions.</w:t>
             </w:r>
           </w:p>
         </w:tc>
@@ -4786,7 +4786,7 @@
               <w:rPr>
                 <w:sz w:val="19"/>
               </w:rPr>
-              <w:t>2026-10-22</w:t>
+              <w:t>2026-10-24</w:t>
             </w:r>
           </w:p>
         </w:tc>
@@ -4807,7 +4807,7 @@
               <w:rPr>
                 <w:sz w:val="19"/>
               </w:rPr>
-              <w:t>Paid access (Bright Data) built but off by default: one approval per website with a spending cap, checked before every paid request, with a spending log.</w:t>
+              <w:t>New check that every line of text the browser shows was extracted. Web components no longer mistaken for hidden text; a duplicate copy of text never replaces the visible one; site tools (sign-in, country picker, chat) kept out of the content; words in side-by-side boxes no longer glued; a page is judged settled by its text, not by background elements.</w:t>
             </w:r>
           </w:p>
         </w:tc>
@@ -4831,7 +4831,7 @@
               <w:rPr>
                 <w:sz w:val="19"/>
               </w:rPr>
-              <w:t>2026-10-21</w:t>
+              <w:t>2026-10-22</w:t>
             </w:r>
           </w:p>
         </w:tc>
@@ -4853,7 +4853,7 @@
               <w:rPr>
                 <w:sz w:val="19"/>
               </w:rPr>
-              <w:t>Reviewers save decisions in the web app (with name, time and full history); the next report carries them forward.</w:t>
+              <w:t>Paid access (Bright Data) built but off by default: one approval per website with a spending cap, checked before every paid request, with a spending log.</w:t>
             </w:r>
           </w:p>
         </w:tc>
@@ -4897,7 +4897,7 @@
               <w:rPr>
                 <w:sz w:val="19"/>
               </w:rPr>
-              <w:t>Live John Hancock: 32 of 34 verified again with all checks on (the 2 others are placeholder pages). FAQ sections built as web components are now opened, text is matched the way the browser shows it, and a brief network hiccup no longer pauses a whole website.</w:t>
+              <w:t>Reviewers save decisions in the web app (with name, time and full history); the next report carries them forward.</w:t>
             </w:r>
           </w:p>
         </w:tc>
@@ -4921,7 +4921,7 @@
               <w:rPr>
                 <w:sz w:val="19"/>
               </w:rPr>
-              <w:t>2026-10-22</w:t>
+              <w:t>2026-10-21</w:t>
             </w:r>
           </w:p>
         </w:tc>
@@ -4943,7 +4943,7 @@
               <w:rPr>
                 <w:sz w:val="19"/>
               </w:rPr>
-              <w:t>Project report made unambiguous: an extraction-completeness statement and a High/Medium/Low confidence per page that always agree with the page's status; the confirmed share is named for what it measures; page text keeps its line breaks in Excel.</w:t>
+              <w:t>Live John Hancock: 32 of 34 verified again with all checks on (the 2 others are placeholder pages). FAQ sections built as web components are now opened, text is matched the way the browser shows it, and a brief network hiccup no longer pauses a whole website.</w:t>
             </w:r>
           </w:p>
         </w:tc>
@@ -4966,7 +4966,7 @@
               <w:rPr>
                 <w:sz w:val="19"/>
               </w:rPr>
-              <w:t>2026-10-21</w:t>
+              <w:t>2026-10-22</w:t>
             </w:r>
           </w:p>
         </w:tc>
@@ -4987,7 +4987,7 @@
               <w:rPr>
                 <w:sz w:val="19"/>
               </w:rPr>
-              <w:t>Project report: one Excel workbook per run with every page's text, whether it was fully extracted, the confirmed share and the confidence, plus, for every page, which other pages carry the same text and how much (exact matching).</w:t>
+              <w:t>Project report made unambiguous: an extraction-completeness statement and a High/Medium/Low confidence per page that always agree with the page's status; the confirmed share is named for what it measures; page text keeps its line breaks in Excel.</w:t>
             </w:r>
           </w:p>
         </w:tc>
@@ -5033,7 +5033,7 @@
               <w:rPr>
                 <w:sz w:val="19"/>
               </w:rPr>
-              <w:t>Evidence stored compactly: repeated fonts and style sheets kept once, the rest compressed, originals unchanged. About 18 times less disk on the live John Hancock run; a 5,000-page run now fits the 20 GB budget. Older evidence can be converted with one command.</w:t>
+              <w:t>Project report: one Excel workbook per run with every page's text, whether it was fully extracted, the confirmed share and the confidence, plus, for every page, which other pages carry the same text and how much (exact matching).</w:t>
             </w:r>
           </w:p>
         </w:tc>
@@ -5077,7 +5077,7 @@
               <w:rPr>
                 <w:sz w:val="19"/>
               </w:rPr>
-              <w:t>Crossed-out text (for example an old sale price) is kept and marked with ~~ instead of reading as a current price.</w:t>
+              <w:t>Evidence stored compactly: repeated fonts and style sheets kept once, the rest compressed, originals unchanged. About 18 times less disk on the live John Hancock run; a 5,000-page run now fits the 20 GB budget. Older evidence can be converted with one command.</w:t>
             </w:r>
           </w:p>
         </w:tc>
@@ -5101,7 +5101,7 @@
               <w:rPr>
                 <w:sz w:val="19"/>
               </w:rPr>
-              <w:t>2026-10-20</w:t>
+              <w:t>2026-10-21</w:t>
             </w:r>
           </w:p>
         </w:tc>
@@ -5123,7 +5123,7 @@
               <w:rPr>
                 <w:sz w:val="19"/>
               </w:rPr>
-              <w:t>Report file names start with the run's name, so downloads from different runs stay separate.</w:t>
+              <w:t>Crossed-out text (for example an old sale price) is kept and marked with ~~ instead of reading as a current price.</w:t>
             </w:r>
           </w:p>
         </w:tc>
@@ -5167,7 +5167,7 @@
               <w:rPr>
                 <w:sz w:val="19"/>
               </w:rPr>
-              <w:t>Analyst web app for reviewing runs in a browser. Optional grouping of pages by design template, so shared files are fetched once per group.</w:t>
+              <w:t>Report file names start with the run's name, so downloads from different runs stay separate.</w:t>
             </w:r>
           </w:p>
         </w:tc>
@@ -5213,7 +5213,7 @@
               <w:rPr>
                 <w:sz w:val="19"/>
               </w:rPr>
-              <w:t>Image and scanned-text reading switched on (Tesseract with 25 languages, found automatically). The visual-text check was tuned on the live John Hancock site so ordinary reading errors and cookie banners no longer cause false alarms. Images and PDFs no longer wait for a browser exploration they cannot have. Automated quality pipeline (CI) added. Live re-run: 3 of 34 verified, with the stricter checks finding real missing text.</w:t>
+              <w:t>Analyst web app for reviewing runs in a browser. Optional grouping of pages by design template, so shared files are fetched once per group.</w:t>
             </w:r>
           </w:p>
         </w:tc>
@@ -5257,7 +5257,7 @@
               <w:rPr>
                 <w:sz w:val="19"/>
               </w:rPr>
-              <w:t>Six safety and accuracy fixes (failed image reading no longer reported as verified; compressed pages decoded correctly; paused websites resume; paid access always needs approval; connections locked to the checked address; contradiction report no longer confuses dated snapshots or different products). Critical-fact check (R9) added. Tesseract OCR installed with 25 languages.</w:t>
+              <w:t>Image and scanned-text reading switched on (Tesseract with 25 languages, found automatically). The visual-text check was tuned on the live John Hancock site so ordinary reading errors and cookie banners no longer cause false alarms. Images and PDFs no longer wait for a browser exploration they cannot have. Automated quality pipeline (CI) added. Live re-run: 3 of 34 verified, with the stricter checks finding real missing text.</w:t>
             </w:r>
           </w:p>
         </w:tc>
@@ -5281,7 +5281,7 @@
               <w:rPr>
                 <w:sz w:val="19"/>
               </w:rPr>
-              <w:t>2026-10-19</w:t>
+              <w:t>2026-10-20</w:t>
             </w:r>
           </w:p>
         </w:tc>
@@ -5303,7 +5303,7 @@
               <w:rPr>
                 <w:sz w:val="19"/>
               </w:rPr>
-              <w:t>Browser exploration reaches 32 of 34 verified on John Hancock. Checks R6–R8 and R11–R13, page settling and evidence integrity added. Contradiction report (R4), paywall detection, run budgets, robots crawl-delay saved, stuck tasks reported. Office documents (Word, Excel, PowerPoint) supported. 222-case test inventory.</w:t>
+              <w:t>Six safety and accuracy fixes (failed image reading no longer reported as verified; compressed pages decoded correctly; paused websites resume; paid access always needs approval; connections locked to the checked address; contradiction report no longer confuses dated snapshots or different products). Critical-fact check (R9) added. Tesseract OCR installed with 25 languages.</w:t>
             </w:r>
           </w:p>
         </w:tc>
@@ -5326,7 +5326,7 @@
               <w:rPr>
                 <w:sz w:val="19"/>
               </w:rPr>
-              <w:t>2026-10-16</w:t>
+              <w:t>2026-10-19</w:t>
             </w:r>
           </w:p>
         </w:tc>
@@ -5347,7 +5347,7 @@
               <w:rPr>
                 <w:sz w:val="19"/>
               </w:rPr>
-              <w:t>Per-page verdicts with evidence, first checks (R1–R3, R10), reports (R1 content, review queue, overlap), offline explorer, run engine and command line.</w:t>
+              <w:t>Browser exploration reaches 32 of 34 verified on John Hancock. Checks R6–R8 and R11–R13, page settling and evidence integrity added. Contradiction report (R4), paywall detection, run budgets, robots crawl-delay saved, stuck tasks reported. Office documents (Word, Excel, PowerPoint) supported. 222-case test inventory.</w:t>
             </w:r>
           </w:p>
         </w:tc>
@@ -5371,7 +5371,7 @@
               <w:rPr>
                 <w:sz w:val="19"/>
               </w:rPr>
-              <w:t>2026-10-15</w:t>
+              <w:t>2026-10-16</w:t>
             </w:r>
           </w:p>
         </w:tc>
@@ -5379,6 +5379,50 @@
           <w:tcPr>
             <w:tcW w:type="dxa" w:w="4873"/>
             <w:shd w:val="clear" w:color="auto" w:fill="EEF2F7"/>
+          </w:tcPr>
+          <w:p>
+            <w:pPr>
+              <w:spacing w:after="40"/>
+            </w:pPr>
+            <w:r>
+              <w:rPr>
+                <w:sz w:val="19"/>
+              </w:rPr>
+            </w:r>
+            <w:r>
+              <w:rPr>
+                <w:sz w:val="19"/>
+              </w:rPr>
+              <w:t>Per-page verdicts with evidence, first checks (R1–R3, R10), reports (R1 content, review queue, overlap), offline explorer, run engine and command line.</w:t>
+            </w:r>
+          </w:p>
+        </w:tc>
+      </w:tr>
+      <w:tr>
+        <w:tc>
+          <w:tcPr>
+            <w:tcW w:type="dxa" w:w="4873"/>
+          </w:tcPr>
+          <w:p>
+            <w:pPr>
+              <w:spacing w:after="40"/>
+            </w:pPr>
+            <w:r>
+              <w:rPr>
+                <w:sz w:val="19"/>
+              </w:rPr>
+            </w:r>
+            <w:r>
+              <w:rPr>
+                <w:sz w:val="19"/>
+              </w:rPr>
+              <w:t>2026-10-15</w:t>
+            </w:r>
+          </w:p>
+        </w:tc>
+        <w:tc>
+          <w:tcPr>
+            <w:tcW w:type="dxa" w:w="4873"/>
           </w:tcPr>
           <w:p>
             <w:pPr>

</xml_diff>

<commit_message>
Project report: shared words count and a "Shared text by line" sheet
Excel shows only about 27 wrapped lines of a cell, so a long shared text
looked cut even though the cell held all of it. Each pair now has a number
and its shared word count, and a new sheet lists every line of every shared
passage on its own row. Guide and lane log updated.

Co-Authored-By: Claude Opus 5.5 <noreply@anthropic.com>
</commit_message>
<xml_diff>
--- a/Content_Processor_Guide.docx
+++ b/Content_Processor_Guide.docx
@@ -2065,7 +2065,7 @@
               <w:rPr>
                 <w:sz w:val="19"/>
               </w:rPr>
-              <w:t>The one workbook most people need. Sheet "Pages": every address with its whole text (line breaks shown), whether it was fully extracted (Yes/No), when its content was last scraped, when the site says it last changed, and what this run did with it ("New page", "Reused (unchanged: server said not modified)", "Re-scraped (updated: visible text changed)"), a plain "Extraction completeness" statement ("Complete", "Incomplete: 1 tab not opened (Pricing)", "Complete, but the page kept changing", "Placeholder page (Lorem ipsum)"), an overall Confidence of High, Medium or Low that can only be High when the page is fully captured, the share of the captured text confirmed against the live page, how reliably it was read (text from the page's code is 100%, text read from images lower), and what is missing. Sheet "Matching content": every pair of addresses that carry the same text, listed once (A with B is never repeated as B with A), by exact word-for-word matching (menus, headers and footers left out), with two percentages: how much of the first page's text is on the second, and how much of the second's is on the first. They differ when the pages differ in length: a short page can be 100% inside a long page while the long page is only 20% inside the short one. To see every match of one page, look for it in both address columns. Each pair also shows the shared text itself, every shared passage in full (separated by "[…]"), and how many separate passages there are; until 29 October only a short example of up to two cut passages was shown, so a 100% match looked incomplete. Very long page text that does not fit in one Excel cell continues in extra "Content_part_2", "Content_part_3" columns; "Content_parts" says how many cells the text uses and "Content_split" says whether it was split (normally 1 and FALSE). Sheet "How to read" explains every column.</w:t>
+              <w:t>The one workbook most people need. Sheet "Pages": every address with its whole text (line breaks shown), whether it was fully extracted (Yes/No), when its content was last scraped, when the site says it last changed, and what this run did with it ("New page", "Reused (unchanged: server said not modified)", "Re-scraped (updated: visible text changed)"), a plain "Extraction completeness" statement ("Complete", "Incomplete: 1 tab not opened (Pricing)", "Complete, but the page kept changing", "Placeholder page (Lorem ipsum)"), an overall Confidence of High, Medium or Low that can only be High when the page is fully captured, the share of the captured text confirmed against the live page, how reliably it was read (text from the page's code is 100%, text read from images lower), and what is missing. Sheet "Matching content": every pair of addresses that carry the same text, listed once (A with B is never repeated as B with A), by exact word-for-word matching (menus, headers and footers left out), with two percentages: how much of the first page's text is on the second, and how much of the second's is on the first. They differ when the pages differ in length: a short page can be 100% inside a long page while the long page is only 20% inside the short one. To see every match of one page, look for it in both address columns. Each pair also shows the shared text itself, every shared passage in full (separated by "[…]"), how many words they share and how many separate passages there are; until 29 October only a short example of up to two cut passages was shown, so a 100% match looked incomplete. Nothing is shortened. Because Excel shows only about 27 lines of one cell on screen, a sheet "Shared text by line" also lists every line of every shared passage on its own row, numbered by pair, passage and line, so the whole match can be read without opening cells. Very long page text that does not fit in one Excel cell continues in extra "Content_part_2", "Content_part_3" columns; "Content_parts" says how many cells the text uses and "Content_split" says whether it was split (normally 1 and FALSE). Sheet "How to read" explains every column.</w:t>
             </w:r>
           </w:p>
         </w:tc>
@@ -4357,7 +4357,7 @@
               <w:rPr>
                 <w:sz w:val="19"/>
               </w:rPr>
-              <w:t>Project report, "Matching content": the shared text of each pair of pages is now shown in full (every shared passage, with the number of passages), instead of a short example cut after 300 characters.</w:t>
+              <w:t>Project report, "Matching content": the shared text of each pair of pages is now shown in full (every shared passage, with the number of passages), instead of a short example cut after 300 characters, with the number of shared words and a "Shared text by line" sheet that shows every shared line on its own row.</w:t>
             </w:r>
           </w:p>
         </w:tc>

</xml_diff>